<commit_message>
updated on 31052026 morning
</commit_message>
<xml_diff>
--- a/manuscript/MAIN_Manuscript_1.docx
+++ b/manuscript/MAIN_Manuscript_1.docx
@@ -63,37 +63,27 @@
         <w:rPr>
           <w:rFonts w:ascii="Times New Roman" w:hAnsi="Times New Roman" w:cs="Times New Roman"/>
         </w:rPr>
-        <w:t>engrossed</w:t>
-      </w:r>
-      <w:r>
-        <w:rPr>
-          <w:rFonts w:ascii="Times New Roman" w:hAnsi="Times New Roman" w:cs="Times New Roman"/>
-        </w:rPr>
-        <w:t xml:space="preserve"> </w:t>
-      </w:r>
-      <w:r>
-        <w:rPr>
-          <w:rFonts w:ascii="Times New Roman" w:hAnsi="Times New Roman" w:cs="Times New Roman"/>
-        </w:rPr>
-        <w:t xml:space="preserve">the </w:t>
-      </w:r>
-      <w:r>
-        <w:rPr>
-          <w:rFonts w:ascii="Times New Roman" w:hAnsi="Times New Roman" w:cs="Times New Roman"/>
-        </w:rPr>
-        <w:t>field</w:t>
-      </w:r>
-      <w:r>
-        <w:rPr>
-          <w:rFonts w:ascii="Times New Roman" w:hAnsi="Times New Roman" w:cs="Times New Roman"/>
-        </w:rPr>
-        <w:t xml:space="preserve"> of </w:t>
-      </w:r>
-      <w:r>
-        <w:rPr>
-          <w:rFonts w:ascii="Times New Roman" w:hAnsi="Times New Roman" w:cs="Times New Roman"/>
-        </w:rPr>
-        <w:t>optoelectronics through exceptional absorption coefficients, tunable bandgaps, high color purity, and solution processability, enabling rapid progress in solar cells, photodetectors, lasers, and light-emitting diodes (LEDs).</w:t>
+        <w:t xml:space="preserve">attracted attention in the field of optoelectronics for their exceptional absorption coefficients, tunable band gaps, high </w:t>
+      </w:r>
+      <w:proofErr w:type="spellStart"/>
+      <w:r>
+        <w:rPr>
+          <w:rFonts w:ascii="Times New Roman" w:hAnsi="Times New Roman" w:cs="Times New Roman"/>
+        </w:rPr>
+        <w:t>colour</w:t>
+      </w:r>
+      <w:proofErr w:type="spellEnd"/>
+      <w:r>
+        <w:rPr>
+          <w:rFonts w:ascii="Times New Roman" w:hAnsi="Times New Roman" w:cs="Times New Roman"/>
+        </w:rPr>
+        <w:t xml:space="preserve"> purity, and solution-processability</w:t>
+      </w:r>
+      <w:r>
+        <w:rPr>
+          <w:rFonts w:ascii="Times New Roman" w:hAnsi="Times New Roman" w:cs="Times New Roman"/>
+        </w:rPr>
+        <w:t>, enabling rapid progress in solar cells, photodetectors, lasers, and light-emitting diodes (LEDs).</w:t>
       </w:r>
       <w:r>
         <w:rPr>
@@ -434,7 +424,13 @@
         <w:rPr>
           <w:rFonts w:ascii="Times New Roman" w:hAnsi="Times New Roman" w:cs="Times New Roman"/>
         </w:rPr>
-        <w:t xml:space="preserve">perovskites </w:t>
+        <w:t>perovskite</w:t>
+      </w:r>
+      <w:r>
+        <w:rPr>
+          <w:rFonts w:ascii="Times New Roman" w:hAnsi="Times New Roman" w:cs="Times New Roman"/>
+        </w:rPr>
+        <w:t xml:space="preserve"> </w:t>
       </w:r>
       <w:r>
         <w:rPr>
@@ -765,6 +761,11 @@
         <w:rPr>
           <w:rFonts w:ascii="Times New Roman" w:hAnsi="Times New Roman" w:cs="Times New Roman"/>
         </w:rPr>
+      </w:r>
+      <w:r>
+        <w:rPr>
+          <w:rFonts w:ascii="Times New Roman" w:hAnsi="Times New Roman" w:cs="Times New Roman"/>
+        </w:rPr>
         <w:fldChar w:fldCharType="separate"/>
       </w:r>
       <w:r>
@@ -820,7 +821,19 @@
         <w:rPr>
           <w:rFonts w:ascii="Times New Roman" w:hAnsi="Times New Roman" w:cs="Times New Roman"/>
         </w:rPr>
-        <w:t xml:space="preserve">materials are formed by intercalating bulky organic spacer cations into the 3D framework, which truncates the inorganic octahedra into layers of thickness n. These quasi-2D </w:t>
+        <w:t xml:space="preserve">materials are formed by intercalating bulky organic spacer cations into the 3D framework, which </w:t>
+      </w:r>
+      <w:r>
+        <w:rPr>
+          <w:rFonts w:ascii="Times New Roman" w:hAnsi="Times New Roman" w:cs="Times New Roman"/>
+        </w:rPr>
+        <w:t>slices</w:t>
+      </w:r>
+      <w:r>
+        <w:rPr>
+          <w:rFonts w:ascii="Times New Roman" w:hAnsi="Times New Roman" w:cs="Times New Roman"/>
+        </w:rPr>
+        <w:t xml:space="preserve"> the inorganic octahedra into layers of thickness n. These quasi-2D </w:t>
       </w:r>
       <w:r>
         <w:rPr>
@@ -1092,7 +1105,19 @@
         <w:rPr>
           <w:rFonts w:ascii="Times New Roman" w:hAnsi="Times New Roman" w:cs="Times New Roman"/>
         </w:rPr>
-        <w:t xml:space="preserve">, halide composition, and organic spacer chemistry </w:t>
+        <w:t>, halide composition, and organic spacer chemistry</w:t>
+      </w:r>
+      <w:r>
+        <w:rPr>
+          <w:rFonts w:ascii="Times New Roman" w:hAnsi="Times New Roman" w:cs="Times New Roman"/>
+        </w:rPr>
+        <w:t>,</w:t>
+      </w:r>
+      <w:r>
+        <w:rPr>
+          <w:rFonts w:ascii="Times New Roman" w:hAnsi="Times New Roman" w:cs="Times New Roman"/>
+        </w:rPr>
+        <w:t xml:space="preserve"> </w:t>
       </w:r>
       <w:r>
         <w:rPr>
@@ -1283,6 +1308,11 @@
         <w:rPr>
           <w:rFonts w:ascii="Times New Roman" w:hAnsi="Times New Roman" w:cs="Times New Roman"/>
         </w:rPr>
+      </w:r>
+      <w:r>
+        <w:rPr>
+          <w:rFonts w:ascii="Times New Roman" w:hAnsi="Times New Roman" w:cs="Times New Roman"/>
+        </w:rPr>
         <w:fldChar w:fldCharType="separate"/>
       </w:r>
       <w:r>
@@ -1319,7 +1349,19 @@
         <w:rPr>
           <w:rFonts w:ascii="Times New Roman" w:hAnsi="Times New Roman" w:cs="Times New Roman"/>
         </w:rPr>
-        <w:t xml:space="preserve"> in Quasi-2D perovskites unlike their 3D counterparts</w:t>
+        <w:t xml:space="preserve"> in Quasi-2D perovskites</w:t>
+      </w:r>
+      <w:r>
+        <w:rPr>
+          <w:rFonts w:ascii="Times New Roman" w:hAnsi="Times New Roman" w:cs="Times New Roman"/>
+        </w:rPr>
+        <w:t>,</w:t>
+      </w:r>
+      <w:r>
+        <w:rPr>
+          <w:rFonts w:ascii="Times New Roman" w:hAnsi="Times New Roman" w:cs="Times New Roman"/>
+        </w:rPr>
+        <w:t xml:space="preserve"> unlike their 3D counterparts</w:t>
       </w:r>
       <w:r>
         <w:rPr>
@@ -1361,7 +1403,19 @@
         <w:rPr>
           <w:rFonts w:ascii="Times New Roman" w:hAnsi="Times New Roman" w:cs="Times New Roman"/>
         </w:rPr>
-        <w:t>explore this space experimentally, one formulation at a time.</w:t>
+        <w:t xml:space="preserve">explore this space experimentally, one </w:t>
+      </w:r>
+      <w:r>
+        <w:rPr>
+          <w:rFonts w:ascii="Times New Roman" w:hAnsi="Times New Roman" w:cs="Times New Roman"/>
+        </w:rPr>
+        <w:t>combination</w:t>
+      </w:r>
+      <w:r>
+        <w:rPr>
+          <w:rFonts w:ascii="Times New Roman" w:hAnsi="Times New Roman" w:cs="Times New Roman"/>
+        </w:rPr>
+        <w:t xml:space="preserve"> at a time.</w:t>
       </w:r>
       <w:r>
         <w:rPr>
@@ -1410,7 +1464,19 @@
         <w:rPr>
           <w:rFonts w:ascii="Times New Roman" w:hAnsi="Times New Roman" w:cs="Times New Roman"/>
         </w:rPr>
-        <w:t xml:space="preserve">Now </w:t>
+        <w:t>Now</w:t>
+      </w:r>
+      <w:r>
+        <w:rPr>
+          <w:rFonts w:ascii="Times New Roman" w:hAnsi="Times New Roman" w:cs="Times New Roman"/>
+        </w:rPr>
+        <w:t>,</w:t>
+      </w:r>
+      <w:r>
+        <w:rPr>
+          <w:rFonts w:ascii="Times New Roman" w:hAnsi="Times New Roman" w:cs="Times New Roman"/>
+        </w:rPr>
+        <w:t xml:space="preserve"> </w:t>
       </w:r>
       <w:r>
         <w:rPr>
@@ -1434,55 +1500,19 @@
         <w:rPr>
           <w:rFonts w:ascii="Times New Roman" w:hAnsi="Times New Roman" w:cs="Times New Roman"/>
         </w:rPr>
-        <w:t>, which rely on statical models,</w:t>
-      </w:r>
-      <w:r>
-        <w:rPr>
-          <w:rFonts w:ascii="Times New Roman" w:hAnsi="Times New Roman" w:cs="Times New Roman"/>
-        </w:rPr>
-        <w:t xml:space="preserve"> has emerged as a complementary </w:t>
-      </w:r>
-      <w:r>
-        <w:rPr>
-          <w:rFonts w:ascii="Times New Roman" w:hAnsi="Times New Roman" w:cs="Times New Roman"/>
-        </w:rPr>
-        <w:t>f</w:t>
-      </w:r>
-      <w:r>
-        <w:rPr>
-          <w:rFonts w:ascii="Times New Roman" w:hAnsi="Times New Roman" w:cs="Times New Roman"/>
-        </w:rPr>
-        <w:t xml:space="preserve">ourth paradigm that can learn </w:t>
-      </w:r>
-      <w:r>
-        <w:rPr>
-          <w:rFonts w:ascii="Times New Roman" w:hAnsi="Times New Roman" w:cs="Times New Roman"/>
-        </w:rPr>
-        <w:t>patterns</w:t>
-      </w:r>
-      <w:r>
-        <w:rPr>
-          <w:rFonts w:ascii="Times New Roman" w:hAnsi="Times New Roman" w:cs="Times New Roman"/>
-        </w:rPr>
-        <w:t xml:space="preserve"> from curated datasets, reduce experimental waste, and </w:t>
-      </w:r>
-      <w:r>
-        <w:rPr>
-          <w:rFonts w:ascii="Times New Roman" w:hAnsi="Times New Roman" w:cs="Times New Roman"/>
-        </w:rPr>
-        <w:t xml:space="preserve">not limited by the </w:t>
-      </w:r>
-      <w:r>
-        <w:rPr>
-          <w:rFonts w:ascii="Times New Roman" w:hAnsi="Times New Roman" w:cs="Times New Roman"/>
-        </w:rPr>
-        <w:t xml:space="preserve">theoretical </w:t>
-      </w:r>
-      <w:r>
-        <w:rPr>
-          <w:rFonts w:ascii="Times New Roman" w:hAnsi="Times New Roman" w:cs="Times New Roman"/>
-        </w:rPr>
-        <w:t>rules/laws as physical models like DFT, which enlarge the scope for finding new relations</w:t>
+        <w:t xml:space="preserve">, which </w:t>
+      </w:r>
+      <w:r>
+        <w:rPr>
+          <w:rFonts w:ascii="Times New Roman" w:hAnsi="Times New Roman" w:cs="Times New Roman"/>
+        </w:rPr>
+        <w:t>relies on statistical models, has emerged as a complementary fourth paradigm that can learn patterns from curated datasets, reduce experimental waste, and is not limited by the theoretical rules/laws as physical models like DFT, which enlarges</w:t>
+      </w:r>
+      <w:r>
+        <w:rPr>
+          <w:rFonts w:ascii="Times New Roman" w:hAnsi="Times New Roman" w:cs="Times New Roman"/>
+        </w:rPr>
+        <w:t xml:space="preserve"> the scope for finding new relations</w:t>
       </w:r>
       <w:r>
         <w:rPr>
@@ -1567,8 +1597,85 @@
           <w:rFonts w:ascii="Times New Roman" w:hAnsi="Times New Roman" w:cs="Times New Roman"/>
         </w:rPr>
         <w:fldChar w:fldCharType="begin">
-          <w:fldData xml:space="preserve">PEVuZE5vdGU+PENpdGU+PEF1dGhvcj5XYW5nPC9BdXRob3I+PFllYXI+MjAyNTwvWWVhcj48UmVj
-TnVtPjEwPC9SZWNOdW0+PERpc3BsYXlUZXh0PlsxMi0xNF08L0Rpc3BsYXlUZXh0PjxyZWNvcmQ+
+          <w:fldData xml:space="preserve">PEVuZE5vdGU+PENpdGU+PEF1dGhvcj5MdTwvQXV0aG9yPjxZZWFyPjIwMjQ8L1llYXI+PFJlY051
+bT4xMTwvUmVjTnVtPjxEaXNwbGF5VGV4dD5bMTItMTddPC9EaXNwbGF5VGV4dD48cmVjb3JkPjxy
+ZWMtbnVtYmVyPjExPC9yZWMtbnVtYmVyPjxmb3JlaWduLWtleXM+PGtleSBhcHA9IkVOIiBkYi1p
+ZD0idzl3cGV3OXJhMnMyc3FlcHN2YXZkc2Yyeng1NXpzemZmd2FlIiB0aW1lc3RhbXA9IjE3Nzk2
+MjQ4NDAiPjExPC9rZXk+PC9mb3JlaWduLWtleXM+PHJlZi10eXBlIG5hbWU9IkpvdXJuYWwgQXJ0
+aWNsZSI+MTc8L3JlZi10eXBlPjxjb250cmlidXRvcnM+PGF1dGhvcnM+PGF1dGhvcj5MdSwgRmVp
+eXVlPC9hdXRob3I+PGF1dGhvcj5MaWFuZywgWWFueWFuPC9hdXRob3I+PGF1dGhvcj5XYW5nLCBO
+YW5hPC9hdXRob3I+PGF1dGhvcj5aaHUsIExpbjwvYXV0aG9yPjxhdXRob3I+V2FuZywgSmlhbnB1
+PC9hdXRob3I+PC9hdXRob3JzPjwvY29udHJpYnV0b3JzPjx0aXRsZXM+PHRpdGxlPk1hY2hpbmUg
+bGVhcm5pbmcgZm9yIHBlcm92c2tpdGUgb3B0b2VsZWN0cm9uaWNzOiBhIHJldmlldzwvdGl0bGU+
+PC90aXRsZXM+PHBhZ2VzPjA1NDAwMTwvcGFnZXM+PHZvbHVtZT42ICVKIEFkdmFuY2VkIFBob3Rv
+bmljczwvdm9sdW1lPjxudW1iZXI+NTwvbnVtYmVyPjxkYXRlcz48eWVhcj4yMDI0PC95ZWFyPjwv
+ZGF0ZXM+PHVybHM+PHJlbGF0ZWQtdXJscz48dXJsPmh0dHBzOi8vZG9pLm9yZy8xMC4xMTE3LzEu
+QVAuNi41LjA1NDAwMTwvdXJsPjwvcmVsYXRlZC11cmxzPjwvdXJscz48L3JlY29yZD48L0NpdGU+
+PENpdGU+PEF1dGhvcj5kZSBsYSBBc3VuY2nDs24tTmFkYWw8L0F1dGhvcj48WWVhcj4yMDI1PC9Z
+ZWFyPjxSZWNOdW0+Mjg8L1JlY051bT48cmVjb3JkPjxyZWMtbnVtYmVyPjI4PC9yZWMtbnVtYmVy
+Pjxmb3JlaWduLWtleXM+PGtleSBhcHA9IkVOIiBkYi1pZD0idzl3cGV3OXJhMnMyc3FlcHN2YXZk
+c2Yyeng1NXpzemZmd2FlIiB0aW1lc3RhbXA9IjE3ODAyMDAxMDEiPjI4PC9rZXk+PC9mb3JlaWdu
+LWtleXM+PHJlZi10eXBlIG5hbWU9IkpvdXJuYWwgQXJ0aWNsZSI+MTc8L3JlZi10eXBlPjxjb250
+cmlidXRvcnM+PGF1dGhvcnM+PGF1dGhvcj5kZSBsYSBBc3VuY2nDs24tTmFkYWwsIFbDrWN0b3I8
+L2F1dGhvcj48YXV0aG9yPklsaWZmZSBTcHJhZ3VlLCBDaHJpc3RvcGhlcjwvYXV0aG9yPjxhdXRo
+b3I+R3VpamFycm8tQmVyZGnDsWFzLCBCZXJ0aGE8L2F1dGhvcj48YXV0aG9yPkNhcHBlbCwgVXRl
+IEIuPC9hdXRob3I+PGF1dGhvcj5HYXJjw61hLUZlcm7DoW5kZXosIEFsYmVydG88L2F1dGhvcj48
+L2F1dGhvcnM+PC9jb250cmlidXRvcnM+PHRpdGxlcz48dGl0bGU+TWFjaGluZSBsZWFybmluZyBm
+b3IgcGVyb3Zza2l0ZSBzb2xhciBjZWxsczogYSBjb21wcmVoZW5zaXZlIHJldmlldyBvbiBvcHBv
+cnR1bml0aWVzIGFuZCBjaGFsbGVuZ2VzIGZvciBtYXRlcmlhbHMgc2NpZW50aXN0czwvdGl0bGU+
+PHNlY29uZGFyeS10aXRsZT5FRVMgU29sYXI8L3NlY29uZGFyeS10aXRsZT48L3RpdGxlcz48cGVy
+aW9kaWNhbD48ZnVsbC10aXRsZT5FRVMgU29sYXI8L2Z1bGwtdGl0bGU+PC9wZXJpb2RpY2FsPjxw
+YWdlcz45MjctOTU3PC9wYWdlcz48dm9sdW1lPjE8L3ZvbHVtZT48bnVtYmVyPjY8L251bWJlcj48
+ZGF0ZXM+PHllYXI+MjAyNTwveWVhcj48L2RhdGVzPjxwdWJsaXNoZXI+UlNDPC9wdWJsaXNoZXI+
+PHdvcmstdHlwZT4xMC4xMDM5L0Q1RUwwMDA0MUY8L3dvcmstdHlwZT48dXJscz48cmVsYXRlZC11
+cmxzPjx1cmw+aHR0cDovL2R4LmRvaS5vcmcvMTAuMTAzOS9ENUVMMDAwNDFGPC91cmw+PC9yZWxh
+dGVkLXVybHM+PC91cmxzPjxlbGVjdHJvbmljLXJlc291cmNlLW51bT4xMC4xMDM5L0Q1RUwwMDA0
+MUY8L2VsZWN0cm9uaWMtcmVzb3VyY2UtbnVtPjwvcmVjb3JkPjwvQ2l0ZT48Q2l0ZT48QXV0aG9y
+PlpoYW5nPC9BdXRob3I+PFllYXI+MjAyNTwvWWVhcj48UmVjTnVtPjI3PC9SZWNOdW0+PHJlY29y
+ZD48cmVjLW51bWJlcj4yNzwvcmVjLW51bWJlcj48Zm9yZWlnbi1rZXlzPjxrZXkgYXBwPSJFTiIg
+ZGItaWQ9Inc5d3BldzlyYTJzMnNxZXBzdmF2ZHNmMnp4NTV6c3pmZndhZSIgdGltZXN0YW1wPSIx
+NzgwMTk5NjM4Ij4yNzwva2V5PjwvZm9yZWlnbi1rZXlzPjxyZWYtdHlwZSBuYW1lPSJKb3VybmFs
+IEFydGljbGUiPjE3PC9yZWYtdHlwZT48Y29udHJpYnV0b3JzPjxhdXRob3JzPjxhdXRob3I+Wmhh
+bmcsIFJ1aXFpPC9hdXRob3I+PGF1dGhvcj5Nb3RlcywgQnJhbmRvbjwvYXV0aG9yPjxhdXRob3I+
+VGFuLCBTaGF1bjwvYXV0aG9yPjxhdXRob3I+THUsIFlvbmdsaTwvYXV0aG9yPjxhdXRob3I+U2hp
+aCwgTWVuZy1DaGVuPC9hdXRob3I+PGF1dGhvcj5IYW8sIFlpbHVuPC9hdXRob3I+PGF1dGhvcj5Z
+YW5nLCBLYXJlbjwvYXV0aG9yPjxhdXRob3I+U3Jpbml2YXNhbiwgU2hyZXlhczwvYXV0aG9yPjxh
+dXRob3I+QmF3ZW5kaSwgTW91bmdpIEcuPC9hdXRob3I+PGF1dGhvcj5CdWxvdmnEhywgVmxhZGlt
+aXI8L2F1dGhvcj48L2F1dGhvcnM+PC9jb250cmlidXRvcnM+PHRpdGxlcz48dGl0bGU+TWFjaGlu
+ZSBMZWFybmluZyBQcmVkaWN0aW9uIG9mIE9yZ2FuaWPigJNJbm9yZ2FuaWMgSGFsaWRlIFBlcm92
+c2tpdGUgU29sYXIgQ2VsbCBQZXJmb3JtYW5jZSBmcm9tIE9wdGljYWwgUHJvcGVydGllczwvdGl0
+bGU+PHNlY29uZGFyeS10aXRsZT5BQ1MgRW5lcmd5IExldHRlcnM8L3NlY29uZGFyeS10aXRsZT48
+L3RpdGxlcz48cGVyaW9kaWNhbD48ZnVsbC10aXRsZT5BQ1MgRW5lcmd5IExldHRlcnM8L2Z1bGwt
+dGl0bGU+PC9wZXJpb2RpY2FsPjxwYWdlcz4xNzE0LTE3MjQ8L3BhZ2VzPjx2b2x1bWU+MTA8L3Zv
+bHVtZT48bnVtYmVyPjQ8L251bWJlcj48ZGF0ZXM+PHllYXI+MjAyNTwveWVhcj48cHViLWRhdGVz
+PjxkYXRlPjIwMjUvMDQvMTE8L2RhdGU+PC9wdWItZGF0ZXM+PC9kYXRlcz48cHVibGlzaGVyPkFt
+ZXJpY2FuIENoZW1pY2FsIFNvY2lldHk8L3B1Ymxpc2hlcj48dXJscz48cmVsYXRlZC11cmxzPjx1
+cmw+aHR0cHM6Ly9kb2kub3JnLzEwLjEwMjEvYWNzZW5lcmd5bGV0dC40YzAzNTkyPC91cmw+PC9y
+ZWxhdGVkLXVybHM+PC91cmxzPjxlbGVjdHJvbmljLXJlc291cmNlLW51bT4xMC4xMDIxL2Fjc2Vu
+ZXJneWxldHQuNGMwMzU5MjwvZWxlY3Ryb25pYy1yZXNvdXJjZS1udW0+PC9yZWNvcmQ+PC9DaXRl
+PjxDaXRlPjxBdXRob3I+VG9wcmFrPC9BdXRob3I+PFllYXI+MjAyNjwvWWVhcj48UmVjTnVtPjI5
+PC9SZWNOdW0+PHJlY29yZD48cmVjLW51bWJlcj4yOTwvcmVjLW51bWJlcj48Zm9yZWlnbi1rZXlz
+PjxrZXkgYXBwPSJFTiIgZGItaWQ9Inc5d3BldzlyYTJzMnNxZXBzdmF2ZHNmMnp4NTV6c3pmZndh
+ZSIgdGltZXN0YW1wPSIxNzgwMjAwNDA1Ij4yOTwva2V5PjwvZm9yZWlnbi1rZXlzPjxyZWYtdHlw
+ZSBuYW1lPSJKb3VybmFsIEFydGljbGUiPjE3PC9yZWYtdHlwZT48Y29udHJpYnV0b3JzPjxhdXRo
+b3JzPjxhdXRob3I+VG9wcmFrLCBBecWfZWfDvGw8L2F1dGhvcj48L2F1dGhvcnM+PC9jb250cmli
+dXRvcnM+PHRpdGxlcz48dGl0bGU+UHJlZGljdGluZyBwaG90b3ZvbHRhaWMgb3V0cHV0IHBhcmFt
+ZXRlcnMgb2YgcGVyb3Zza2l0ZSBzb2xhciBjZWxscyB1c2luZyBleHBsYWluYWJsZSBtYWNoaW5l
+IGxlYXJuaW5nIHdpdGggcGh5c2ljcy1pbmZvcm1lZCBhbmQgc2ltdWxhdGlvbi1kZXJpdmVkIGRl
+c2NyaXB0b3JzPC90aXRsZT48c2Vjb25kYXJ5LXRpdGxlPk1hdGVyaWFscyBUb2RheSBDb21tdW5p
+Y2F0aW9uczwvc2Vjb25kYXJ5LXRpdGxlPjwvdGl0bGVzPjxwZXJpb2RpY2FsPjxmdWxsLXRpdGxl
+Pk1hdGVyaWFscyBUb2RheSBDb21tdW5pY2F0aW9uczwvZnVsbC10aXRsZT48L3BlcmlvZGljYWw+
+PHBhZ2VzPjExNDk2ODwvcGFnZXM+PHZvbHVtZT41Mjwvdm9sdW1lPjxrZXl3b3Jkcz48a2V5d29y
+ZD5QZXJvdnNraXRlIHNvbGFyIGNlbGxzPC9rZXl3b3JkPjxrZXl3b3JkPlBoeXNpY3MtaW5mb3Jt
+ZWQgbWFjaGluZSBsZWFybmluZzwva2V5d29yZD48a2V5d29yZD5EcmlmdOKAk2RpZmZ1c2lvbiBz
+aW11bGF0aW9uPC9rZXl3b3JkPjxrZXl3b3JkPlNIQVA8L2tleXdvcmQ+PC9rZXl3b3Jkcz48ZGF0
+ZXM+PHllYXI+MjAyNjwveWVhcj48cHViLWRhdGVzPjxkYXRlPjIwMjYvMDMvMDEvPC9kYXRlPjwv
+cHViLWRhdGVzPjwvZGF0ZXM+PGlzYm4+MjM1Mi00OTI4PC9pc2JuPjx1cmxzPjxyZWxhdGVkLXVy
+bHM+PHVybD5odHRwczovL3d3dy5zY2llbmNlZGlyZWN0LmNvbS9zY2llbmNlL2FydGljbGUvcGlp
+L1MyMzUyNDkyODI2MDAzNTIxPC91cmw+PC9yZWxhdGVkLXVybHM+PC91cmxzPjxlbGVjdHJvbmlj
+LXJlc291cmNlLW51bT5odHRwczovL2RvaS5vcmcvMTAuMTAxNi9qLm10Y29tbS4yMDI2LjExNDk2
+ODwvZWxlY3Ryb25pYy1yZXNvdXJjZS1udW0+PC9yZWNvcmQ+PC9DaXRlPjxDaXRlPjxBdXRob3I+
+V2FuZzwvQXV0aG9yPjxZZWFyPjIwMjU8L1llYXI+PFJlY051bT4xMDwvUmVjTnVtPjxyZWNvcmQ+
 PHJlYy1udW1iZXI+MTA8L3JlYy1udW1iZXI+PGZvcmVpZ24ta2V5cz48a2V5IGFwcD0iRU4iIGRi
 LWlkPSJ3OXdwZXc5cmEyczJzcWVwc3ZhdmRzZjJ6eDU1enN6ZmZ3YWUiIHRpbWVzdGFtcD0iMTc3
 OTYyNDY5MSI+MTA8L2tleT48L2ZvcmVpZ24ta2V5cz48cmVmLXR5cGUgbmFtZT0iSm91cm5hbCBB
@@ -1592,66 +1699,53 @@
 cmxzPjx1cmw+aHR0cHM6Ly9kb2kub3JnLzEwLjEwMjEvYWNzLmpwY2MuNWMwMjE0MjwvdXJsPjwv
 cmVsYXRlZC11cmxzPjwvdXJscz48ZWxlY3Ryb25pYy1yZXNvdXJjZS1udW0+MTAuMTAyMS9hY3Mu
 anBjYy41YzAyMTQyPC9lbGVjdHJvbmljLXJlc291cmNlLW51bT48L3JlY29yZD48L0NpdGU+PENp
-dGU+PEF1dGhvcj5XYW5nPC9BdXRob3I+PFllYXI+MjAyNTwvWWVhcj48UmVjTnVtPjEwPC9SZWNO
-dW0+PHJlY29yZD48cmVjLW51bWJlcj4xMDwvcmVjLW51bWJlcj48Zm9yZWlnbi1rZXlzPjxrZXkg
-YXBwPSJFTiIgZGItaWQ9Inc5d3BldzlyYTJzMnNxZXBzdmF2ZHNmMnp4NTV6c3pmZndhZSIgdGlt
-ZXN0YW1wPSIxNzc5NjI0NjkxIj4xMDwva2V5PjwvZm9yZWlnbi1rZXlzPjxyZWYtdHlwZSBuYW1l
-PSJKb3VybmFsIEFydGljbGUiPjE3PC9yZWYtdHlwZT48Y29udHJpYnV0b3JzPjxhdXRob3JzPjxh
-dXRob3I+V2FuZywgWmhlbmdqdW48L2F1dGhvcj48YXV0aG9yPkNoZW4sIENoYW5nY2hlbmc8L2F1
-dGhvcj48YXV0aG9yPlFpYW4sIFNoZW5namlhbzwvYXV0aG9yPjxhdXRob3I+SmlhLCBCYW9uYW48
-L2F1dGhvcj48YXV0aG9yPlh1LCBZYXhpbjwvYXV0aG9yPjxhdXRob3I+R3VhbiwgWGlhb25pbmc8
-L2F1dGhvcj48YXV0aG9yPkhhbiwgWmhhbzwvYXV0aG9yPjxhdXRob3I+VHVvLCBZYWxpPC9hdXRo
-b3I+PGF1dGhvcj5EdSwgWXV4aTwvYXV0aG9yPjxhdXRob3I+WXVuLCBYaW9uZ2ZlaTwvYXV0aG9y
-PjxhdXRob3I+WGllLCBKaWFuZ3pob3U8L2F1dGhvcj48YXV0aG9yPkxpdSwgR2FuZzwvYXV0aG9y
-PjxhdXRob3I+THUsIFBlbmdmZWk8L2F1dGhvcj48L2F1dGhvcnM+PC9jb250cmlidXRvcnM+PHRp
-dGxlcz48dGl0bGU+RGF0YS1Ecml2ZW4gRGVzaWduIG9mIEhhbGlkZSBQZXJvdnNraXRlcyBmb3Ig
-RWZmaWNpZW50IEdyZWVuIExpZ2h0LUVtaXR0aW5nIERpb2RlcyB2aWEgTWFjaGluZSBMZWFybmlu
-ZyBhbmQgREZUPC90aXRsZT48c2Vjb25kYXJ5LXRpdGxlPlRoZSBKb3VybmFsIG9mIFBoeXNpY2Fs
-IENoZW1pc3RyeSBDPC9zZWNvbmRhcnktdGl0bGU+PC90aXRsZXM+PHBlcmlvZGljYWw+PGZ1bGwt
-dGl0bGU+VGhlIEpvdXJuYWwgb2YgUGh5c2ljYWwgQ2hlbWlzdHJ5IEM8L2Z1bGwtdGl0bGU+PC9w
-ZXJpb2RpY2FsPjxwYWdlcz4xMzU0Mi0xMzU1NzwvcGFnZXM+PHZvbHVtZT4xMjk8L3ZvbHVtZT48
-bnVtYmVyPjMwPC9udW1iZXI+PGRhdGVzPjx5ZWFyPjIwMjU8L3llYXI+PHB1Yi1kYXRlcz48ZGF0
-ZT4yMDI1LzA3LzMxPC9kYXRlPjwvcHViLWRhdGVzPjwvZGF0ZXM+PHB1Ymxpc2hlcj5BbWVyaWNh
-biBDaGVtaWNhbCBTb2NpZXR5PC9wdWJsaXNoZXI+PGlzYm4+MTkzMi03NDQ3PC9pc2JuPjx1cmxz
-PjxyZWxhdGVkLXVybHM+PHVybD5odHRwczovL2RvaS5vcmcvMTAuMTAyMS9hY3MuanBjYy41YzAy
-MTQyPC91cmw+PC9yZWxhdGVkLXVybHM+PC91cmxzPjxlbGVjdHJvbmljLXJlc291cmNlLW51bT4x
-MC4xMDIxL2Fjcy5qcGNjLjVjMDIxNDI8L2VsZWN0cm9uaWMtcmVzb3VyY2UtbnVtPjwvcmVjb3Jk
-PjwvQ2l0ZT48Q2l0ZT48QXV0aG9yPldhbmc8L0F1dGhvcj48WWVhcj4yMDI1PC9ZZWFyPjxSZWNO
-dW0+OTwvUmVjTnVtPjxyZWNvcmQ+PHJlYy1udW1iZXI+OTwvcmVjLW51bWJlcj48Zm9yZWlnbi1r
-ZXlzPjxrZXkgYXBwPSJFTiIgZGItaWQ9Inc5d3BldzlyYTJzMnNxZXBzdmF2ZHNmMnp4NTV6c3pm
-ZndhZSIgdGltZXN0YW1wPSIxNzc5NjI0Njg4Ij45PC9rZXk+PC9mb3JlaWduLWtleXM+PHJlZi10
-eXBlIG5hbWU9IkpvdXJuYWwgQXJ0aWNsZSI+MTc8L3JlZi10eXBlPjxjb250cmlidXRvcnM+PGF1
-dGhvcnM+PGF1dGhvcj5XYW5nLCBTaGl5YW48L2F1dGhvcj48YXV0aG9yPkxpdSwgQ2hhb3Blbmc8
-L2F1dGhvcj48YXV0aG9yPkhhbywgV2VpeWFvPC9hdXRob3I+PGF1dGhvcj5aaHVhbmcsIFlhbmxp
-bmc8L2F1dGhvcj48YXV0aG9yPlpodSwgWGlhbmp1bjwvYXV0aG9yPjxhdXRob3I+V2FuZywgTG9u
-Z2x1PC9hdXRob3I+PGF1dGhvcj5OaXUsIFhpYW5naG9uZzwvYXV0aG9yPjxhdXRob3I+TGl1LCBT
-aHVqdWFuPC9hdXRob3I+PGF1dGhvcj5DaGVuLCBCaW5nPC9hdXRob3I+PGF1dGhvcj5aaGFvLCBR
-aWFuZzwvYXV0aG9yPjwvYXV0aG9ycz48L2NvbnRyaWJ1dG9ycz48dGl0bGVzPjx0aXRsZT5Gcm9t
-IEZvcm1hYmlsaXR5IHRvIEJhbmRnYXA6IE1hY2hpbmUgTGVhcm5pbmcgQWNjZWxlcmF0ZXMgdGhl
-IERpc2NvdmVyeSBhbmQgQXBwbGljYXRpb24gb2YgUGVyb3Zza2l0ZSBNYXRlcmlhbHM8L3RpdGxl
-PjxzZWNvbmRhcnktdGl0bGU+QUNTIE5hbm88L3NlY29uZGFyeS10aXRsZT48L3RpdGxlcz48cGVy
-aW9kaWNhbD48ZnVsbC10aXRsZT5BQ1MgTmFubzwvZnVsbC10aXRsZT48L3BlcmlvZGljYWw+PHBh
-Z2VzPjI5MDQ5LTI5MDcyPC9wYWdlcz48dm9sdW1lPjE5PC92b2x1bWU+PG51bWJlcj4zMjwvbnVt
-YmVyPjxkYXRlcz48eWVhcj4yMDI1PC95ZWFyPjxwdWItZGF0ZXM+PGRhdGU+MjAyNS8wOC8xOTwv
-ZGF0ZT48L3B1Yi1kYXRlcz48L2RhdGVzPjxwdWJsaXNoZXI+QW1lcmljYW4gQ2hlbWljYWwgU29j
-aWV0eTwvcHVibGlzaGVyPjxpc2JuPjE5MzYtMDg1MTwvaXNibj48dXJscz48cmVsYXRlZC11cmxz
-Pjx1cmw+aHR0cHM6Ly9kb2kub3JnLzEwLjEwMjEvYWNzbmFuby41YzA3NDk0PC91cmw+PC9yZWxh
-dGVkLXVybHM+PC91cmxzPjxlbGVjdHJvbmljLXJlc291cmNlLW51bT4xMC4xMDIxL2Fjc25hbm8u
-NWMwNzQ5NDwvZWxlY3Ryb25pYy1yZXNvdXJjZS1udW0+PC9yZWNvcmQ+PC9DaXRlPjxDaXRlPjxB
-dXRob3I+THU8L0F1dGhvcj48WWVhcj4yMDI0PC9ZZWFyPjxSZWNOdW0+MTE8L1JlY051bT48cmVj
-b3JkPjxyZWMtbnVtYmVyPjExPC9yZWMtbnVtYmVyPjxmb3JlaWduLWtleXM+PGtleSBhcHA9IkVO
-IiBkYi1pZD0idzl3cGV3OXJhMnMyc3FlcHN2YXZkc2Yyeng1NXpzemZmd2FlIiB0aW1lc3RhbXA9
-IjE3Nzk2MjQ4NDAiPjExPC9rZXk+PC9mb3JlaWduLWtleXM+PHJlZi10eXBlIG5hbWU9IkpvdXJu
-YWwgQXJ0aWNsZSI+MTc8L3JlZi10eXBlPjxjb250cmlidXRvcnM+PGF1dGhvcnM+PGF1dGhvcj5M
-dSwgRmVpeXVlPC9hdXRob3I+PGF1dGhvcj5MaWFuZywgWWFueWFuPC9hdXRob3I+PGF1dGhvcj5X
-YW5nLCBOYW5hPC9hdXRob3I+PGF1dGhvcj5aaHUsIExpbjwvYXV0aG9yPjxhdXRob3I+V2FuZywg
-SmlhbnB1PC9hdXRob3I+PC9hdXRob3JzPjwvY29udHJpYnV0b3JzPjx0aXRsZXM+PHRpdGxlPk1h
-Y2hpbmUgbGVhcm5pbmcgZm9yIHBlcm92c2tpdGUgb3B0b2VsZWN0cm9uaWNzOiBhIHJldmlldzwv
-dGl0bGU+PC90aXRsZXM+PHBhZ2VzPjA1NDAwMTwvcGFnZXM+PHZvbHVtZT42ICVKIEFkdmFuY2Vk
-IFBob3Rvbmljczwvdm9sdW1lPjxudW1iZXI+NTwvbnVtYmVyPjxkYXRlcz48eWVhcj4yMDI0PC95
-ZWFyPjwvZGF0ZXM+PHVybHM+PHJlbGF0ZWQtdXJscz48dXJsPmh0dHBzOi8vZG9pLm9yZy8xMC4x
-MTE3LzEuQVAuNi41LjA1NDAwMTwvdXJsPjwvcmVsYXRlZC11cmxzPjwvdXJscz48L3JlY29yZD48
-L0NpdGU+PC9FbmROb3RlPn==
+dGU+PEF1dGhvcj5XYW5nPC9BdXRob3I+PFllYXI+MjAyNTwvWWVhcj48UmVjTnVtPjk8L1JlY051
+bT48cmVjb3JkPjxyZWMtbnVtYmVyPjk8L3JlYy1udW1iZXI+PGZvcmVpZ24ta2V5cz48a2V5IGFw
+cD0iRU4iIGRiLWlkPSJ3OXdwZXc5cmEyczJzcWVwc3ZhdmRzZjJ6eDU1enN6ZmZ3YWUiIHRpbWVz
+dGFtcD0iMTc3OTYyNDY4OCI+OTwva2V5PjwvZm9yZWlnbi1rZXlzPjxyZWYtdHlwZSBuYW1lPSJK
+b3VybmFsIEFydGljbGUiPjE3PC9yZWYtdHlwZT48Y29udHJpYnV0b3JzPjxhdXRob3JzPjxhdXRo
+b3I+V2FuZywgU2hpeWFuPC9hdXRob3I+PGF1dGhvcj5MaXUsIENoYW9wZW5nPC9hdXRob3I+PGF1
+dGhvcj5IYW8sIFdlaXlhbzwvYXV0aG9yPjxhdXRob3I+Wmh1YW5nLCBZYW5saW5nPC9hdXRob3I+
+PGF1dGhvcj5aaHUsIFhpYW5qdW48L2F1dGhvcj48YXV0aG9yPldhbmcsIExvbmdsdTwvYXV0aG9y
+PjxhdXRob3I+Tml1LCBYaWFuZ2hvbmc8L2F1dGhvcj48YXV0aG9yPkxpdSwgU2h1anVhbjwvYXV0
+aG9yPjxhdXRob3I+Q2hlbiwgQmluZzwvYXV0aG9yPjxhdXRob3I+WmhhbywgUWlhbmc8L2F1dGhv
+cj48L2F1dGhvcnM+PC9jb250cmlidXRvcnM+PHRpdGxlcz48dGl0bGU+RnJvbSBGb3JtYWJpbGl0
+eSB0byBCYW5kZ2FwOiBNYWNoaW5lIExlYXJuaW5nIEFjY2VsZXJhdGVzIHRoZSBEaXNjb3Zlcnkg
+YW5kIEFwcGxpY2F0aW9uIG9mIFBlcm92c2tpdGUgTWF0ZXJpYWxzPC90aXRsZT48c2Vjb25kYXJ5
+LXRpdGxlPkFDUyBOYW5vPC9zZWNvbmRhcnktdGl0bGU+PC90aXRsZXM+PHBlcmlvZGljYWw+PGZ1
+bGwtdGl0bGU+QUNTIE5hbm88L2Z1bGwtdGl0bGU+PC9wZXJpb2RpY2FsPjxwYWdlcz4yOTA0OS0y
+OTA3MjwvcGFnZXM+PHZvbHVtZT4xOTwvdm9sdW1lPjxudW1iZXI+MzI8L251bWJlcj48ZGF0ZXM+
+PHllYXI+MjAyNTwveWVhcj48cHViLWRhdGVzPjxkYXRlPjIwMjUvMDgvMTk8L2RhdGU+PC9wdWIt
+ZGF0ZXM+PC9kYXRlcz48cHVibGlzaGVyPkFtZXJpY2FuIENoZW1pY2FsIFNvY2lldHk8L3B1Ymxp
+c2hlcj48aXNibj4xOTM2LTA4NTE8L2lzYm4+PHVybHM+PHJlbGF0ZWQtdXJscz48dXJsPmh0dHBz
+Oi8vZG9pLm9yZy8xMC4xMDIxL2Fjc25hbm8uNWMwNzQ5NDwvdXJsPjwvcmVsYXRlZC11cmxzPjwv
+dXJscz48ZWxlY3Ryb25pYy1yZXNvdXJjZS1udW0+MTAuMTAyMS9hY3NuYW5vLjVjMDc0OTQ8L2Vs
+ZWN0cm9uaWMtcmVzb3VyY2UtbnVtPjwvcmVjb3JkPjwvQ2l0ZT48Q2l0ZT48QXV0aG9yPldhbmc8
+L0F1dGhvcj48WWVhcj4yMDI1PC9ZZWFyPjxSZWNOdW0+MTA8L1JlY051bT48cmVjb3JkPjxyZWMt
+bnVtYmVyPjEwPC9yZWMtbnVtYmVyPjxmb3JlaWduLWtleXM+PGtleSBhcHA9IkVOIiBkYi1pZD0i
+dzl3cGV3OXJhMnMyc3FlcHN2YXZkc2Yyeng1NXpzemZmd2FlIiB0aW1lc3RhbXA9IjE3Nzk2MjQ2
+OTEiPjEwPC9rZXk+PC9mb3JlaWduLWtleXM+PHJlZi10eXBlIG5hbWU9IkpvdXJuYWwgQXJ0aWNs
+ZSI+MTc8L3JlZi10eXBlPjxjb250cmlidXRvcnM+PGF1dGhvcnM+PGF1dGhvcj5XYW5nLCBaaGVu
+Z2p1bjwvYXV0aG9yPjxhdXRob3I+Q2hlbiwgQ2hhbmdjaGVuZzwvYXV0aG9yPjxhdXRob3I+UWlh
+biwgU2hlbmdqaWFvPC9hdXRob3I+PGF1dGhvcj5KaWEsIEJhb25hbjwvYXV0aG9yPjxhdXRob3I+
+WHUsIFlheGluPC9hdXRob3I+PGF1dGhvcj5HdWFuLCBYaWFvbmluZzwvYXV0aG9yPjxhdXRob3I+
+SGFuLCBaaGFvPC9hdXRob3I+PGF1dGhvcj5UdW8sIFlhbGk8L2F1dGhvcj48YXV0aG9yPkR1LCBZ
+dXhpPC9hdXRob3I+PGF1dGhvcj5ZdW4sIFhpb25nZmVpPC9hdXRob3I+PGF1dGhvcj5YaWUsIEpp
+YW5nemhvdTwvYXV0aG9yPjxhdXRob3I+TGl1LCBHYW5nPC9hdXRob3I+PGF1dGhvcj5MdSwgUGVu
+Z2ZlaTwvYXV0aG9yPjwvYXV0aG9ycz48L2NvbnRyaWJ1dG9ycz48dGl0bGVzPjx0aXRsZT5EYXRh
+LURyaXZlbiBEZXNpZ24gb2YgSGFsaWRlIFBlcm92c2tpdGVzIGZvciBFZmZpY2llbnQgR3JlZW4g
+TGlnaHQtRW1pdHRpbmcgRGlvZGVzIHZpYSBNYWNoaW5lIExlYXJuaW5nIGFuZCBERlQ8L3RpdGxl
+PjxzZWNvbmRhcnktdGl0bGU+VGhlIEpvdXJuYWwgb2YgUGh5c2ljYWwgQ2hlbWlzdHJ5IEM8L3Nl
+Y29uZGFyeS10aXRsZT48L3RpdGxlcz48cGVyaW9kaWNhbD48ZnVsbC10aXRsZT5UaGUgSm91cm5h
+bCBvZiBQaHlzaWNhbCBDaGVtaXN0cnkgQzwvZnVsbC10aXRsZT48L3BlcmlvZGljYWw+PHBhZ2Vz
+PjEzNTQyLTEzNTU3PC9wYWdlcz48dm9sdW1lPjEyOTwvdm9sdW1lPjxudW1iZXI+MzA8L251bWJl
+cj48ZGF0ZXM+PHllYXI+MjAyNTwveWVhcj48cHViLWRhdGVzPjxkYXRlPjIwMjUvMDcvMzE8L2Rh
+dGU+PC9wdWItZGF0ZXM+PC9kYXRlcz48cHVibGlzaGVyPkFtZXJpY2FuIENoZW1pY2FsIFNvY2ll
+dHk8L3B1Ymxpc2hlcj48aXNibj4xOTMyLTc0NDc8L2lzYm4+PHVybHM+PHJlbGF0ZWQtdXJscz48
+dXJsPmh0dHBzOi8vZG9pLm9yZy8xMC4xMDIxL2Fjcy5qcGNjLjVjMDIxNDI8L3VybD48L3JlbGF0
+ZWQtdXJscz48L3VybHM+PGVsZWN0cm9uaWMtcmVzb3VyY2UtbnVtPjEwLjEwMjEvYWNzLmpwY2Mu
+NWMwMjE0MjwvZWxlY3Ryb25pYy1yZXNvdXJjZS1udW0+PC9yZWNvcmQ+PC9DaXRlPjwvRW5kTm90
+ZT5=
 </w:fldData>
         </w:fldChar>
       </w:r>
@@ -1666,8 +1760,85 @@
           <w:rFonts w:ascii="Times New Roman" w:hAnsi="Times New Roman" w:cs="Times New Roman"/>
         </w:rPr>
         <w:fldChar w:fldCharType="begin">
-          <w:fldData xml:space="preserve">PEVuZE5vdGU+PENpdGU+PEF1dGhvcj5XYW5nPC9BdXRob3I+PFllYXI+MjAyNTwvWWVhcj48UmVj
-TnVtPjEwPC9SZWNOdW0+PERpc3BsYXlUZXh0PlsxMi0xNF08L0Rpc3BsYXlUZXh0PjxyZWNvcmQ+
+          <w:fldData xml:space="preserve">PEVuZE5vdGU+PENpdGU+PEF1dGhvcj5MdTwvQXV0aG9yPjxZZWFyPjIwMjQ8L1llYXI+PFJlY051
+bT4xMTwvUmVjTnVtPjxEaXNwbGF5VGV4dD5bMTItMTddPC9EaXNwbGF5VGV4dD48cmVjb3JkPjxy
+ZWMtbnVtYmVyPjExPC9yZWMtbnVtYmVyPjxmb3JlaWduLWtleXM+PGtleSBhcHA9IkVOIiBkYi1p
+ZD0idzl3cGV3OXJhMnMyc3FlcHN2YXZkc2Yyeng1NXpzemZmd2FlIiB0aW1lc3RhbXA9IjE3Nzk2
+MjQ4NDAiPjExPC9rZXk+PC9mb3JlaWduLWtleXM+PHJlZi10eXBlIG5hbWU9IkpvdXJuYWwgQXJ0
+aWNsZSI+MTc8L3JlZi10eXBlPjxjb250cmlidXRvcnM+PGF1dGhvcnM+PGF1dGhvcj5MdSwgRmVp
+eXVlPC9hdXRob3I+PGF1dGhvcj5MaWFuZywgWWFueWFuPC9hdXRob3I+PGF1dGhvcj5XYW5nLCBO
+YW5hPC9hdXRob3I+PGF1dGhvcj5aaHUsIExpbjwvYXV0aG9yPjxhdXRob3I+V2FuZywgSmlhbnB1
+PC9hdXRob3I+PC9hdXRob3JzPjwvY29udHJpYnV0b3JzPjx0aXRsZXM+PHRpdGxlPk1hY2hpbmUg
+bGVhcm5pbmcgZm9yIHBlcm92c2tpdGUgb3B0b2VsZWN0cm9uaWNzOiBhIHJldmlldzwvdGl0bGU+
+PC90aXRsZXM+PHBhZ2VzPjA1NDAwMTwvcGFnZXM+PHZvbHVtZT42ICVKIEFkdmFuY2VkIFBob3Rv
+bmljczwvdm9sdW1lPjxudW1iZXI+NTwvbnVtYmVyPjxkYXRlcz48eWVhcj4yMDI0PC95ZWFyPjwv
+ZGF0ZXM+PHVybHM+PHJlbGF0ZWQtdXJscz48dXJsPmh0dHBzOi8vZG9pLm9yZy8xMC4xMTE3LzEu
+QVAuNi41LjA1NDAwMTwvdXJsPjwvcmVsYXRlZC11cmxzPjwvdXJscz48L3JlY29yZD48L0NpdGU+
+PENpdGU+PEF1dGhvcj5kZSBsYSBBc3VuY2nDs24tTmFkYWw8L0F1dGhvcj48WWVhcj4yMDI1PC9Z
+ZWFyPjxSZWNOdW0+Mjg8L1JlY051bT48cmVjb3JkPjxyZWMtbnVtYmVyPjI4PC9yZWMtbnVtYmVy
+Pjxmb3JlaWduLWtleXM+PGtleSBhcHA9IkVOIiBkYi1pZD0idzl3cGV3OXJhMnMyc3FlcHN2YXZk
+c2Yyeng1NXpzemZmd2FlIiB0aW1lc3RhbXA9IjE3ODAyMDAxMDEiPjI4PC9rZXk+PC9mb3JlaWdu
+LWtleXM+PHJlZi10eXBlIG5hbWU9IkpvdXJuYWwgQXJ0aWNsZSI+MTc8L3JlZi10eXBlPjxjb250
+cmlidXRvcnM+PGF1dGhvcnM+PGF1dGhvcj5kZSBsYSBBc3VuY2nDs24tTmFkYWwsIFbDrWN0b3I8
+L2F1dGhvcj48YXV0aG9yPklsaWZmZSBTcHJhZ3VlLCBDaHJpc3RvcGhlcjwvYXV0aG9yPjxhdXRo
+b3I+R3VpamFycm8tQmVyZGnDsWFzLCBCZXJ0aGE8L2F1dGhvcj48YXV0aG9yPkNhcHBlbCwgVXRl
+IEIuPC9hdXRob3I+PGF1dGhvcj5HYXJjw61hLUZlcm7DoW5kZXosIEFsYmVydG88L2F1dGhvcj48
+L2F1dGhvcnM+PC9jb250cmlidXRvcnM+PHRpdGxlcz48dGl0bGU+TWFjaGluZSBsZWFybmluZyBm
+b3IgcGVyb3Zza2l0ZSBzb2xhciBjZWxsczogYSBjb21wcmVoZW5zaXZlIHJldmlldyBvbiBvcHBv
+cnR1bml0aWVzIGFuZCBjaGFsbGVuZ2VzIGZvciBtYXRlcmlhbHMgc2NpZW50aXN0czwvdGl0bGU+
+PHNlY29uZGFyeS10aXRsZT5FRVMgU29sYXI8L3NlY29uZGFyeS10aXRsZT48L3RpdGxlcz48cGVy
+aW9kaWNhbD48ZnVsbC10aXRsZT5FRVMgU29sYXI8L2Z1bGwtdGl0bGU+PC9wZXJpb2RpY2FsPjxw
+YWdlcz45MjctOTU3PC9wYWdlcz48dm9sdW1lPjE8L3ZvbHVtZT48bnVtYmVyPjY8L251bWJlcj48
+ZGF0ZXM+PHllYXI+MjAyNTwveWVhcj48L2RhdGVzPjxwdWJsaXNoZXI+UlNDPC9wdWJsaXNoZXI+
+PHdvcmstdHlwZT4xMC4xMDM5L0Q1RUwwMDA0MUY8L3dvcmstdHlwZT48dXJscz48cmVsYXRlZC11
+cmxzPjx1cmw+aHR0cDovL2R4LmRvaS5vcmcvMTAuMTAzOS9ENUVMMDAwNDFGPC91cmw+PC9yZWxh
+dGVkLXVybHM+PC91cmxzPjxlbGVjdHJvbmljLXJlc291cmNlLW51bT4xMC4xMDM5L0Q1RUwwMDA0
+MUY8L2VsZWN0cm9uaWMtcmVzb3VyY2UtbnVtPjwvcmVjb3JkPjwvQ2l0ZT48Q2l0ZT48QXV0aG9y
+PlpoYW5nPC9BdXRob3I+PFllYXI+MjAyNTwvWWVhcj48UmVjTnVtPjI3PC9SZWNOdW0+PHJlY29y
+ZD48cmVjLW51bWJlcj4yNzwvcmVjLW51bWJlcj48Zm9yZWlnbi1rZXlzPjxrZXkgYXBwPSJFTiIg
+ZGItaWQ9Inc5d3BldzlyYTJzMnNxZXBzdmF2ZHNmMnp4NTV6c3pmZndhZSIgdGltZXN0YW1wPSIx
+NzgwMTk5NjM4Ij4yNzwva2V5PjwvZm9yZWlnbi1rZXlzPjxyZWYtdHlwZSBuYW1lPSJKb3VybmFs
+IEFydGljbGUiPjE3PC9yZWYtdHlwZT48Y29udHJpYnV0b3JzPjxhdXRob3JzPjxhdXRob3I+Wmhh
+bmcsIFJ1aXFpPC9hdXRob3I+PGF1dGhvcj5Nb3RlcywgQnJhbmRvbjwvYXV0aG9yPjxhdXRob3I+
+VGFuLCBTaGF1bjwvYXV0aG9yPjxhdXRob3I+THUsIFlvbmdsaTwvYXV0aG9yPjxhdXRob3I+U2hp
+aCwgTWVuZy1DaGVuPC9hdXRob3I+PGF1dGhvcj5IYW8sIFlpbHVuPC9hdXRob3I+PGF1dGhvcj5Z
+YW5nLCBLYXJlbjwvYXV0aG9yPjxhdXRob3I+U3Jpbml2YXNhbiwgU2hyZXlhczwvYXV0aG9yPjxh
+dXRob3I+QmF3ZW5kaSwgTW91bmdpIEcuPC9hdXRob3I+PGF1dGhvcj5CdWxvdmnEhywgVmxhZGlt
+aXI8L2F1dGhvcj48L2F1dGhvcnM+PC9jb250cmlidXRvcnM+PHRpdGxlcz48dGl0bGU+TWFjaGlu
+ZSBMZWFybmluZyBQcmVkaWN0aW9uIG9mIE9yZ2FuaWPigJNJbm9yZ2FuaWMgSGFsaWRlIFBlcm92
+c2tpdGUgU29sYXIgQ2VsbCBQZXJmb3JtYW5jZSBmcm9tIE9wdGljYWwgUHJvcGVydGllczwvdGl0
+bGU+PHNlY29uZGFyeS10aXRsZT5BQ1MgRW5lcmd5IExldHRlcnM8L3NlY29uZGFyeS10aXRsZT48
+L3RpdGxlcz48cGVyaW9kaWNhbD48ZnVsbC10aXRsZT5BQ1MgRW5lcmd5IExldHRlcnM8L2Z1bGwt
+dGl0bGU+PC9wZXJpb2RpY2FsPjxwYWdlcz4xNzE0LTE3MjQ8L3BhZ2VzPjx2b2x1bWU+MTA8L3Zv
+bHVtZT48bnVtYmVyPjQ8L251bWJlcj48ZGF0ZXM+PHllYXI+MjAyNTwveWVhcj48cHViLWRhdGVz
+PjxkYXRlPjIwMjUvMDQvMTE8L2RhdGU+PC9wdWItZGF0ZXM+PC9kYXRlcz48cHVibGlzaGVyPkFt
+ZXJpY2FuIENoZW1pY2FsIFNvY2lldHk8L3B1Ymxpc2hlcj48dXJscz48cmVsYXRlZC11cmxzPjx1
+cmw+aHR0cHM6Ly9kb2kub3JnLzEwLjEwMjEvYWNzZW5lcmd5bGV0dC40YzAzNTkyPC91cmw+PC9y
+ZWxhdGVkLXVybHM+PC91cmxzPjxlbGVjdHJvbmljLXJlc291cmNlLW51bT4xMC4xMDIxL2Fjc2Vu
+ZXJneWxldHQuNGMwMzU5MjwvZWxlY3Ryb25pYy1yZXNvdXJjZS1udW0+PC9yZWNvcmQ+PC9DaXRl
+PjxDaXRlPjxBdXRob3I+VG9wcmFrPC9BdXRob3I+PFllYXI+MjAyNjwvWWVhcj48UmVjTnVtPjI5
+PC9SZWNOdW0+PHJlY29yZD48cmVjLW51bWJlcj4yOTwvcmVjLW51bWJlcj48Zm9yZWlnbi1rZXlz
+PjxrZXkgYXBwPSJFTiIgZGItaWQ9Inc5d3BldzlyYTJzMnNxZXBzdmF2ZHNmMnp4NTV6c3pmZndh
+ZSIgdGltZXN0YW1wPSIxNzgwMjAwNDA1Ij4yOTwva2V5PjwvZm9yZWlnbi1rZXlzPjxyZWYtdHlw
+ZSBuYW1lPSJKb3VybmFsIEFydGljbGUiPjE3PC9yZWYtdHlwZT48Y29udHJpYnV0b3JzPjxhdXRo
+b3JzPjxhdXRob3I+VG9wcmFrLCBBecWfZWfDvGw8L2F1dGhvcj48L2F1dGhvcnM+PC9jb250cmli
+dXRvcnM+PHRpdGxlcz48dGl0bGU+UHJlZGljdGluZyBwaG90b3ZvbHRhaWMgb3V0cHV0IHBhcmFt
+ZXRlcnMgb2YgcGVyb3Zza2l0ZSBzb2xhciBjZWxscyB1c2luZyBleHBsYWluYWJsZSBtYWNoaW5l
+IGxlYXJuaW5nIHdpdGggcGh5c2ljcy1pbmZvcm1lZCBhbmQgc2ltdWxhdGlvbi1kZXJpdmVkIGRl
+c2NyaXB0b3JzPC90aXRsZT48c2Vjb25kYXJ5LXRpdGxlPk1hdGVyaWFscyBUb2RheSBDb21tdW5p
+Y2F0aW9uczwvc2Vjb25kYXJ5LXRpdGxlPjwvdGl0bGVzPjxwZXJpb2RpY2FsPjxmdWxsLXRpdGxl
+Pk1hdGVyaWFscyBUb2RheSBDb21tdW5pY2F0aW9uczwvZnVsbC10aXRsZT48L3BlcmlvZGljYWw+
+PHBhZ2VzPjExNDk2ODwvcGFnZXM+PHZvbHVtZT41Mjwvdm9sdW1lPjxrZXl3b3Jkcz48a2V5d29y
+ZD5QZXJvdnNraXRlIHNvbGFyIGNlbGxzPC9rZXl3b3JkPjxrZXl3b3JkPlBoeXNpY3MtaW5mb3Jt
+ZWQgbWFjaGluZSBsZWFybmluZzwva2V5d29yZD48a2V5d29yZD5EcmlmdOKAk2RpZmZ1c2lvbiBz
+aW11bGF0aW9uPC9rZXl3b3JkPjxrZXl3b3JkPlNIQVA8L2tleXdvcmQ+PC9rZXl3b3Jkcz48ZGF0
+ZXM+PHllYXI+MjAyNjwveWVhcj48cHViLWRhdGVzPjxkYXRlPjIwMjYvMDMvMDEvPC9kYXRlPjwv
+cHViLWRhdGVzPjwvZGF0ZXM+PGlzYm4+MjM1Mi00OTI4PC9pc2JuPjx1cmxzPjxyZWxhdGVkLXVy
+bHM+PHVybD5odHRwczovL3d3dy5zY2llbmNlZGlyZWN0LmNvbS9zY2llbmNlL2FydGljbGUvcGlp
+L1MyMzUyNDkyODI2MDAzNTIxPC91cmw+PC9yZWxhdGVkLXVybHM+PC91cmxzPjxlbGVjdHJvbmlj
+LXJlc291cmNlLW51bT5odHRwczovL2RvaS5vcmcvMTAuMTAxNi9qLm10Y29tbS4yMDI2LjExNDk2
+ODwvZWxlY3Ryb25pYy1yZXNvdXJjZS1udW0+PC9yZWNvcmQ+PC9DaXRlPjxDaXRlPjxBdXRob3I+
+V2FuZzwvQXV0aG9yPjxZZWFyPjIwMjU8L1llYXI+PFJlY051bT4xMDwvUmVjTnVtPjxyZWNvcmQ+
 PHJlYy1udW1iZXI+MTA8L3JlYy1udW1iZXI+PGZvcmVpZ24ta2V5cz48a2V5IGFwcD0iRU4iIGRi
 LWlkPSJ3OXdwZXc5cmEyczJzcWVwc3ZhdmRzZjJ6eDU1enN6ZmZ3YWUiIHRpbWVzdGFtcD0iMTc3
 OTYyNDY5MSI+MTA8L2tleT48L2ZvcmVpZ24ta2V5cz48cmVmLXR5cGUgbmFtZT0iSm91cm5hbCBB
@@ -1691,66 +1862,53 @@
 cmxzPjx1cmw+aHR0cHM6Ly9kb2kub3JnLzEwLjEwMjEvYWNzLmpwY2MuNWMwMjE0MjwvdXJsPjwv
 cmVsYXRlZC11cmxzPjwvdXJscz48ZWxlY3Ryb25pYy1yZXNvdXJjZS1udW0+MTAuMTAyMS9hY3Mu
 anBjYy41YzAyMTQyPC9lbGVjdHJvbmljLXJlc291cmNlLW51bT48L3JlY29yZD48L0NpdGU+PENp
-dGU+PEF1dGhvcj5XYW5nPC9BdXRob3I+PFllYXI+MjAyNTwvWWVhcj48UmVjTnVtPjEwPC9SZWNO
-dW0+PHJlY29yZD48cmVjLW51bWJlcj4xMDwvcmVjLW51bWJlcj48Zm9yZWlnbi1rZXlzPjxrZXkg
-YXBwPSJFTiIgZGItaWQ9Inc5d3BldzlyYTJzMnNxZXBzdmF2ZHNmMnp4NTV6c3pmZndhZSIgdGlt
-ZXN0YW1wPSIxNzc5NjI0NjkxIj4xMDwva2V5PjwvZm9yZWlnbi1rZXlzPjxyZWYtdHlwZSBuYW1l
-PSJKb3VybmFsIEFydGljbGUiPjE3PC9yZWYtdHlwZT48Y29udHJpYnV0b3JzPjxhdXRob3JzPjxh
-dXRob3I+V2FuZywgWmhlbmdqdW48L2F1dGhvcj48YXV0aG9yPkNoZW4sIENoYW5nY2hlbmc8L2F1
-dGhvcj48YXV0aG9yPlFpYW4sIFNoZW5namlhbzwvYXV0aG9yPjxhdXRob3I+SmlhLCBCYW9uYW48
-L2F1dGhvcj48YXV0aG9yPlh1LCBZYXhpbjwvYXV0aG9yPjxhdXRob3I+R3VhbiwgWGlhb25pbmc8
-L2F1dGhvcj48YXV0aG9yPkhhbiwgWmhhbzwvYXV0aG9yPjxhdXRob3I+VHVvLCBZYWxpPC9hdXRo
-b3I+PGF1dGhvcj5EdSwgWXV4aTwvYXV0aG9yPjxhdXRob3I+WXVuLCBYaW9uZ2ZlaTwvYXV0aG9y
-PjxhdXRob3I+WGllLCBKaWFuZ3pob3U8L2F1dGhvcj48YXV0aG9yPkxpdSwgR2FuZzwvYXV0aG9y
-PjxhdXRob3I+THUsIFBlbmdmZWk8L2F1dGhvcj48L2F1dGhvcnM+PC9jb250cmlidXRvcnM+PHRp
-dGxlcz48dGl0bGU+RGF0YS1Ecml2ZW4gRGVzaWduIG9mIEhhbGlkZSBQZXJvdnNraXRlcyBmb3Ig
-RWZmaWNpZW50IEdyZWVuIExpZ2h0LUVtaXR0aW5nIERpb2RlcyB2aWEgTWFjaGluZSBMZWFybmlu
-ZyBhbmQgREZUPC90aXRsZT48c2Vjb25kYXJ5LXRpdGxlPlRoZSBKb3VybmFsIG9mIFBoeXNpY2Fs
-IENoZW1pc3RyeSBDPC9zZWNvbmRhcnktdGl0bGU+PC90aXRsZXM+PHBlcmlvZGljYWw+PGZ1bGwt
-dGl0bGU+VGhlIEpvdXJuYWwgb2YgUGh5c2ljYWwgQ2hlbWlzdHJ5IEM8L2Z1bGwtdGl0bGU+PC9w
-ZXJpb2RpY2FsPjxwYWdlcz4xMzU0Mi0xMzU1NzwvcGFnZXM+PHZvbHVtZT4xMjk8L3ZvbHVtZT48
-bnVtYmVyPjMwPC9udW1iZXI+PGRhdGVzPjx5ZWFyPjIwMjU8L3llYXI+PHB1Yi1kYXRlcz48ZGF0
-ZT4yMDI1LzA3LzMxPC9kYXRlPjwvcHViLWRhdGVzPjwvZGF0ZXM+PHB1Ymxpc2hlcj5BbWVyaWNh
-biBDaGVtaWNhbCBTb2NpZXR5PC9wdWJsaXNoZXI+PGlzYm4+MTkzMi03NDQ3PC9pc2JuPjx1cmxz
-PjxyZWxhdGVkLXVybHM+PHVybD5odHRwczovL2RvaS5vcmcvMTAuMTAyMS9hY3MuanBjYy41YzAy
-MTQyPC91cmw+PC9yZWxhdGVkLXVybHM+PC91cmxzPjxlbGVjdHJvbmljLXJlc291cmNlLW51bT4x
-MC4xMDIxL2Fjcy5qcGNjLjVjMDIxNDI8L2VsZWN0cm9uaWMtcmVzb3VyY2UtbnVtPjwvcmVjb3Jk
-PjwvQ2l0ZT48Q2l0ZT48QXV0aG9yPldhbmc8L0F1dGhvcj48WWVhcj4yMDI1PC9ZZWFyPjxSZWNO
-dW0+OTwvUmVjTnVtPjxyZWNvcmQ+PHJlYy1udW1iZXI+OTwvcmVjLW51bWJlcj48Zm9yZWlnbi1r
-ZXlzPjxrZXkgYXBwPSJFTiIgZGItaWQ9Inc5d3BldzlyYTJzMnNxZXBzdmF2ZHNmMnp4NTV6c3pm
-ZndhZSIgdGltZXN0YW1wPSIxNzc5NjI0Njg4Ij45PC9rZXk+PC9mb3JlaWduLWtleXM+PHJlZi10
-eXBlIG5hbWU9IkpvdXJuYWwgQXJ0aWNsZSI+MTc8L3JlZi10eXBlPjxjb250cmlidXRvcnM+PGF1
-dGhvcnM+PGF1dGhvcj5XYW5nLCBTaGl5YW48L2F1dGhvcj48YXV0aG9yPkxpdSwgQ2hhb3Blbmc8
-L2F1dGhvcj48YXV0aG9yPkhhbywgV2VpeWFvPC9hdXRob3I+PGF1dGhvcj5aaHVhbmcsIFlhbmxp
-bmc8L2F1dGhvcj48YXV0aG9yPlpodSwgWGlhbmp1bjwvYXV0aG9yPjxhdXRob3I+V2FuZywgTG9u
-Z2x1PC9hdXRob3I+PGF1dGhvcj5OaXUsIFhpYW5naG9uZzwvYXV0aG9yPjxhdXRob3I+TGl1LCBT
-aHVqdWFuPC9hdXRob3I+PGF1dGhvcj5DaGVuLCBCaW5nPC9hdXRob3I+PGF1dGhvcj5aaGFvLCBR
-aWFuZzwvYXV0aG9yPjwvYXV0aG9ycz48L2NvbnRyaWJ1dG9ycz48dGl0bGVzPjx0aXRsZT5Gcm9t
-IEZvcm1hYmlsaXR5IHRvIEJhbmRnYXA6IE1hY2hpbmUgTGVhcm5pbmcgQWNjZWxlcmF0ZXMgdGhl
-IERpc2NvdmVyeSBhbmQgQXBwbGljYXRpb24gb2YgUGVyb3Zza2l0ZSBNYXRlcmlhbHM8L3RpdGxl
-PjxzZWNvbmRhcnktdGl0bGU+QUNTIE5hbm88L3NlY29uZGFyeS10aXRsZT48L3RpdGxlcz48cGVy
-aW9kaWNhbD48ZnVsbC10aXRsZT5BQ1MgTmFubzwvZnVsbC10aXRsZT48L3BlcmlvZGljYWw+PHBh
-Z2VzPjI5MDQ5LTI5MDcyPC9wYWdlcz48dm9sdW1lPjE5PC92b2x1bWU+PG51bWJlcj4zMjwvbnVt
-YmVyPjxkYXRlcz48eWVhcj4yMDI1PC95ZWFyPjxwdWItZGF0ZXM+PGRhdGU+MjAyNS8wOC8xOTwv
-ZGF0ZT48L3B1Yi1kYXRlcz48L2RhdGVzPjxwdWJsaXNoZXI+QW1lcmljYW4gQ2hlbWljYWwgU29j
-aWV0eTwvcHVibGlzaGVyPjxpc2JuPjE5MzYtMDg1MTwvaXNibj48dXJscz48cmVsYXRlZC11cmxz
-Pjx1cmw+aHR0cHM6Ly9kb2kub3JnLzEwLjEwMjEvYWNzbmFuby41YzA3NDk0PC91cmw+PC9yZWxh
-dGVkLXVybHM+PC91cmxzPjxlbGVjdHJvbmljLXJlc291cmNlLW51bT4xMC4xMDIxL2Fjc25hbm8u
-NWMwNzQ5NDwvZWxlY3Ryb25pYy1yZXNvdXJjZS1udW0+PC9yZWNvcmQ+PC9DaXRlPjxDaXRlPjxB
-dXRob3I+THU8L0F1dGhvcj48WWVhcj4yMDI0PC9ZZWFyPjxSZWNOdW0+MTE8L1JlY051bT48cmVj
-b3JkPjxyZWMtbnVtYmVyPjExPC9yZWMtbnVtYmVyPjxmb3JlaWduLWtleXM+PGtleSBhcHA9IkVO
-IiBkYi1pZD0idzl3cGV3OXJhMnMyc3FlcHN2YXZkc2Yyeng1NXpzemZmd2FlIiB0aW1lc3RhbXA9
-IjE3Nzk2MjQ4NDAiPjExPC9rZXk+PC9mb3JlaWduLWtleXM+PHJlZi10eXBlIG5hbWU9IkpvdXJu
-YWwgQXJ0aWNsZSI+MTc8L3JlZi10eXBlPjxjb250cmlidXRvcnM+PGF1dGhvcnM+PGF1dGhvcj5M
-dSwgRmVpeXVlPC9hdXRob3I+PGF1dGhvcj5MaWFuZywgWWFueWFuPC9hdXRob3I+PGF1dGhvcj5X
-YW5nLCBOYW5hPC9hdXRob3I+PGF1dGhvcj5aaHUsIExpbjwvYXV0aG9yPjxhdXRob3I+V2FuZywg
-SmlhbnB1PC9hdXRob3I+PC9hdXRob3JzPjwvY29udHJpYnV0b3JzPjx0aXRsZXM+PHRpdGxlPk1h
-Y2hpbmUgbGVhcm5pbmcgZm9yIHBlcm92c2tpdGUgb3B0b2VsZWN0cm9uaWNzOiBhIHJldmlldzwv
-dGl0bGU+PC90aXRsZXM+PHBhZ2VzPjA1NDAwMTwvcGFnZXM+PHZvbHVtZT42ICVKIEFkdmFuY2Vk
-IFBob3Rvbmljczwvdm9sdW1lPjxudW1iZXI+NTwvbnVtYmVyPjxkYXRlcz48eWVhcj4yMDI0PC95
-ZWFyPjwvZGF0ZXM+PHVybHM+PHJlbGF0ZWQtdXJscz48dXJsPmh0dHBzOi8vZG9pLm9yZy8xMC4x
-MTE3LzEuQVAuNi41LjA1NDAwMTwvdXJsPjwvcmVsYXRlZC11cmxzPjwvdXJscz48L3JlY29yZD48
-L0NpdGU+PC9FbmROb3RlPn==
+dGU+PEF1dGhvcj5XYW5nPC9BdXRob3I+PFllYXI+MjAyNTwvWWVhcj48UmVjTnVtPjk8L1JlY051
+bT48cmVjb3JkPjxyZWMtbnVtYmVyPjk8L3JlYy1udW1iZXI+PGZvcmVpZ24ta2V5cz48a2V5IGFw
+cD0iRU4iIGRiLWlkPSJ3OXdwZXc5cmEyczJzcWVwc3ZhdmRzZjJ6eDU1enN6ZmZ3YWUiIHRpbWVz
+dGFtcD0iMTc3OTYyNDY4OCI+OTwva2V5PjwvZm9yZWlnbi1rZXlzPjxyZWYtdHlwZSBuYW1lPSJK
+b3VybmFsIEFydGljbGUiPjE3PC9yZWYtdHlwZT48Y29udHJpYnV0b3JzPjxhdXRob3JzPjxhdXRo
+b3I+V2FuZywgU2hpeWFuPC9hdXRob3I+PGF1dGhvcj5MaXUsIENoYW9wZW5nPC9hdXRob3I+PGF1
+dGhvcj5IYW8sIFdlaXlhbzwvYXV0aG9yPjxhdXRob3I+Wmh1YW5nLCBZYW5saW5nPC9hdXRob3I+
+PGF1dGhvcj5aaHUsIFhpYW5qdW48L2F1dGhvcj48YXV0aG9yPldhbmcsIExvbmdsdTwvYXV0aG9y
+PjxhdXRob3I+Tml1LCBYaWFuZ2hvbmc8L2F1dGhvcj48YXV0aG9yPkxpdSwgU2h1anVhbjwvYXV0
+aG9yPjxhdXRob3I+Q2hlbiwgQmluZzwvYXV0aG9yPjxhdXRob3I+WmhhbywgUWlhbmc8L2F1dGhv
+cj48L2F1dGhvcnM+PC9jb250cmlidXRvcnM+PHRpdGxlcz48dGl0bGU+RnJvbSBGb3JtYWJpbGl0
+eSB0byBCYW5kZ2FwOiBNYWNoaW5lIExlYXJuaW5nIEFjY2VsZXJhdGVzIHRoZSBEaXNjb3Zlcnkg
+YW5kIEFwcGxpY2F0aW9uIG9mIFBlcm92c2tpdGUgTWF0ZXJpYWxzPC90aXRsZT48c2Vjb25kYXJ5
+LXRpdGxlPkFDUyBOYW5vPC9zZWNvbmRhcnktdGl0bGU+PC90aXRsZXM+PHBlcmlvZGljYWw+PGZ1
+bGwtdGl0bGU+QUNTIE5hbm88L2Z1bGwtdGl0bGU+PC9wZXJpb2RpY2FsPjxwYWdlcz4yOTA0OS0y
+OTA3MjwvcGFnZXM+PHZvbHVtZT4xOTwvdm9sdW1lPjxudW1iZXI+MzI8L251bWJlcj48ZGF0ZXM+
+PHllYXI+MjAyNTwveWVhcj48cHViLWRhdGVzPjxkYXRlPjIwMjUvMDgvMTk8L2RhdGU+PC9wdWIt
+ZGF0ZXM+PC9kYXRlcz48cHVibGlzaGVyPkFtZXJpY2FuIENoZW1pY2FsIFNvY2lldHk8L3B1Ymxp
+c2hlcj48aXNibj4xOTM2LTA4NTE8L2lzYm4+PHVybHM+PHJlbGF0ZWQtdXJscz48dXJsPmh0dHBz
+Oi8vZG9pLm9yZy8xMC4xMDIxL2Fjc25hbm8uNWMwNzQ5NDwvdXJsPjwvcmVsYXRlZC11cmxzPjwv
+dXJscz48ZWxlY3Ryb25pYy1yZXNvdXJjZS1udW0+MTAuMTAyMS9hY3NuYW5vLjVjMDc0OTQ8L2Vs
+ZWN0cm9uaWMtcmVzb3VyY2UtbnVtPjwvcmVjb3JkPjwvQ2l0ZT48Q2l0ZT48QXV0aG9yPldhbmc8
+L0F1dGhvcj48WWVhcj4yMDI1PC9ZZWFyPjxSZWNOdW0+MTA8L1JlY051bT48cmVjb3JkPjxyZWMt
+bnVtYmVyPjEwPC9yZWMtbnVtYmVyPjxmb3JlaWduLWtleXM+PGtleSBhcHA9IkVOIiBkYi1pZD0i
+dzl3cGV3OXJhMnMyc3FlcHN2YXZkc2Yyeng1NXpzemZmd2FlIiB0aW1lc3RhbXA9IjE3Nzk2MjQ2
+OTEiPjEwPC9rZXk+PC9mb3JlaWduLWtleXM+PHJlZi10eXBlIG5hbWU9IkpvdXJuYWwgQXJ0aWNs
+ZSI+MTc8L3JlZi10eXBlPjxjb250cmlidXRvcnM+PGF1dGhvcnM+PGF1dGhvcj5XYW5nLCBaaGVu
+Z2p1bjwvYXV0aG9yPjxhdXRob3I+Q2hlbiwgQ2hhbmdjaGVuZzwvYXV0aG9yPjxhdXRob3I+UWlh
+biwgU2hlbmdqaWFvPC9hdXRob3I+PGF1dGhvcj5KaWEsIEJhb25hbjwvYXV0aG9yPjxhdXRob3I+
+WHUsIFlheGluPC9hdXRob3I+PGF1dGhvcj5HdWFuLCBYaWFvbmluZzwvYXV0aG9yPjxhdXRob3I+
+SGFuLCBaaGFvPC9hdXRob3I+PGF1dGhvcj5UdW8sIFlhbGk8L2F1dGhvcj48YXV0aG9yPkR1LCBZ
+dXhpPC9hdXRob3I+PGF1dGhvcj5ZdW4sIFhpb25nZmVpPC9hdXRob3I+PGF1dGhvcj5YaWUsIEpp
+YW5nemhvdTwvYXV0aG9yPjxhdXRob3I+TGl1LCBHYW5nPC9hdXRob3I+PGF1dGhvcj5MdSwgUGVu
+Z2ZlaTwvYXV0aG9yPjwvYXV0aG9ycz48L2NvbnRyaWJ1dG9ycz48dGl0bGVzPjx0aXRsZT5EYXRh
+LURyaXZlbiBEZXNpZ24gb2YgSGFsaWRlIFBlcm92c2tpdGVzIGZvciBFZmZpY2llbnQgR3JlZW4g
+TGlnaHQtRW1pdHRpbmcgRGlvZGVzIHZpYSBNYWNoaW5lIExlYXJuaW5nIGFuZCBERlQ8L3RpdGxl
+PjxzZWNvbmRhcnktdGl0bGU+VGhlIEpvdXJuYWwgb2YgUGh5c2ljYWwgQ2hlbWlzdHJ5IEM8L3Nl
+Y29uZGFyeS10aXRsZT48L3RpdGxlcz48cGVyaW9kaWNhbD48ZnVsbC10aXRsZT5UaGUgSm91cm5h
+bCBvZiBQaHlzaWNhbCBDaGVtaXN0cnkgQzwvZnVsbC10aXRsZT48L3BlcmlvZGljYWw+PHBhZ2Vz
+PjEzNTQyLTEzNTU3PC9wYWdlcz48dm9sdW1lPjEyOTwvdm9sdW1lPjxudW1iZXI+MzA8L251bWJl
+cj48ZGF0ZXM+PHllYXI+MjAyNTwveWVhcj48cHViLWRhdGVzPjxkYXRlPjIwMjUvMDcvMzE8L2Rh
+dGU+PC9wdWItZGF0ZXM+PC9kYXRlcz48cHVibGlzaGVyPkFtZXJpY2FuIENoZW1pY2FsIFNvY2ll
+dHk8L3B1Ymxpc2hlcj48aXNibj4xOTMyLTc0NDc8L2lzYm4+PHVybHM+PHJlbGF0ZWQtdXJscz48
+dXJsPmh0dHBzOi8vZG9pLm9yZy8xMC4xMDIxL2Fjcy5qcGNjLjVjMDIxNDI8L3VybD48L3JlbGF0
+ZWQtdXJscz48L3VybHM+PGVsZWN0cm9uaWMtcmVzb3VyY2UtbnVtPjEwLjEwMjEvYWNzLmpwY2Mu
+NWMwMjE0MjwvZWxlY3Ryb25pYy1yZXNvdXJjZS1udW0+PC9yZWNvcmQ+PC9DaXRlPjwvRW5kTm90
+ZT5=
 </w:fldData>
         </w:fldChar>
       </w:r>
@@ -1782,19 +1940,13 @@
           <w:rFonts w:ascii="Times New Roman" w:hAnsi="Times New Roman" w:cs="Times New Roman"/>
           <w:noProof/>
         </w:rPr>
-        <w:t>[12-14]</w:t>
+        <w:t>[12-17]</w:t>
       </w:r>
       <w:r>
         <w:rPr>
           <w:rFonts w:ascii="Times New Roman" w:hAnsi="Times New Roman" w:cs="Times New Roman"/>
         </w:rPr>
         <w:fldChar w:fldCharType="end"/>
-      </w:r>
-      <w:r>
-        <w:rPr>
-          <w:rFonts w:ascii="Times New Roman" w:hAnsi="Times New Roman" w:cs="Times New Roman"/>
-        </w:rPr>
-        <w:t xml:space="preserve">. </w:t>
       </w:r>
     </w:p>
     <w:p>
@@ -1845,90 +1997,90 @@
         </w:rPr>
         <w:fldChar w:fldCharType="begin">
           <w:fldData xml:space="preserve">PEVuZE5vdGU+PENpdGU+PEF1dGhvcj5XYW5nPC9BdXRob3I+PFllYXI+MjAyNDwvWWVhcj48UmVj
-TnVtPjE4PC9SZWNOdW0+PERpc3BsYXlUZXh0PlsxMywgMTUtMTddPC9EaXNwbGF5VGV4dD48cmVj
-b3JkPjxyZWMtbnVtYmVyPjE4PC9yZWMtbnVtYmVyPjxmb3JlaWduLWtleXM+PGtleSBhcHA9IkVO
-IiBkYi1pZD0idzl3cGV3OXJhMnMyc3FlcHN2YXZkc2Yyeng1NXpzemZmd2FlIiB0aW1lc3RhbXA9
-IjE3ODAxNjMxNTAiPjE4PC9rZXk+PC9mb3JlaWduLWtleXM+PHJlZi10eXBlIG5hbWU9IkpvdXJu
-YWwgQXJ0aWNsZSI+MTc8L3JlZi10eXBlPjxjb250cmlidXRvcnM+PGF1dGhvcnM+PGF1dGhvcj5X
-YW5nLCBZdW51YW48L2F1dGhvcj48YXV0aG9yPkxpdSwgSmlhbnhpYW5nPC9hdXRob3I+PGF1dGhv
-cj5MaXUsIFl1anVuPC9hdXRob3I+PGF1dGhvcj5MaSwgU2hhb3Blbmc8L2F1dGhvcj48YXV0aG9y
-Plh1LCBYaXVsYWk8L2F1dGhvcj48YXV0aG9yPkxvdSwgWmhpZG9uZzwvYXV0aG9yPjwvYXV0aG9y
-cz48L2NvbnRyaWJ1dG9ycz48dGl0bGVzPjx0aXRsZT5SZWNlbnQgYWR2YW5jZXMgaW4gbGVhZC1m
-cmVlIGhhbGlkZSBwZXJvdnNraXRlczogZnJvbSBzeW50aGVzaXMgdG8gYXBwbGljYXRpb25zPC90
-aXRsZT48c2Vjb25kYXJ5LXRpdGxlPkpvdXJuYWwgb2YgTWF0ZXJpYWxzIENoZW1pc3RyeSBDPC9z
-ZWNvbmRhcnktdGl0bGU+PC90aXRsZXM+PHBlcmlvZGljYWw+PGZ1bGwtdGl0bGU+Sm91cm5hbCBv
-ZiBNYXRlcmlhbHMgQ2hlbWlzdHJ5IEM8L2Z1bGwtdGl0bGU+PC9wZXJpb2RpY2FsPjxwYWdlcz4x
-MDI2Ny0xMDMyOTwvcGFnZXM+PHZvbHVtZT4xMjwvdm9sdW1lPjxudW1iZXI+Mjg8L251bWJlcj48
-ZGF0ZXM+PHllYXI+MjAyNDwveWVhcj48L2RhdGVzPjxwdWJsaXNoZXI+VGhlIFJveWFsIFNvY2ll
-dHkgb2YgQ2hlbWlzdHJ5PC9wdWJsaXNoZXI+PGlzYm4+MjA1MC03NTI2PC9pc2JuPjx3b3JrLXR5
-cGU+MTAuMTAzOS9ENFRDMDE1NTZIPC93b3JrLXR5cGU+PHVybHM+PHJlbGF0ZWQtdXJscz48dXJs
-Pmh0dHA6Ly9keC5kb2kub3JnLzEwLjEwMzkvRDRUQzAxNTU2SDwvdXJsPjwvcmVsYXRlZC11cmxz
-PjwvdXJscz48ZWxlY3Ryb25pYy1yZXNvdXJjZS1udW0+MTAuMTAzOS9ENFRDMDE1NTZIPC9lbGVj
-dHJvbmljLXJlc291cmNlLW51bT48L3JlY29yZD48L0NpdGU+PENpdGU+PEF1dGhvcj5aaGFuZzwv
-QXV0aG9yPjxZZWFyPjIwMjQ8L1llYXI+PFJlY051bT4xOTwvUmVjTnVtPjxyZWNvcmQ+PHJlYy1u
-dW1iZXI+MTk8L3JlYy1udW1iZXI+PGZvcmVpZ24ta2V5cz48a2V5IGFwcD0iRU4iIGRiLWlkPSJ3
-OXdwZXc5cmEyczJzcWVwc3ZhdmRzZjJ6eDU1enN6ZmZ3YWUiIHRpbWVzdGFtcD0iMTc4MDE2MzIz
-MSI+MTk8L2tleT48L2ZvcmVpZ24ta2V5cz48cmVmLXR5cGUgbmFtZT0iSm91cm5hbCBBcnRpY2xl
-Ij4xNzwvcmVmLXR5cGU+PGNvbnRyaWJ1dG9ycz48YXV0aG9ycz48YXV0aG9yPlpoYW5nLCBMaWFu
-ZzwvYXV0aG9yPjxhdXRob3I+THUsIEZlaXl1ZTwvYXV0aG9yPjxhdXRob3I+VGFvLCBHdWFuaG9u
-ZzwvYXV0aG9yPjxhdXRob3I+TGksIE1lbmdtZW5nPC9hdXRob3I+PGF1dGhvcj5ZYW5nLCBaaGVu
-PC9hdXRob3I+PGF1dGhvcj5XYW5nLCBBaXJ1PC9hdXRob3I+PGF1dGhvcj5aaHUsIFdlaTwvYXV0
-aG9yPjxhdXRob3I+Q2FvLCBZdTwvYXV0aG9yPjxhdXRob3I+SmluLCBZaXpoZW5nPC9hdXRob3I+
-PGF1dGhvcj5aaHUsIExpbjwvYXV0aG9yPjxhdXRob3I+SHVhbmcsIFdlaTwvYXV0aG9yPjxhdXRo
-b3I+V2FuZywgSmlhbnB1PC9hdXRob3I+PC9hdXRob3JzPjwvY29udHJpYnV0b3JzPjx0aXRsZXM+
-PHRpdGxlPlByZWRpY3Rpb24gb2YgT3BlcmF0aW9uYWwgTGlmZXRpbWUgb2YgUGVyb3Zza2l0ZSBM
-aWdodCBFbWl0dGluZyBEaW9kZXMgYnkgTWFjaGluZSBMZWFybmluZzwvdGl0bGU+PC90aXRsZXM+
-PHBhZ2VzPjIzMDA3NzI8L3BhZ2VzPjx2b2x1bWU+Njwvdm9sdW1lPjxudW1iZXI+NjwvbnVtYmVy
-PjxkYXRlcz48eWVhcj4yMDI0PC95ZWFyPjwvZGF0ZXM+PGlzYm4+MjY0MC00NTY3PC9pc2JuPjx1
-cmxzPjxyZWxhdGVkLXVybHM+PHVybD5odHRwczovL2FkdmFuY2VkLm9ubGluZWxpYnJhcnkud2ls
-ZXkuY29tL2RvaS9hYnMvMTAuMTAwMi9haXN5LjIwMjMwMDc3MjwvdXJsPjwvcmVsYXRlZC11cmxz
-PjwvdXJscz48ZWxlY3Ryb25pYy1yZXNvdXJjZS1udW0+aHR0cHM6Ly9kb2kub3JnLzEwLjEwMDIv
-YWlzeS4yMDIzMDA3NzI8L2VsZWN0cm9uaWMtcmVzb3VyY2UtbnVtPjwvcmVjb3JkPjwvQ2l0ZT48
-Q2l0ZT48QXV0aG9yPldhbmc8L0F1dGhvcj48WWVhcj4yMDI1PC9ZZWFyPjxSZWNOdW0+OTwvUmVj
-TnVtPjxyZWNvcmQ+PHJlYy1udW1iZXI+OTwvcmVjLW51bWJlcj48Zm9yZWlnbi1rZXlzPjxrZXkg
-YXBwPSJFTiIgZGItaWQ9Inc5d3BldzlyYTJzMnNxZXBzdmF2ZHNmMnp4NTV6c3pmZndhZSIgdGlt
-ZXN0YW1wPSIxNzc5NjI0Njg4Ij45PC9rZXk+PC9mb3JlaWduLWtleXM+PHJlZi10eXBlIG5hbWU9
-IkpvdXJuYWwgQXJ0aWNsZSI+MTc8L3JlZi10eXBlPjxjb250cmlidXRvcnM+PGF1dGhvcnM+PGF1
-dGhvcj5XYW5nLCBTaGl5YW48L2F1dGhvcj48YXV0aG9yPkxpdSwgQ2hhb3Blbmc8L2F1dGhvcj48
-YXV0aG9yPkhhbywgV2VpeWFvPC9hdXRob3I+PGF1dGhvcj5aaHVhbmcsIFlhbmxpbmc8L2F1dGhv
-cj48YXV0aG9yPlpodSwgWGlhbmp1bjwvYXV0aG9yPjxhdXRob3I+V2FuZywgTG9uZ2x1PC9hdXRo
-b3I+PGF1dGhvcj5OaXUsIFhpYW5naG9uZzwvYXV0aG9yPjxhdXRob3I+TGl1LCBTaHVqdWFuPC9h
-dXRob3I+PGF1dGhvcj5DaGVuLCBCaW5nPC9hdXRob3I+PGF1dGhvcj5aaGFvLCBRaWFuZzwvYXV0
-aG9yPjwvYXV0aG9ycz48L2NvbnRyaWJ1dG9ycz48dGl0bGVzPjx0aXRsZT5Gcm9tIEZvcm1hYmls
-aXR5IHRvIEJhbmRnYXA6IE1hY2hpbmUgTGVhcm5pbmcgQWNjZWxlcmF0ZXMgdGhlIERpc2NvdmVy
-eSBhbmQgQXBwbGljYXRpb24gb2YgUGVyb3Zza2l0ZSBNYXRlcmlhbHM8L3RpdGxlPjxzZWNvbmRh
-cnktdGl0bGU+QUNTIE5hbm88L3NlY29uZGFyeS10aXRsZT48L3RpdGxlcz48cGVyaW9kaWNhbD48
-ZnVsbC10aXRsZT5BQ1MgTmFubzwvZnVsbC10aXRsZT48L3BlcmlvZGljYWw+PHBhZ2VzPjI5MDQ5
-LTI5MDcyPC9wYWdlcz48dm9sdW1lPjE5PC92b2x1bWU+PG51bWJlcj4zMjwvbnVtYmVyPjxkYXRl
-cz48eWVhcj4yMDI1PC95ZWFyPjxwdWItZGF0ZXM+PGRhdGU+MjAyNS8wOC8xOTwvZGF0ZT48L3B1
-Yi1kYXRlcz48L2RhdGVzPjxwdWJsaXNoZXI+QW1lcmljYW4gQ2hlbWljYWwgU29jaWV0eTwvcHVi
-bGlzaGVyPjxpc2JuPjE5MzYtMDg1MTwvaXNibj48dXJscz48cmVsYXRlZC11cmxzPjx1cmw+aHR0
-cHM6Ly9kb2kub3JnLzEwLjEwMjEvYWNzbmFuby41YzA3NDk0PC91cmw+PC9yZWxhdGVkLXVybHM+
-PC91cmxzPjxlbGVjdHJvbmljLXJlc291cmNlLW51bT4xMC4xMDIxL2Fjc25hbm8uNWMwNzQ5NDwv
-ZWxlY3Ryb25pYy1yZXNvdXJjZS1udW0+PC9yZWNvcmQ+PC9DaXRlPjxDaXRlPjxBdXRob3I+R2hv
-ZGVzd2FyPC9BdXRob3I+PFllYXI+MjAyNTwvWWVhcj48UmVjTnVtPjIxPC9SZWNOdW0+PHJlY29y
-ZD48cmVjLW51bWJlcj4yMTwvcmVjLW51bWJlcj48Zm9yZWlnbi1rZXlzPjxrZXkgYXBwPSJFTiIg
-ZGItaWQ9Inc5d3BldzlyYTJzMnNxZXBzdmF2ZHNmMnp4NTV6c3pmZndhZSIgdGltZXN0YW1wPSIx
-NzgwMTYzNTUyIj4yMTwva2V5PjwvZm9yZWlnbi1rZXlzPjxyZWYtdHlwZSBuYW1lPSJKb3VybmFs
-IEFydGljbGUiPjE3PC9yZWYtdHlwZT48Y29udHJpYnV0b3JzPjxhdXRob3JzPjxhdXRob3I+R2hv
-ZGVzd2FyLCBVandhbGEgUy48L2F1dGhvcj48YXV0aG9yPkJhbHBhbmRlLCBSdXBhbGkgUy48L2F1
-dGhvcj48YXV0aG9yPlJhdXQsIFZhaXNoYWxpIFAuPC9hdXRob3I+PGF1dGhvcj5XYWplLCBNYW5p
-c2hhIEcuPC9hdXRob3I+PGF1dGhvcj5QZXRoZSwgWW9naW5lZSBTLjwvYXV0aG9yPjxhdXRob3I+
-U2hlbGtlLCBOaWxlc2g8L2F1dGhvcj48YXV0aG9yPklzbGVlbSwgSGF5dGhhbSBGLjwvYXV0aG9y
-PjxhdXRob3I+VmFpcmFnYWRlLCBWaWtyYW50IFMuPC9hdXRob3I+PC9hdXRob3JzPjwvY29udHJp
-YnV0b3JzPjx0aXRsZXM+PHRpdGxlPlRoZSBvcHRpbWl6YXRpb24gb2YgZGVzaWduIGFuZCBwZXJm
-b3JtYW5jZSBpbiBoeWJyaWQgb3JnYW5pYy9pbm9yZ2FuaWMgTEVEcyB0b3dhcmQgbmV4dC1nZW5l
-cmF0aW9uIGhpZ2gtZWZmaWNpZW5jeSBMRURzOiBhcHBsaWNhdGlvbiBvZiBtdWx0aS1tb2RlbCBo
-eWJyaWQgbWFjaGluZSBsZWFybmluZyBhcHByb2FjaDwvdGl0bGU+PHNlY29uZGFyeS10aXRsZT5K
-b3VybmFsIG9mIENvbXB1dGF0aW9uYWwgRWxlY3Ryb25pY3M8L3NlY29uZGFyeS10aXRsZT48L3Rp
-dGxlcz48cGVyaW9kaWNhbD48ZnVsbC10aXRsZT5Kb3VybmFsIG9mIENvbXB1dGF0aW9uYWwgRWxl
-Y3Ryb25pY3M8L2Z1bGwtdGl0bGU+PC9wZXJpb2RpY2FsPjxwYWdlcz45MjwvcGFnZXM+PHZvbHVt
-ZT4yNDwvdm9sdW1lPjxudW1iZXI+MzwvbnVtYmVyPjxkYXRlcz48eWVhcj4yMDI1PC95ZWFyPjxw
-dWItZGF0ZXM+PGRhdGU+MjAyNS8wNS8xNDwvZGF0ZT48L3B1Yi1kYXRlcz48L2RhdGVzPjxpc2Ju
-PjE1NzItODEzNzwvaXNibj48dXJscz48cmVsYXRlZC11cmxzPjx1cmw+aHR0cHM6Ly9kb2kub3Jn
-LzEwLjEwMDcvczEwODI1LTAyNS0wMjMyOS15PC91cmw+PC9yZWxhdGVkLXVybHM+PC91cmxzPjxl
-bGVjdHJvbmljLXJlc291cmNlLW51bT4xMC4xMDA3L3MxMDgyNS0wMjUtMDIzMjkteTwvZWxlY3Ry
-b25pYy1yZXNvdXJjZS1udW0+PC9yZWNvcmQ+PC9DaXRlPjwvRW5kTm90ZT5=
+TnVtPjE4PC9SZWNOdW0+PERpc3BsYXlUZXh0PlsxNy0yMF08L0Rpc3BsYXlUZXh0PjxyZWNvcmQ+
+PHJlYy1udW1iZXI+MTg8L3JlYy1udW1iZXI+PGZvcmVpZ24ta2V5cz48a2V5IGFwcD0iRU4iIGRi
+LWlkPSJ3OXdwZXc5cmEyczJzcWVwc3ZhdmRzZjJ6eDU1enN6ZmZ3YWUiIHRpbWVzdGFtcD0iMTc4
+MDE2MzE1MCI+MTg8L2tleT48L2ZvcmVpZ24ta2V5cz48cmVmLXR5cGUgbmFtZT0iSm91cm5hbCBB
+cnRpY2xlIj4xNzwvcmVmLXR5cGU+PGNvbnRyaWJ1dG9ycz48YXV0aG9ycz48YXV0aG9yPldhbmcs
+IFl1bnVhbjwvYXV0aG9yPjxhdXRob3I+TGl1LCBKaWFueGlhbmc8L2F1dGhvcj48YXV0aG9yPkxp
+dSwgWXVqdW48L2F1dGhvcj48YXV0aG9yPkxpLCBTaGFvcGVuZzwvYXV0aG9yPjxhdXRob3I+WHUs
+IFhpdWxhaTwvYXV0aG9yPjxhdXRob3I+TG91LCBaaGlkb25nPC9hdXRob3I+PC9hdXRob3JzPjwv
+Y29udHJpYnV0b3JzPjx0aXRsZXM+PHRpdGxlPlJlY2VudCBhZHZhbmNlcyBpbiBsZWFkLWZyZWUg
+aGFsaWRlIHBlcm92c2tpdGVzOiBmcm9tIHN5bnRoZXNpcyB0byBhcHBsaWNhdGlvbnM8L3RpdGxl
+PjxzZWNvbmRhcnktdGl0bGU+Sm91cm5hbCBvZiBNYXRlcmlhbHMgQ2hlbWlzdHJ5IEM8L3NlY29u
+ZGFyeS10aXRsZT48L3RpdGxlcz48cGVyaW9kaWNhbD48ZnVsbC10aXRsZT5Kb3VybmFsIG9mIE1h
+dGVyaWFscyBDaGVtaXN0cnkgQzwvZnVsbC10aXRsZT48L3BlcmlvZGljYWw+PHBhZ2VzPjEwMjY3
+LTEwMzI5PC9wYWdlcz48dm9sdW1lPjEyPC92b2x1bWU+PG51bWJlcj4yODwvbnVtYmVyPjxkYXRl
+cz48eWVhcj4yMDI0PC95ZWFyPjwvZGF0ZXM+PHB1Ymxpc2hlcj5UaGUgUm95YWwgU29jaWV0eSBv
+ZiBDaGVtaXN0cnk8L3B1Ymxpc2hlcj48aXNibj4yMDUwLTc1MjY8L2lzYm4+PHdvcmstdHlwZT4x
+MC4xMDM5L0Q0VEMwMTU1Nkg8L3dvcmstdHlwZT48dXJscz48cmVsYXRlZC11cmxzPjx1cmw+aHR0
+cDovL2R4LmRvaS5vcmcvMTAuMTAzOS9ENFRDMDE1NTZIPC91cmw+PC9yZWxhdGVkLXVybHM+PC91
+cmxzPjxlbGVjdHJvbmljLXJlc291cmNlLW51bT4xMC4xMDM5L0Q0VEMwMTU1Nkg8L2VsZWN0cm9u
+aWMtcmVzb3VyY2UtbnVtPjwvcmVjb3JkPjwvQ2l0ZT48Q2l0ZT48QXV0aG9yPlpoYW5nPC9BdXRo
+b3I+PFllYXI+MjAyNDwvWWVhcj48UmVjTnVtPjE5PC9SZWNOdW0+PHJlY29yZD48cmVjLW51bWJl
+cj4xOTwvcmVjLW51bWJlcj48Zm9yZWlnbi1rZXlzPjxrZXkgYXBwPSJFTiIgZGItaWQ9Inc5d3Bl
+dzlyYTJzMnNxZXBzdmF2ZHNmMnp4NTV6c3pmZndhZSIgdGltZXN0YW1wPSIxNzgwMTYzMjMxIj4x
+OTwva2V5PjwvZm9yZWlnbi1rZXlzPjxyZWYtdHlwZSBuYW1lPSJKb3VybmFsIEFydGljbGUiPjE3
+PC9yZWYtdHlwZT48Y29udHJpYnV0b3JzPjxhdXRob3JzPjxhdXRob3I+WmhhbmcsIExpYW5nPC9h
+dXRob3I+PGF1dGhvcj5MdSwgRmVpeXVlPC9hdXRob3I+PGF1dGhvcj5UYW8sIEd1YW5ob25nPC9h
+dXRob3I+PGF1dGhvcj5MaSwgTWVuZ21lbmc8L2F1dGhvcj48YXV0aG9yPllhbmcsIFpoZW48L2F1
+dGhvcj48YXV0aG9yPldhbmcsIEFpcnU8L2F1dGhvcj48YXV0aG9yPlpodSwgV2VpPC9hdXRob3I+
+PGF1dGhvcj5DYW8sIFl1PC9hdXRob3I+PGF1dGhvcj5KaW4sIFlpemhlbmc8L2F1dGhvcj48YXV0
+aG9yPlpodSwgTGluPC9hdXRob3I+PGF1dGhvcj5IdWFuZywgV2VpPC9hdXRob3I+PGF1dGhvcj5X
+YW5nLCBKaWFucHU8L2F1dGhvcj48L2F1dGhvcnM+PC9jb250cmlidXRvcnM+PHRpdGxlcz48dGl0
+bGU+UHJlZGljdGlvbiBvZiBPcGVyYXRpb25hbCBMaWZldGltZSBvZiBQZXJvdnNraXRlIExpZ2h0
+IEVtaXR0aW5nIERpb2RlcyBieSBNYWNoaW5lIExlYXJuaW5nPC90aXRsZT48L3RpdGxlcz48cGFn
+ZXM+MjMwMDc3MjwvcGFnZXM+PHZvbHVtZT42PC92b2x1bWU+PG51bWJlcj42PC9udW1iZXI+PGRh
+dGVzPjx5ZWFyPjIwMjQ8L3llYXI+PC9kYXRlcz48aXNibj4yNjQwLTQ1Njc8L2lzYm4+PHVybHM+
+PHJlbGF0ZWQtdXJscz48dXJsPmh0dHBzOi8vYWR2YW5jZWQub25saW5lbGlicmFyeS53aWxleS5j
+b20vZG9pL2Ficy8xMC4xMDAyL2Fpc3kuMjAyMzAwNzcyPC91cmw+PC9yZWxhdGVkLXVybHM+PC91
+cmxzPjxlbGVjdHJvbmljLXJlc291cmNlLW51bT5odHRwczovL2RvaS5vcmcvMTAuMTAwMi9haXN5
+LjIwMjMwMDc3MjwvZWxlY3Ryb25pYy1yZXNvdXJjZS1udW0+PC9yZWNvcmQ+PC9DaXRlPjxDaXRl
+PjxBdXRob3I+V2FuZzwvQXV0aG9yPjxZZWFyPjIwMjU8L1llYXI+PFJlY051bT45PC9SZWNOdW0+
+PHJlY29yZD48cmVjLW51bWJlcj45PC9yZWMtbnVtYmVyPjxmb3JlaWduLWtleXM+PGtleSBhcHA9
+IkVOIiBkYi1pZD0idzl3cGV3OXJhMnMyc3FlcHN2YXZkc2Yyeng1NXpzemZmd2FlIiB0aW1lc3Rh
+bXA9IjE3Nzk2MjQ2ODgiPjk8L2tleT48L2ZvcmVpZ24ta2V5cz48cmVmLXR5cGUgbmFtZT0iSm91
+cm5hbCBBcnRpY2xlIj4xNzwvcmVmLXR5cGU+PGNvbnRyaWJ1dG9ycz48YXV0aG9ycz48YXV0aG9y
+PldhbmcsIFNoaXlhbjwvYXV0aG9yPjxhdXRob3I+TGl1LCBDaGFvcGVuZzwvYXV0aG9yPjxhdXRo
+b3I+SGFvLCBXZWl5YW88L2F1dGhvcj48YXV0aG9yPlpodWFuZywgWWFubGluZzwvYXV0aG9yPjxh
+dXRob3I+Wmh1LCBYaWFuanVuPC9hdXRob3I+PGF1dGhvcj5XYW5nLCBMb25nbHU8L2F1dGhvcj48
+YXV0aG9yPk5pdSwgWGlhbmdob25nPC9hdXRob3I+PGF1dGhvcj5MaXUsIFNodWp1YW48L2F1dGhv
+cj48YXV0aG9yPkNoZW4sIEJpbmc8L2F1dGhvcj48YXV0aG9yPlpoYW8sIFFpYW5nPC9hdXRob3I+
+PC9hdXRob3JzPjwvY29udHJpYnV0b3JzPjx0aXRsZXM+PHRpdGxlPkZyb20gRm9ybWFiaWxpdHkg
+dG8gQmFuZGdhcDogTWFjaGluZSBMZWFybmluZyBBY2NlbGVyYXRlcyB0aGUgRGlzY292ZXJ5IGFu
+ZCBBcHBsaWNhdGlvbiBvZiBQZXJvdnNraXRlIE1hdGVyaWFsczwvdGl0bGU+PHNlY29uZGFyeS10
+aXRsZT5BQ1MgTmFubzwvc2Vjb25kYXJ5LXRpdGxlPjwvdGl0bGVzPjxwZXJpb2RpY2FsPjxmdWxs
+LXRpdGxlPkFDUyBOYW5vPC9mdWxsLXRpdGxlPjwvcGVyaW9kaWNhbD48cGFnZXM+MjkwNDktMjkw
+NzI8L3BhZ2VzPjx2b2x1bWU+MTk8L3ZvbHVtZT48bnVtYmVyPjMyPC9udW1iZXI+PGRhdGVzPjx5
+ZWFyPjIwMjU8L3llYXI+PHB1Yi1kYXRlcz48ZGF0ZT4yMDI1LzA4LzE5PC9kYXRlPjwvcHViLWRh
+dGVzPjwvZGF0ZXM+PHB1Ymxpc2hlcj5BbWVyaWNhbiBDaGVtaWNhbCBTb2NpZXR5PC9wdWJsaXNo
+ZXI+PGlzYm4+MTkzNi0wODUxPC9pc2JuPjx1cmxzPjxyZWxhdGVkLXVybHM+PHVybD5odHRwczov
+L2RvaS5vcmcvMTAuMTAyMS9hY3NuYW5vLjVjMDc0OTQ8L3VybD48L3JlbGF0ZWQtdXJscz48L3Vy
+bHM+PGVsZWN0cm9uaWMtcmVzb3VyY2UtbnVtPjEwLjEwMjEvYWNzbmFuby41YzA3NDk0PC9lbGVj
+dHJvbmljLXJlc291cmNlLW51bT48L3JlY29yZD48L0NpdGU+PENpdGU+PEF1dGhvcj5HaG9kZXN3
+YXI8L0F1dGhvcj48WWVhcj4yMDI1PC9ZZWFyPjxSZWNOdW0+MjE8L1JlY051bT48cmVjb3JkPjxy
+ZWMtbnVtYmVyPjIxPC9yZWMtbnVtYmVyPjxmb3JlaWduLWtleXM+PGtleSBhcHA9IkVOIiBkYi1p
+ZD0idzl3cGV3OXJhMnMyc3FlcHN2YXZkc2Yyeng1NXpzemZmd2FlIiB0aW1lc3RhbXA9IjE3ODAx
+NjM1NTIiPjIxPC9rZXk+PC9mb3JlaWduLWtleXM+PHJlZi10eXBlIG5hbWU9IkpvdXJuYWwgQXJ0
+aWNsZSI+MTc8L3JlZi10eXBlPjxjb250cmlidXRvcnM+PGF1dGhvcnM+PGF1dGhvcj5HaG9kZXN3
+YXIsIFVqd2FsYSBTLjwvYXV0aG9yPjxhdXRob3I+QmFscGFuZGUsIFJ1cGFsaSBTLjwvYXV0aG9y
+PjxhdXRob3I+UmF1dCwgVmFpc2hhbGkgUC48L2F1dGhvcj48YXV0aG9yPldhamUsIE1hbmlzaGEg
+Ry48L2F1dGhvcj48YXV0aG9yPlBldGhlLCBZb2dpbmVlIFMuPC9hdXRob3I+PGF1dGhvcj5TaGVs
+a2UsIE5pbGVzaDwvYXV0aG9yPjxhdXRob3I+SXNsZWVtLCBIYXl0aGFtIEYuPC9hdXRob3I+PGF1
+dGhvcj5WYWlyYWdhZGUsIFZpa3JhbnQgUy48L2F1dGhvcj48L2F1dGhvcnM+PC9jb250cmlidXRv
+cnM+PHRpdGxlcz48dGl0bGU+VGhlIG9wdGltaXphdGlvbiBvZiBkZXNpZ24gYW5kIHBlcmZvcm1h
+bmNlIGluIGh5YnJpZCBvcmdhbmljL2lub3JnYW5pYyBMRURzIHRvd2FyZCBuZXh0LWdlbmVyYXRp
+b24gaGlnaC1lZmZpY2llbmN5IExFRHM6IGFwcGxpY2F0aW9uIG9mIG11bHRpLW1vZGVsIGh5YnJp
+ZCBtYWNoaW5lIGxlYXJuaW5nIGFwcHJvYWNoPC90aXRsZT48c2Vjb25kYXJ5LXRpdGxlPkpvdXJu
+YWwgb2YgQ29tcHV0YXRpb25hbCBFbGVjdHJvbmljczwvc2Vjb25kYXJ5LXRpdGxlPjwvdGl0bGVz
+PjxwZXJpb2RpY2FsPjxmdWxsLXRpdGxlPkpvdXJuYWwgb2YgQ29tcHV0YXRpb25hbCBFbGVjdHJv
+bmljczwvZnVsbC10aXRsZT48L3BlcmlvZGljYWw+PHBhZ2VzPjkyPC9wYWdlcz48dm9sdW1lPjI0
+PC92b2x1bWU+PG51bWJlcj4zPC9udW1iZXI+PGRhdGVzPjx5ZWFyPjIwMjU8L3llYXI+PHB1Yi1k
+YXRlcz48ZGF0ZT4yMDI1LzA1LzE0PC9kYXRlPjwvcHViLWRhdGVzPjwvZGF0ZXM+PGlzYm4+MTU3
+Mi04MTM3PC9pc2JuPjx1cmxzPjxyZWxhdGVkLXVybHM+PHVybD5odHRwczovL2RvaS5vcmcvMTAu
+MTAwNy9zMTA4MjUtMDI1LTAyMzI5LXk8L3VybD48L3JlbGF0ZWQtdXJscz48L3VybHM+PGVsZWN0
+cm9uaWMtcmVzb3VyY2UtbnVtPjEwLjEwMDcvczEwODI1LTAyNS0wMjMyOS15PC9lbGVjdHJvbmlj
+LXJlc291cmNlLW51bT48L3JlY29yZD48L0NpdGU+PC9FbmROb3RlPn==
 </w:fldData>
         </w:fldChar>
       </w:r>
@@ -1944,90 +2096,90 @@
         </w:rPr>
         <w:fldChar w:fldCharType="begin">
           <w:fldData xml:space="preserve">PEVuZE5vdGU+PENpdGU+PEF1dGhvcj5XYW5nPC9BdXRob3I+PFllYXI+MjAyNDwvWWVhcj48UmVj
-TnVtPjE4PC9SZWNOdW0+PERpc3BsYXlUZXh0PlsxMywgMTUtMTddPC9EaXNwbGF5VGV4dD48cmVj
-b3JkPjxyZWMtbnVtYmVyPjE4PC9yZWMtbnVtYmVyPjxmb3JlaWduLWtleXM+PGtleSBhcHA9IkVO
-IiBkYi1pZD0idzl3cGV3OXJhMnMyc3FlcHN2YXZkc2Yyeng1NXpzemZmd2FlIiB0aW1lc3RhbXA9
-IjE3ODAxNjMxNTAiPjE4PC9rZXk+PC9mb3JlaWduLWtleXM+PHJlZi10eXBlIG5hbWU9IkpvdXJu
-YWwgQXJ0aWNsZSI+MTc8L3JlZi10eXBlPjxjb250cmlidXRvcnM+PGF1dGhvcnM+PGF1dGhvcj5X
-YW5nLCBZdW51YW48L2F1dGhvcj48YXV0aG9yPkxpdSwgSmlhbnhpYW5nPC9hdXRob3I+PGF1dGhv
-cj5MaXUsIFl1anVuPC9hdXRob3I+PGF1dGhvcj5MaSwgU2hhb3Blbmc8L2F1dGhvcj48YXV0aG9y
-Plh1LCBYaXVsYWk8L2F1dGhvcj48YXV0aG9yPkxvdSwgWmhpZG9uZzwvYXV0aG9yPjwvYXV0aG9y
-cz48L2NvbnRyaWJ1dG9ycz48dGl0bGVzPjx0aXRsZT5SZWNlbnQgYWR2YW5jZXMgaW4gbGVhZC1m
-cmVlIGhhbGlkZSBwZXJvdnNraXRlczogZnJvbSBzeW50aGVzaXMgdG8gYXBwbGljYXRpb25zPC90
-aXRsZT48c2Vjb25kYXJ5LXRpdGxlPkpvdXJuYWwgb2YgTWF0ZXJpYWxzIENoZW1pc3RyeSBDPC9z
-ZWNvbmRhcnktdGl0bGU+PC90aXRsZXM+PHBlcmlvZGljYWw+PGZ1bGwtdGl0bGU+Sm91cm5hbCBv
-ZiBNYXRlcmlhbHMgQ2hlbWlzdHJ5IEM8L2Z1bGwtdGl0bGU+PC9wZXJpb2RpY2FsPjxwYWdlcz4x
-MDI2Ny0xMDMyOTwvcGFnZXM+PHZvbHVtZT4xMjwvdm9sdW1lPjxudW1iZXI+Mjg8L251bWJlcj48
-ZGF0ZXM+PHllYXI+MjAyNDwveWVhcj48L2RhdGVzPjxwdWJsaXNoZXI+VGhlIFJveWFsIFNvY2ll
-dHkgb2YgQ2hlbWlzdHJ5PC9wdWJsaXNoZXI+PGlzYm4+MjA1MC03NTI2PC9pc2JuPjx3b3JrLXR5
-cGU+MTAuMTAzOS9ENFRDMDE1NTZIPC93b3JrLXR5cGU+PHVybHM+PHJlbGF0ZWQtdXJscz48dXJs
-Pmh0dHA6Ly9keC5kb2kub3JnLzEwLjEwMzkvRDRUQzAxNTU2SDwvdXJsPjwvcmVsYXRlZC11cmxz
-PjwvdXJscz48ZWxlY3Ryb25pYy1yZXNvdXJjZS1udW0+MTAuMTAzOS9ENFRDMDE1NTZIPC9lbGVj
-dHJvbmljLXJlc291cmNlLW51bT48L3JlY29yZD48L0NpdGU+PENpdGU+PEF1dGhvcj5aaGFuZzwv
-QXV0aG9yPjxZZWFyPjIwMjQ8L1llYXI+PFJlY051bT4xOTwvUmVjTnVtPjxyZWNvcmQ+PHJlYy1u
-dW1iZXI+MTk8L3JlYy1udW1iZXI+PGZvcmVpZ24ta2V5cz48a2V5IGFwcD0iRU4iIGRiLWlkPSJ3
-OXdwZXc5cmEyczJzcWVwc3ZhdmRzZjJ6eDU1enN6ZmZ3YWUiIHRpbWVzdGFtcD0iMTc4MDE2MzIz
-MSI+MTk8L2tleT48L2ZvcmVpZ24ta2V5cz48cmVmLXR5cGUgbmFtZT0iSm91cm5hbCBBcnRpY2xl
-Ij4xNzwvcmVmLXR5cGU+PGNvbnRyaWJ1dG9ycz48YXV0aG9ycz48YXV0aG9yPlpoYW5nLCBMaWFu
-ZzwvYXV0aG9yPjxhdXRob3I+THUsIEZlaXl1ZTwvYXV0aG9yPjxhdXRob3I+VGFvLCBHdWFuaG9u
-ZzwvYXV0aG9yPjxhdXRob3I+TGksIE1lbmdtZW5nPC9hdXRob3I+PGF1dGhvcj5ZYW5nLCBaaGVu
-PC9hdXRob3I+PGF1dGhvcj5XYW5nLCBBaXJ1PC9hdXRob3I+PGF1dGhvcj5aaHUsIFdlaTwvYXV0
-aG9yPjxhdXRob3I+Q2FvLCBZdTwvYXV0aG9yPjxhdXRob3I+SmluLCBZaXpoZW5nPC9hdXRob3I+
-PGF1dGhvcj5aaHUsIExpbjwvYXV0aG9yPjxhdXRob3I+SHVhbmcsIFdlaTwvYXV0aG9yPjxhdXRo
-b3I+V2FuZywgSmlhbnB1PC9hdXRob3I+PC9hdXRob3JzPjwvY29udHJpYnV0b3JzPjx0aXRsZXM+
-PHRpdGxlPlByZWRpY3Rpb24gb2YgT3BlcmF0aW9uYWwgTGlmZXRpbWUgb2YgUGVyb3Zza2l0ZSBM
-aWdodCBFbWl0dGluZyBEaW9kZXMgYnkgTWFjaGluZSBMZWFybmluZzwvdGl0bGU+PC90aXRsZXM+
-PHBhZ2VzPjIzMDA3NzI8L3BhZ2VzPjx2b2x1bWU+Njwvdm9sdW1lPjxudW1iZXI+NjwvbnVtYmVy
-PjxkYXRlcz48eWVhcj4yMDI0PC95ZWFyPjwvZGF0ZXM+PGlzYm4+MjY0MC00NTY3PC9pc2JuPjx1
-cmxzPjxyZWxhdGVkLXVybHM+PHVybD5odHRwczovL2FkdmFuY2VkLm9ubGluZWxpYnJhcnkud2ls
-ZXkuY29tL2RvaS9hYnMvMTAuMTAwMi9haXN5LjIwMjMwMDc3MjwvdXJsPjwvcmVsYXRlZC11cmxz
-PjwvdXJscz48ZWxlY3Ryb25pYy1yZXNvdXJjZS1udW0+aHR0cHM6Ly9kb2kub3JnLzEwLjEwMDIv
-YWlzeS4yMDIzMDA3NzI8L2VsZWN0cm9uaWMtcmVzb3VyY2UtbnVtPjwvcmVjb3JkPjwvQ2l0ZT48
-Q2l0ZT48QXV0aG9yPldhbmc8L0F1dGhvcj48WWVhcj4yMDI1PC9ZZWFyPjxSZWNOdW0+OTwvUmVj
-TnVtPjxyZWNvcmQ+PHJlYy1udW1iZXI+OTwvcmVjLW51bWJlcj48Zm9yZWlnbi1rZXlzPjxrZXkg
-YXBwPSJFTiIgZGItaWQ9Inc5d3BldzlyYTJzMnNxZXBzdmF2ZHNmMnp4NTV6c3pmZndhZSIgdGlt
-ZXN0YW1wPSIxNzc5NjI0Njg4Ij45PC9rZXk+PC9mb3JlaWduLWtleXM+PHJlZi10eXBlIG5hbWU9
-IkpvdXJuYWwgQXJ0aWNsZSI+MTc8L3JlZi10eXBlPjxjb250cmlidXRvcnM+PGF1dGhvcnM+PGF1
-dGhvcj5XYW5nLCBTaGl5YW48L2F1dGhvcj48YXV0aG9yPkxpdSwgQ2hhb3Blbmc8L2F1dGhvcj48
-YXV0aG9yPkhhbywgV2VpeWFvPC9hdXRob3I+PGF1dGhvcj5aaHVhbmcsIFlhbmxpbmc8L2F1dGhv
-cj48YXV0aG9yPlpodSwgWGlhbmp1bjwvYXV0aG9yPjxhdXRob3I+V2FuZywgTG9uZ2x1PC9hdXRo
-b3I+PGF1dGhvcj5OaXUsIFhpYW5naG9uZzwvYXV0aG9yPjxhdXRob3I+TGl1LCBTaHVqdWFuPC9h
-dXRob3I+PGF1dGhvcj5DaGVuLCBCaW5nPC9hdXRob3I+PGF1dGhvcj5aaGFvLCBRaWFuZzwvYXV0
-aG9yPjwvYXV0aG9ycz48L2NvbnRyaWJ1dG9ycz48dGl0bGVzPjx0aXRsZT5Gcm9tIEZvcm1hYmls
-aXR5IHRvIEJhbmRnYXA6IE1hY2hpbmUgTGVhcm5pbmcgQWNjZWxlcmF0ZXMgdGhlIERpc2NvdmVy
-eSBhbmQgQXBwbGljYXRpb24gb2YgUGVyb3Zza2l0ZSBNYXRlcmlhbHM8L3RpdGxlPjxzZWNvbmRh
-cnktdGl0bGU+QUNTIE5hbm88L3NlY29uZGFyeS10aXRsZT48L3RpdGxlcz48cGVyaW9kaWNhbD48
-ZnVsbC10aXRsZT5BQ1MgTmFubzwvZnVsbC10aXRsZT48L3BlcmlvZGljYWw+PHBhZ2VzPjI5MDQ5
-LTI5MDcyPC9wYWdlcz48dm9sdW1lPjE5PC92b2x1bWU+PG51bWJlcj4zMjwvbnVtYmVyPjxkYXRl
-cz48eWVhcj4yMDI1PC95ZWFyPjxwdWItZGF0ZXM+PGRhdGU+MjAyNS8wOC8xOTwvZGF0ZT48L3B1
-Yi1kYXRlcz48L2RhdGVzPjxwdWJsaXNoZXI+QW1lcmljYW4gQ2hlbWljYWwgU29jaWV0eTwvcHVi
-bGlzaGVyPjxpc2JuPjE5MzYtMDg1MTwvaXNibj48dXJscz48cmVsYXRlZC11cmxzPjx1cmw+aHR0
-cHM6Ly9kb2kub3JnLzEwLjEwMjEvYWNzbmFuby41YzA3NDk0PC91cmw+PC9yZWxhdGVkLXVybHM+
-PC91cmxzPjxlbGVjdHJvbmljLXJlc291cmNlLW51bT4xMC4xMDIxL2Fjc25hbm8uNWMwNzQ5NDwv
-ZWxlY3Ryb25pYy1yZXNvdXJjZS1udW0+PC9yZWNvcmQ+PC9DaXRlPjxDaXRlPjxBdXRob3I+R2hv
-ZGVzd2FyPC9BdXRob3I+PFllYXI+MjAyNTwvWWVhcj48UmVjTnVtPjIxPC9SZWNOdW0+PHJlY29y
-ZD48cmVjLW51bWJlcj4yMTwvcmVjLW51bWJlcj48Zm9yZWlnbi1rZXlzPjxrZXkgYXBwPSJFTiIg
-ZGItaWQ9Inc5d3BldzlyYTJzMnNxZXBzdmF2ZHNmMnp4NTV6c3pmZndhZSIgdGltZXN0YW1wPSIx
-NzgwMTYzNTUyIj4yMTwva2V5PjwvZm9yZWlnbi1rZXlzPjxyZWYtdHlwZSBuYW1lPSJKb3VybmFs
-IEFydGljbGUiPjE3PC9yZWYtdHlwZT48Y29udHJpYnV0b3JzPjxhdXRob3JzPjxhdXRob3I+R2hv
-ZGVzd2FyLCBVandhbGEgUy48L2F1dGhvcj48YXV0aG9yPkJhbHBhbmRlLCBSdXBhbGkgUy48L2F1
-dGhvcj48YXV0aG9yPlJhdXQsIFZhaXNoYWxpIFAuPC9hdXRob3I+PGF1dGhvcj5XYWplLCBNYW5p
-c2hhIEcuPC9hdXRob3I+PGF1dGhvcj5QZXRoZSwgWW9naW5lZSBTLjwvYXV0aG9yPjxhdXRob3I+
-U2hlbGtlLCBOaWxlc2g8L2F1dGhvcj48YXV0aG9yPklzbGVlbSwgSGF5dGhhbSBGLjwvYXV0aG9y
-PjxhdXRob3I+VmFpcmFnYWRlLCBWaWtyYW50IFMuPC9hdXRob3I+PC9hdXRob3JzPjwvY29udHJp
-YnV0b3JzPjx0aXRsZXM+PHRpdGxlPlRoZSBvcHRpbWl6YXRpb24gb2YgZGVzaWduIGFuZCBwZXJm
-b3JtYW5jZSBpbiBoeWJyaWQgb3JnYW5pYy9pbm9yZ2FuaWMgTEVEcyB0b3dhcmQgbmV4dC1nZW5l
-cmF0aW9uIGhpZ2gtZWZmaWNpZW5jeSBMRURzOiBhcHBsaWNhdGlvbiBvZiBtdWx0aS1tb2RlbCBo
-eWJyaWQgbWFjaGluZSBsZWFybmluZyBhcHByb2FjaDwvdGl0bGU+PHNlY29uZGFyeS10aXRsZT5K
-b3VybmFsIG9mIENvbXB1dGF0aW9uYWwgRWxlY3Ryb25pY3M8L3NlY29uZGFyeS10aXRsZT48L3Rp
-dGxlcz48cGVyaW9kaWNhbD48ZnVsbC10aXRsZT5Kb3VybmFsIG9mIENvbXB1dGF0aW9uYWwgRWxl
-Y3Ryb25pY3M8L2Z1bGwtdGl0bGU+PC9wZXJpb2RpY2FsPjxwYWdlcz45MjwvcGFnZXM+PHZvbHVt
-ZT4yNDwvdm9sdW1lPjxudW1iZXI+MzwvbnVtYmVyPjxkYXRlcz48eWVhcj4yMDI1PC95ZWFyPjxw
-dWItZGF0ZXM+PGRhdGU+MjAyNS8wNS8xNDwvZGF0ZT48L3B1Yi1kYXRlcz48L2RhdGVzPjxpc2Ju
-PjE1NzItODEzNzwvaXNibj48dXJscz48cmVsYXRlZC11cmxzPjx1cmw+aHR0cHM6Ly9kb2kub3Jn
-LzEwLjEwMDcvczEwODI1LTAyNS0wMjMyOS15PC91cmw+PC9yZWxhdGVkLXVybHM+PC91cmxzPjxl
-bGVjdHJvbmljLXJlc291cmNlLW51bT4xMC4xMDA3L3MxMDgyNS0wMjUtMDIzMjkteTwvZWxlY3Ry
-b25pYy1yZXNvdXJjZS1udW0+PC9yZWNvcmQ+PC9DaXRlPjwvRW5kTm90ZT5=
+TnVtPjE4PC9SZWNOdW0+PERpc3BsYXlUZXh0PlsxNy0yMF08L0Rpc3BsYXlUZXh0PjxyZWNvcmQ+
+PHJlYy1udW1iZXI+MTg8L3JlYy1udW1iZXI+PGZvcmVpZ24ta2V5cz48a2V5IGFwcD0iRU4iIGRi
+LWlkPSJ3OXdwZXc5cmEyczJzcWVwc3ZhdmRzZjJ6eDU1enN6ZmZ3YWUiIHRpbWVzdGFtcD0iMTc4
+MDE2MzE1MCI+MTg8L2tleT48L2ZvcmVpZ24ta2V5cz48cmVmLXR5cGUgbmFtZT0iSm91cm5hbCBB
+cnRpY2xlIj4xNzwvcmVmLXR5cGU+PGNvbnRyaWJ1dG9ycz48YXV0aG9ycz48YXV0aG9yPldhbmcs
+IFl1bnVhbjwvYXV0aG9yPjxhdXRob3I+TGl1LCBKaWFueGlhbmc8L2F1dGhvcj48YXV0aG9yPkxp
+dSwgWXVqdW48L2F1dGhvcj48YXV0aG9yPkxpLCBTaGFvcGVuZzwvYXV0aG9yPjxhdXRob3I+WHUs
+IFhpdWxhaTwvYXV0aG9yPjxhdXRob3I+TG91LCBaaGlkb25nPC9hdXRob3I+PC9hdXRob3JzPjwv
+Y29udHJpYnV0b3JzPjx0aXRsZXM+PHRpdGxlPlJlY2VudCBhZHZhbmNlcyBpbiBsZWFkLWZyZWUg
+aGFsaWRlIHBlcm92c2tpdGVzOiBmcm9tIHN5bnRoZXNpcyB0byBhcHBsaWNhdGlvbnM8L3RpdGxl
+PjxzZWNvbmRhcnktdGl0bGU+Sm91cm5hbCBvZiBNYXRlcmlhbHMgQ2hlbWlzdHJ5IEM8L3NlY29u
+ZGFyeS10aXRsZT48L3RpdGxlcz48cGVyaW9kaWNhbD48ZnVsbC10aXRsZT5Kb3VybmFsIG9mIE1h
+dGVyaWFscyBDaGVtaXN0cnkgQzwvZnVsbC10aXRsZT48L3BlcmlvZGljYWw+PHBhZ2VzPjEwMjY3
+LTEwMzI5PC9wYWdlcz48dm9sdW1lPjEyPC92b2x1bWU+PG51bWJlcj4yODwvbnVtYmVyPjxkYXRl
+cz48eWVhcj4yMDI0PC95ZWFyPjwvZGF0ZXM+PHB1Ymxpc2hlcj5UaGUgUm95YWwgU29jaWV0eSBv
+ZiBDaGVtaXN0cnk8L3B1Ymxpc2hlcj48aXNibj4yMDUwLTc1MjY8L2lzYm4+PHdvcmstdHlwZT4x
+MC4xMDM5L0Q0VEMwMTU1Nkg8L3dvcmstdHlwZT48dXJscz48cmVsYXRlZC11cmxzPjx1cmw+aHR0
+cDovL2R4LmRvaS5vcmcvMTAuMTAzOS9ENFRDMDE1NTZIPC91cmw+PC9yZWxhdGVkLXVybHM+PC91
+cmxzPjxlbGVjdHJvbmljLXJlc291cmNlLW51bT4xMC4xMDM5L0Q0VEMwMTU1Nkg8L2VsZWN0cm9u
+aWMtcmVzb3VyY2UtbnVtPjwvcmVjb3JkPjwvQ2l0ZT48Q2l0ZT48QXV0aG9yPlpoYW5nPC9BdXRo
+b3I+PFllYXI+MjAyNDwvWWVhcj48UmVjTnVtPjE5PC9SZWNOdW0+PHJlY29yZD48cmVjLW51bWJl
+cj4xOTwvcmVjLW51bWJlcj48Zm9yZWlnbi1rZXlzPjxrZXkgYXBwPSJFTiIgZGItaWQ9Inc5d3Bl
+dzlyYTJzMnNxZXBzdmF2ZHNmMnp4NTV6c3pmZndhZSIgdGltZXN0YW1wPSIxNzgwMTYzMjMxIj4x
+OTwva2V5PjwvZm9yZWlnbi1rZXlzPjxyZWYtdHlwZSBuYW1lPSJKb3VybmFsIEFydGljbGUiPjE3
+PC9yZWYtdHlwZT48Y29udHJpYnV0b3JzPjxhdXRob3JzPjxhdXRob3I+WmhhbmcsIExpYW5nPC9h
+dXRob3I+PGF1dGhvcj5MdSwgRmVpeXVlPC9hdXRob3I+PGF1dGhvcj5UYW8sIEd1YW5ob25nPC9h
+dXRob3I+PGF1dGhvcj5MaSwgTWVuZ21lbmc8L2F1dGhvcj48YXV0aG9yPllhbmcsIFpoZW48L2F1
+dGhvcj48YXV0aG9yPldhbmcsIEFpcnU8L2F1dGhvcj48YXV0aG9yPlpodSwgV2VpPC9hdXRob3I+
+PGF1dGhvcj5DYW8sIFl1PC9hdXRob3I+PGF1dGhvcj5KaW4sIFlpemhlbmc8L2F1dGhvcj48YXV0
+aG9yPlpodSwgTGluPC9hdXRob3I+PGF1dGhvcj5IdWFuZywgV2VpPC9hdXRob3I+PGF1dGhvcj5X
+YW5nLCBKaWFucHU8L2F1dGhvcj48L2F1dGhvcnM+PC9jb250cmlidXRvcnM+PHRpdGxlcz48dGl0
+bGU+UHJlZGljdGlvbiBvZiBPcGVyYXRpb25hbCBMaWZldGltZSBvZiBQZXJvdnNraXRlIExpZ2h0
+IEVtaXR0aW5nIERpb2RlcyBieSBNYWNoaW5lIExlYXJuaW5nPC90aXRsZT48L3RpdGxlcz48cGFn
+ZXM+MjMwMDc3MjwvcGFnZXM+PHZvbHVtZT42PC92b2x1bWU+PG51bWJlcj42PC9udW1iZXI+PGRh
+dGVzPjx5ZWFyPjIwMjQ8L3llYXI+PC9kYXRlcz48aXNibj4yNjQwLTQ1Njc8L2lzYm4+PHVybHM+
+PHJlbGF0ZWQtdXJscz48dXJsPmh0dHBzOi8vYWR2YW5jZWQub25saW5lbGlicmFyeS53aWxleS5j
+b20vZG9pL2Ficy8xMC4xMDAyL2Fpc3kuMjAyMzAwNzcyPC91cmw+PC9yZWxhdGVkLXVybHM+PC91
+cmxzPjxlbGVjdHJvbmljLXJlc291cmNlLW51bT5odHRwczovL2RvaS5vcmcvMTAuMTAwMi9haXN5
+LjIwMjMwMDc3MjwvZWxlY3Ryb25pYy1yZXNvdXJjZS1udW0+PC9yZWNvcmQ+PC9DaXRlPjxDaXRl
+PjxBdXRob3I+V2FuZzwvQXV0aG9yPjxZZWFyPjIwMjU8L1llYXI+PFJlY051bT45PC9SZWNOdW0+
+PHJlY29yZD48cmVjLW51bWJlcj45PC9yZWMtbnVtYmVyPjxmb3JlaWduLWtleXM+PGtleSBhcHA9
+IkVOIiBkYi1pZD0idzl3cGV3OXJhMnMyc3FlcHN2YXZkc2Yyeng1NXpzemZmd2FlIiB0aW1lc3Rh
+bXA9IjE3Nzk2MjQ2ODgiPjk8L2tleT48L2ZvcmVpZ24ta2V5cz48cmVmLXR5cGUgbmFtZT0iSm91
+cm5hbCBBcnRpY2xlIj4xNzwvcmVmLXR5cGU+PGNvbnRyaWJ1dG9ycz48YXV0aG9ycz48YXV0aG9y
+PldhbmcsIFNoaXlhbjwvYXV0aG9yPjxhdXRob3I+TGl1LCBDaGFvcGVuZzwvYXV0aG9yPjxhdXRo
+b3I+SGFvLCBXZWl5YW88L2F1dGhvcj48YXV0aG9yPlpodWFuZywgWWFubGluZzwvYXV0aG9yPjxh
+dXRob3I+Wmh1LCBYaWFuanVuPC9hdXRob3I+PGF1dGhvcj5XYW5nLCBMb25nbHU8L2F1dGhvcj48
+YXV0aG9yPk5pdSwgWGlhbmdob25nPC9hdXRob3I+PGF1dGhvcj5MaXUsIFNodWp1YW48L2F1dGhv
+cj48YXV0aG9yPkNoZW4sIEJpbmc8L2F1dGhvcj48YXV0aG9yPlpoYW8sIFFpYW5nPC9hdXRob3I+
+PC9hdXRob3JzPjwvY29udHJpYnV0b3JzPjx0aXRsZXM+PHRpdGxlPkZyb20gRm9ybWFiaWxpdHkg
+dG8gQmFuZGdhcDogTWFjaGluZSBMZWFybmluZyBBY2NlbGVyYXRlcyB0aGUgRGlzY292ZXJ5IGFu
+ZCBBcHBsaWNhdGlvbiBvZiBQZXJvdnNraXRlIE1hdGVyaWFsczwvdGl0bGU+PHNlY29uZGFyeS10
+aXRsZT5BQ1MgTmFubzwvc2Vjb25kYXJ5LXRpdGxlPjwvdGl0bGVzPjxwZXJpb2RpY2FsPjxmdWxs
+LXRpdGxlPkFDUyBOYW5vPC9mdWxsLXRpdGxlPjwvcGVyaW9kaWNhbD48cGFnZXM+MjkwNDktMjkw
+NzI8L3BhZ2VzPjx2b2x1bWU+MTk8L3ZvbHVtZT48bnVtYmVyPjMyPC9udW1iZXI+PGRhdGVzPjx5
+ZWFyPjIwMjU8L3llYXI+PHB1Yi1kYXRlcz48ZGF0ZT4yMDI1LzA4LzE5PC9kYXRlPjwvcHViLWRh
+dGVzPjwvZGF0ZXM+PHB1Ymxpc2hlcj5BbWVyaWNhbiBDaGVtaWNhbCBTb2NpZXR5PC9wdWJsaXNo
+ZXI+PGlzYm4+MTkzNi0wODUxPC9pc2JuPjx1cmxzPjxyZWxhdGVkLXVybHM+PHVybD5odHRwczov
+L2RvaS5vcmcvMTAuMTAyMS9hY3NuYW5vLjVjMDc0OTQ8L3VybD48L3JlbGF0ZWQtdXJscz48L3Vy
+bHM+PGVsZWN0cm9uaWMtcmVzb3VyY2UtbnVtPjEwLjEwMjEvYWNzbmFuby41YzA3NDk0PC9lbGVj
+dHJvbmljLXJlc291cmNlLW51bT48L3JlY29yZD48L0NpdGU+PENpdGU+PEF1dGhvcj5HaG9kZXN3
+YXI8L0F1dGhvcj48WWVhcj4yMDI1PC9ZZWFyPjxSZWNOdW0+MjE8L1JlY051bT48cmVjb3JkPjxy
+ZWMtbnVtYmVyPjIxPC9yZWMtbnVtYmVyPjxmb3JlaWduLWtleXM+PGtleSBhcHA9IkVOIiBkYi1p
+ZD0idzl3cGV3OXJhMnMyc3FlcHN2YXZkc2Yyeng1NXpzemZmd2FlIiB0aW1lc3RhbXA9IjE3ODAx
+NjM1NTIiPjIxPC9rZXk+PC9mb3JlaWduLWtleXM+PHJlZi10eXBlIG5hbWU9IkpvdXJuYWwgQXJ0
+aWNsZSI+MTc8L3JlZi10eXBlPjxjb250cmlidXRvcnM+PGF1dGhvcnM+PGF1dGhvcj5HaG9kZXN3
+YXIsIFVqd2FsYSBTLjwvYXV0aG9yPjxhdXRob3I+QmFscGFuZGUsIFJ1cGFsaSBTLjwvYXV0aG9y
+PjxhdXRob3I+UmF1dCwgVmFpc2hhbGkgUC48L2F1dGhvcj48YXV0aG9yPldhamUsIE1hbmlzaGEg
+Ry48L2F1dGhvcj48YXV0aG9yPlBldGhlLCBZb2dpbmVlIFMuPC9hdXRob3I+PGF1dGhvcj5TaGVs
+a2UsIE5pbGVzaDwvYXV0aG9yPjxhdXRob3I+SXNsZWVtLCBIYXl0aGFtIEYuPC9hdXRob3I+PGF1
+dGhvcj5WYWlyYWdhZGUsIFZpa3JhbnQgUy48L2F1dGhvcj48L2F1dGhvcnM+PC9jb250cmlidXRv
+cnM+PHRpdGxlcz48dGl0bGU+VGhlIG9wdGltaXphdGlvbiBvZiBkZXNpZ24gYW5kIHBlcmZvcm1h
+bmNlIGluIGh5YnJpZCBvcmdhbmljL2lub3JnYW5pYyBMRURzIHRvd2FyZCBuZXh0LWdlbmVyYXRp
+b24gaGlnaC1lZmZpY2llbmN5IExFRHM6IGFwcGxpY2F0aW9uIG9mIG11bHRpLW1vZGVsIGh5YnJp
+ZCBtYWNoaW5lIGxlYXJuaW5nIGFwcHJvYWNoPC90aXRsZT48c2Vjb25kYXJ5LXRpdGxlPkpvdXJu
+YWwgb2YgQ29tcHV0YXRpb25hbCBFbGVjdHJvbmljczwvc2Vjb25kYXJ5LXRpdGxlPjwvdGl0bGVz
+PjxwZXJpb2RpY2FsPjxmdWxsLXRpdGxlPkpvdXJuYWwgb2YgQ29tcHV0YXRpb25hbCBFbGVjdHJv
+bmljczwvZnVsbC10aXRsZT48L3BlcmlvZGljYWw+PHBhZ2VzPjkyPC9wYWdlcz48dm9sdW1lPjI0
+PC92b2x1bWU+PG51bWJlcj4zPC9udW1iZXI+PGRhdGVzPjx5ZWFyPjIwMjU8L3llYXI+PHB1Yi1k
+YXRlcz48ZGF0ZT4yMDI1LzA1LzE0PC9kYXRlPjwvcHViLWRhdGVzPjwvZGF0ZXM+PGlzYm4+MTU3
+Mi04MTM3PC9pc2JuPjx1cmxzPjxyZWxhdGVkLXVybHM+PHVybD5odHRwczovL2RvaS5vcmcvMTAu
+MTAwNy9zMTA4MjUtMDI1LTAyMzI5LXk8L3VybD48L3JlbGF0ZWQtdXJscz48L3VybHM+PGVsZWN0
+cm9uaWMtcmVzb3VyY2UtbnVtPjEwLjEwMDcvczEwODI1LTAyNS0wMjMyOS15PC9lbGVjdHJvbmlj
+LXJlc291cmNlLW51bT48L3JlY29yZD48L0NpdGU+PC9FbmROb3RlPn==
 </w:fldData>
         </w:fldChar>
       </w:r>
@@ -2059,7 +2211,7 @@
           <w:rFonts w:ascii="Times New Roman" w:hAnsi="Times New Roman" w:cs="Times New Roman"/>
           <w:noProof/>
         </w:rPr>
-        <w:t>[13, 15-17]</w:t>
+        <w:t>[17-20]</w:t>
       </w:r>
       <w:r>
         <w:rPr>
@@ -2115,13 +2267,19 @@
         <w:rPr>
           <w:rFonts w:ascii="Times New Roman" w:hAnsi="Times New Roman" w:cs="Times New Roman"/>
         </w:rPr>
-        <w:t>To date, there are very few ML-based reports available that are focused on quasi-2D perovskites’</w:t>
-      </w:r>
-      <w:r>
-        <w:rPr>
-          <w:rFonts w:ascii="Times New Roman" w:hAnsi="Times New Roman" w:cs="Times New Roman"/>
-        </w:rPr>
-        <w:t xml:space="preserve"> emission and LEDs. </w:t>
+        <w:t xml:space="preserve">To date, there are very few ML-based reports </w:t>
+      </w:r>
+      <w:r>
+        <w:rPr>
+          <w:rFonts w:ascii="Times New Roman" w:hAnsi="Times New Roman" w:cs="Times New Roman"/>
+        </w:rPr>
+        <w:t>focused on the emission of quasi-2D perovskites</w:t>
+      </w:r>
+      <w:r>
+        <w:rPr>
+          <w:rFonts w:ascii="Times New Roman" w:hAnsi="Times New Roman" w:cs="Times New Roman"/>
+        </w:rPr>
+        <w:t xml:space="preserve"> and LEDs. </w:t>
       </w:r>
       <w:r>
         <w:rPr>
@@ -2229,7 +2387,7 @@
         <w:rPr>
           <w:rFonts w:ascii="Times New Roman" w:hAnsi="Times New Roman" w:cs="Times New Roman"/>
         </w:rPr>
-        <w:instrText xml:space="preserve"> ADDIN EN.CITE &lt;EndNote&gt;&lt;Cite&gt;&lt;Author&gt;Wang&lt;/Author&gt;&lt;Year&gt;2022&lt;/Year&gt;&lt;RecNum&gt;12&lt;/RecNum&gt;&lt;DisplayText&gt;[18]&lt;/DisplayText&gt;&lt;record&gt;&lt;rec-number&gt;12&lt;/rec-number&gt;&lt;foreign-keys&gt;&lt;key app="EN" db-id="w9wpew9ra2s2sqepsvavdsf2zx55zszffwae" timestamp="1779626659"&gt;12&lt;/key&gt;&lt;/foreign-keys&gt;&lt;ref-type name="Journal Article"&gt;17&lt;/ref-type&gt;&lt;contributors&gt;&lt;authors&gt;&lt;author&gt;Wang, Wei&lt;/author&gt;&lt;author&gt;Li, Yueqiao&lt;/author&gt;&lt;author&gt;Zou, Ang&lt;/author&gt;&lt;author&gt;Shi, Haochen&lt;/author&gt;&lt;author&gt;Huang, Xiaofeng&lt;/author&gt;&lt;author&gt;Li, Yaoyao&lt;/author&gt;&lt;author&gt;Wei, Dong&lt;/author&gt;&lt;author&gt;Qiao, Bo&lt;/author&gt;&lt;author&gt;Zhao, Suling&lt;/author&gt;&lt;author&gt;Xu, Zheng&lt;/author&gt;&lt;author&gt;Song, Dandan&lt;/author&gt;&lt;/authors&gt;&lt;/contributors&gt;&lt;titles&gt;&lt;title&gt;Predicting the photon energy of quasi-2D lead halide perovskites from the precursor composition through machine learning&lt;/title&gt;&lt;secondary-title&gt;Nanoscale Advances&lt;/secondary-title&gt;&lt;/titles&gt;&lt;periodical&gt;&lt;full-title&gt;Nanoscale Advances&lt;/full-title&gt;&lt;/periodical&gt;&lt;pages&gt;1632-1638&lt;/pages&gt;&lt;volume&gt;4&lt;/volume&gt;&lt;number&gt;6&lt;/number&gt;&lt;dates&gt;&lt;year&gt;2022&lt;/year&gt;&lt;/dates&gt;&lt;publisher&gt;RSC&lt;/publisher&gt;&lt;work-type&gt;10.1039/D2NA00052K&lt;/work-type&gt;&lt;urls&gt;&lt;related-urls&gt;&lt;url&gt;http://dx.doi.org/10.1039/D2NA00052K&lt;/url&gt;&lt;/related-urls&gt;&lt;/urls&gt;&lt;electronic-resource-num&gt;10.1039/D2NA00052K&lt;/electronic-resource-num&gt;&lt;/record&gt;&lt;/Cite&gt;&lt;/EndNote&gt;</w:instrText>
+        <w:instrText xml:space="preserve"> ADDIN EN.CITE &lt;EndNote&gt;&lt;Cite&gt;&lt;Author&gt;Wang&lt;/Author&gt;&lt;Year&gt;2022&lt;/Year&gt;&lt;RecNum&gt;12&lt;/RecNum&gt;&lt;DisplayText&gt;[21]&lt;/DisplayText&gt;&lt;record&gt;&lt;rec-number&gt;12&lt;/rec-number&gt;&lt;foreign-keys&gt;&lt;key app="EN" db-id="w9wpew9ra2s2sqepsvavdsf2zx55zszffwae" timestamp="1779626659"&gt;12&lt;/key&gt;&lt;/foreign-keys&gt;&lt;ref-type name="Journal Article"&gt;17&lt;/ref-type&gt;&lt;contributors&gt;&lt;authors&gt;&lt;author&gt;Wang, Wei&lt;/author&gt;&lt;author&gt;Li, Yueqiao&lt;/author&gt;&lt;author&gt;Zou, Ang&lt;/author&gt;&lt;author&gt;Shi, Haochen&lt;/author&gt;&lt;author&gt;Huang, Xiaofeng&lt;/author&gt;&lt;author&gt;Li, Yaoyao&lt;/author&gt;&lt;author&gt;Wei, Dong&lt;/author&gt;&lt;author&gt;Qiao, Bo&lt;/author&gt;&lt;author&gt;Zhao, Suling&lt;/author&gt;&lt;author&gt;Xu, Zheng&lt;/author&gt;&lt;author&gt;Song, Dandan&lt;/author&gt;&lt;/authors&gt;&lt;/contributors&gt;&lt;titles&gt;&lt;title&gt;Predicting the photon energy of quasi-2D lead halide perovskites from the precursor composition through machine learning&lt;/title&gt;&lt;secondary-title&gt;Nanoscale Advances&lt;/secondary-title&gt;&lt;/titles&gt;&lt;periodical&gt;&lt;full-title&gt;Nanoscale Advances&lt;/full-title&gt;&lt;/periodical&gt;&lt;pages&gt;1632-1638&lt;/pages&gt;&lt;volume&gt;4&lt;/volume&gt;&lt;number&gt;6&lt;/number&gt;&lt;dates&gt;&lt;year&gt;2022&lt;/year&gt;&lt;/dates&gt;&lt;publisher&gt;RSC&lt;/publisher&gt;&lt;work-type&gt;10.1039/D2NA00052K&lt;/work-type&gt;&lt;urls&gt;&lt;related-urls&gt;&lt;url&gt;http://dx.doi.org/10.1039/D2NA00052K&lt;/url&gt;&lt;/related-urls&gt;&lt;/urls&gt;&lt;electronic-resource-num&gt;10.1039/D2NA00052K&lt;/electronic-resource-num&gt;&lt;/record&gt;&lt;/Cite&gt;&lt;/EndNote&gt;</w:instrText>
       </w:r>
       <w:r>
         <w:rPr>
@@ -2242,7 +2400,7 @@
           <w:rFonts w:ascii="Times New Roman" w:hAnsi="Times New Roman" w:cs="Times New Roman"/>
           <w:noProof/>
         </w:rPr>
-        <w:t>[18]</w:t>
+        <w:t>[21]</w:t>
       </w:r>
       <w:r>
         <w:rPr>
@@ -2298,7 +2456,7 @@
         <w:rPr>
           <w:rFonts w:ascii="Times New Roman" w:hAnsi="Times New Roman" w:cs="Times New Roman"/>
         </w:rPr>
-        <w:instrText xml:space="preserve"> ADDIN EN.CITE &lt;EndNote&gt;&lt;Cite&gt;&lt;Author&gt;Zhang&lt;/Author&gt;&lt;Year&gt;2022&lt;/Year&gt;&lt;RecNum&gt;13&lt;/RecNum&gt;&lt;DisplayText&gt;[19]&lt;/DisplayText&gt;&lt;record&gt;&lt;rec-number&gt;13&lt;/rec-number&gt;&lt;foreign-keys&gt;&lt;key app="EN" db-id="w9wpew9ra2s2sqepsvavdsf2zx55zszffwae" timestamp="1779626869"&gt;13&lt;/key&gt;&lt;/foreign-keys&gt;&lt;ref-type name="Journal Article"&gt;17&lt;/ref-type&gt;&lt;contributors&gt;&lt;authors&gt;&lt;author&gt;Zhang, Liang&lt;/author&gt;&lt;author&gt;Li, Na&lt;/author&gt;&lt;author&gt;Liu, Dawei&lt;/author&gt;&lt;author&gt;Tao, Guanhong&lt;/author&gt;&lt;author&gt;Xu, Weidong&lt;/author&gt;&lt;author&gt;Li, Mengmeng&lt;/author&gt;&lt;author&gt;Chu, Ying&lt;/author&gt;&lt;author&gt;Cao, Chensi&lt;/author&gt;&lt;author&gt;Lu, Feiyue&lt;/author&gt;&lt;author&gt;Hao, Chenjie&lt;/author&gt;&lt;author&gt;Zhang, Ju&lt;/author&gt;&lt;author&gt;Cao, Yu&lt;/author&gt;&lt;author&gt;Gao, Feng&lt;/author&gt;&lt;author&gt;Wang, Nana&lt;/author&gt;&lt;author&gt;Zhu, Lin&lt;/author&gt;&lt;author&gt;Huang, Wei&lt;/author&gt;&lt;author&gt;Wang, Jianpu&lt;/author&gt;&lt;/authors&gt;&lt;/contributors&gt;&lt;titles&gt;&lt;title&gt;Deep Learning for Additive Screening in Perovskite Light-Emitting Diodes&lt;/title&gt;&lt;/titles&gt;&lt;pages&gt;e202209337&lt;/pages&gt;&lt;volume&gt;61&lt;/volume&gt;&lt;number&gt;37&lt;/number&gt;&lt;dates&gt;&lt;year&gt;2022&lt;/year&gt;&lt;/dates&gt;&lt;isbn&gt;1433-7851&lt;/isbn&gt;&lt;urls&gt;&lt;related-urls&gt;&lt;url&gt;https://onlinelibrary.wiley.com/doi/abs/10.1002/anie.202209337&lt;/url&gt;&lt;/related-urls&gt;&lt;/urls&gt;&lt;electronic-resource-num&gt;https://doi.org/10.1002/anie.202209337&lt;/electronic-resource-num&gt;&lt;/record&gt;&lt;/Cite&gt;&lt;/EndNote&gt;</w:instrText>
+        <w:instrText xml:space="preserve"> ADDIN EN.CITE &lt;EndNote&gt;&lt;Cite&gt;&lt;Author&gt;Zhang&lt;/Author&gt;&lt;Year&gt;2022&lt;/Year&gt;&lt;RecNum&gt;13&lt;/RecNum&gt;&lt;DisplayText&gt;[22]&lt;/DisplayText&gt;&lt;record&gt;&lt;rec-number&gt;13&lt;/rec-number&gt;&lt;foreign-keys&gt;&lt;key app="EN" db-id="w9wpew9ra2s2sqepsvavdsf2zx55zszffwae" timestamp="1779626869"&gt;13&lt;/key&gt;&lt;/foreign-keys&gt;&lt;ref-type name="Journal Article"&gt;17&lt;/ref-type&gt;&lt;contributors&gt;&lt;authors&gt;&lt;author&gt;Zhang, Liang&lt;/author&gt;&lt;author&gt;Li, Na&lt;/author&gt;&lt;author&gt;Liu, Dawei&lt;/author&gt;&lt;author&gt;Tao, Guanhong&lt;/author&gt;&lt;author&gt;Xu, Weidong&lt;/author&gt;&lt;author&gt;Li, Mengmeng&lt;/author&gt;&lt;author&gt;Chu, Ying&lt;/author&gt;&lt;author&gt;Cao, Chensi&lt;/author&gt;&lt;author&gt;Lu, Feiyue&lt;/author&gt;&lt;author&gt;Hao, Chenjie&lt;/author&gt;&lt;author&gt;Zhang, Ju&lt;/author&gt;&lt;author&gt;Cao, Yu&lt;/author&gt;&lt;author&gt;Gao, Feng&lt;/author&gt;&lt;author&gt;Wang, Nana&lt;/author&gt;&lt;author&gt;Zhu, Lin&lt;/author&gt;&lt;author&gt;Huang, Wei&lt;/author&gt;&lt;author&gt;Wang, Jianpu&lt;/author&gt;&lt;/authors&gt;&lt;/contributors&gt;&lt;titles&gt;&lt;title&gt;Deep Learning for Additive Screening in Perovskite Light-Emitting Diodes&lt;/title&gt;&lt;/titles&gt;&lt;pages&gt;e202209337&lt;/pages&gt;&lt;volume&gt;61&lt;/volume&gt;&lt;number&gt;37&lt;/number&gt;&lt;dates&gt;&lt;year&gt;2022&lt;/year&gt;&lt;/dates&gt;&lt;isbn&gt;1433-7851&lt;/isbn&gt;&lt;urls&gt;&lt;related-urls&gt;&lt;url&gt;https://onlinelibrary.wiley.com/doi/abs/10.1002/anie.202209337&lt;/url&gt;&lt;/related-urls&gt;&lt;/urls&gt;&lt;electronic-resource-num&gt;https://doi.org/10.1002/anie.202209337&lt;/electronic-resource-num&gt;&lt;/record&gt;&lt;/Cite&gt;&lt;/EndNote&gt;</w:instrText>
       </w:r>
       <w:r>
         <w:rPr>
@@ -2311,7 +2469,7 @@
           <w:rFonts w:ascii="Times New Roman" w:hAnsi="Times New Roman" w:cs="Times New Roman"/>
           <w:noProof/>
         </w:rPr>
-        <w:t>[19]</w:t>
+        <w:t>[22]</w:t>
       </w:r>
       <w:r>
         <w:rPr>
@@ -2371,32 +2529,32 @@
         <w:rPr>
           <w:rFonts w:ascii="Times New Roman" w:hAnsi="Times New Roman" w:cs="Times New Roman"/>
         </w:rPr>
-        <w:t>confined to a</w:t>
-      </w:r>
-      <w:r>
-        <w:rPr>
-          <w:rFonts w:ascii="Times New Roman" w:hAnsi="Times New Roman" w:cs="Times New Roman"/>
-        </w:rPr>
-        <w:t xml:space="preserve"> narrow spectral window (for example green or blue Br/Cl systems) or a reduced feature set based solely on precursor ion ratios</w:t>
-      </w:r>
-      <w:r>
-        <w:rPr>
-          <w:rFonts w:ascii="Times New Roman" w:hAnsi="Times New Roman" w:cs="Times New Roman"/>
-        </w:rPr>
-        <w:t xml:space="preserve"> limited to single organic ligand systems, </w:t>
-      </w:r>
-      <w:r>
-        <w:rPr>
-          <w:rFonts w:ascii="Times New Roman" w:hAnsi="Times New Roman" w:cs="Times New Roman"/>
-        </w:rPr>
-        <w:t xml:space="preserve">without explicitly encoding primary and secondary organic spacer </w:t>
+        <w:t>are confined to a narrow spectral window (for example,</w:t>
+      </w:r>
+      <w:r>
+        <w:rPr>
+          <w:rFonts w:ascii="Times New Roman" w:hAnsi="Times New Roman" w:cs="Times New Roman"/>
+        </w:rPr>
+        <w:t xml:space="preserve"> green or blue Br/Cl systems) or a reduced feature set based solely on precursor ion ratios</w:t>
+      </w:r>
+      <w:r>
+        <w:rPr>
+          <w:rFonts w:ascii="Times New Roman" w:hAnsi="Times New Roman" w:cs="Times New Roman"/>
+        </w:rPr>
+        <w:t xml:space="preserve"> limited to </w:t>
       </w:r>
       <w:r>
         <w:rPr>
           <w:rFonts w:ascii="Times New Roman" w:hAnsi="Times New Roman" w:cs="Times New Roman"/>
         </w:rPr>
         <w:lastRenderedPageBreak/>
-        <w:t>structures through cheminformatics descriptors.</w:t>
+        <w:t xml:space="preserve">single organic ligand systems, </w:t>
+      </w:r>
+      <w:r>
+        <w:rPr>
+          <w:rFonts w:ascii="Times New Roman" w:hAnsi="Times New Roman" w:cs="Times New Roman"/>
+        </w:rPr>
+        <w:t>without explicitly encoding primary and secondary organic spacer structures through cheminformatics descriptors.</w:t>
       </w:r>
       <w:r>
         <w:rPr>
@@ -2408,37 +2566,13 @@
         <w:rPr>
           <w:rFonts w:ascii="Times New Roman" w:hAnsi="Times New Roman" w:cs="Times New Roman"/>
         </w:rPr>
-        <w:t>if</w:t>
-      </w:r>
-      <w:r>
-        <w:rPr>
-          <w:rFonts w:ascii="Times New Roman" w:hAnsi="Times New Roman" w:cs="Times New Roman"/>
-        </w:rPr>
-        <w:t xml:space="preserve"> external quantum efficiency (EQE) </w:t>
-      </w:r>
-      <w:r>
-        <w:rPr>
-          <w:rFonts w:ascii="Times New Roman" w:hAnsi="Times New Roman" w:cs="Times New Roman"/>
-        </w:rPr>
-        <w:t xml:space="preserve">can </w:t>
-      </w:r>
-      <w:r>
-        <w:rPr>
-          <w:rFonts w:ascii="Times New Roman" w:hAnsi="Times New Roman" w:cs="Times New Roman"/>
-        </w:rPr>
-        <w:t>be predicted with comparable confidence</w:t>
-      </w:r>
-      <w:r>
-        <w:rPr>
-          <w:rFonts w:ascii="Times New Roman" w:hAnsi="Times New Roman" w:cs="Times New Roman"/>
-        </w:rPr>
-        <w:t xml:space="preserve"> </w:t>
-      </w:r>
-      <w:r>
-        <w:rPr>
-          <w:rFonts w:ascii="Times New Roman" w:hAnsi="Times New Roman" w:cs="Times New Roman"/>
-        </w:rPr>
-        <w:t xml:space="preserve">with the literature data available </w:t>
+        <w:t>whether external quantum efficiency (EQE) can be predicted with comparable confidence to</w:t>
+      </w:r>
+      <w:r>
+        <w:rPr>
+          <w:rFonts w:ascii="Times New Roman" w:hAnsi="Times New Roman" w:cs="Times New Roman"/>
+        </w:rPr>
+        <w:t xml:space="preserve"> the literature data available </w:t>
       </w:r>
       <w:r>
         <w:rPr>
@@ -2604,7 +2738,31 @@
         <w:rPr>
           <w:rFonts w:ascii="Times New Roman" w:hAnsi="Times New Roman" w:cs="Times New Roman"/>
         </w:rPr>
-        <w:t xml:space="preserve"> Herein, we built three sets of ML models, two targeting emission energy</w:t>
+        <w:t xml:space="preserve"> Herein, we built </w:t>
+      </w:r>
+      <w:r>
+        <w:rPr>
+          <w:rFonts w:ascii="Times New Roman" w:hAnsi="Times New Roman" w:cs="Times New Roman"/>
+        </w:rPr>
+        <w:t>two primary</w:t>
+      </w:r>
+      <w:r>
+        <w:rPr>
+          <w:rFonts w:ascii="Times New Roman" w:hAnsi="Times New Roman" w:cs="Times New Roman"/>
+        </w:rPr>
+        <w:t xml:space="preserve"> sets of ML models</w:t>
+      </w:r>
+      <w:r>
+        <w:rPr>
+          <w:rFonts w:ascii="Times New Roman" w:hAnsi="Times New Roman" w:cs="Times New Roman"/>
+        </w:rPr>
+        <w:t>: one targeting emission energy (eV) or wavelength (nm) forecasts, which are material’s intrinsic properties, and the other targeting EQE, which is a device-based metric</w:t>
+      </w:r>
+      <w:r>
+        <w:rPr>
+          <w:rFonts w:ascii="Times New Roman" w:hAnsi="Times New Roman" w:cs="Times New Roman"/>
+        </w:rPr>
+        <w:t>.</w:t>
       </w:r>
       <w:r>
         <w:rPr>
@@ -2616,7 +2774,43 @@
         <w:rPr>
           <w:rFonts w:ascii="Times New Roman" w:hAnsi="Times New Roman" w:cs="Times New Roman"/>
         </w:rPr>
-        <w:t>(eV) and wavelength</w:t>
+        <w:t xml:space="preserve">After </w:t>
+      </w:r>
+      <w:r>
+        <w:rPr>
+          <w:rFonts w:ascii="Times New Roman" w:hAnsi="Times New Roman" w:cs="Times New Roman"/>
+        </w:rPr>
+        <w:t xml:space="preserve">preparing the </w:t>
+      </w:r>
+      <w:r>
+        <w:rPr>
+          <w:rFonts w:ascii="Times New Roman" w:hAnsi="Times New Roman" w:cs="Times New Roman"/>
+        </w:rPr>
+        <w:t xml:space="preserve">first version of the </w:t>
+      </w:r>
+      <w:r>
+        <w:rPr>
+          <w:rFonts w:ascii="Times New Roman" w:hAnsi="Times New Roman" w:cs="Times New Roman"/>
+        </w:rPr>
+        <w:t>dataset, we performed</w:t>
+      </w:r>
+      <w:r>
+        <w:rPr>
+          <w:rFonts w:ascii="Times New Roman" w:hAnsi="Times New Roman" w:cs="Times New Roman"/>
+        </w:rPr>
+        <w:t xml:space="preserve"> initial cleanup and formatting in the </w:t>
+      </w:r>
+      <w:r>
+        <w:rPr>
+          <w:rFonts w:ascii="Times New Roman" w:hAnsi="Times New Roman" w:cs="Times New Roman"/>
+        </w:rPr>
+        <w:t>Snowflake data warehouse (Enterprise data warehouse) using Structured Query Language (SQL). Datasets are available on the GitHub account for reference</w:t>
+      </w:r>
+      <w:r>
+        <w:rPr>
+          <w:rFonts w:ascii="Times New Roman" w:hAnsi="Times New Roman" w:cs="Times New Roman"/>
+        </w:rPr>
+        <w:t>.</w:t>
       </w:r>
       <w:r>
         <w:rPr>
@@ -2628,25 +2822,151 @@
         <w:rPr>
           <w:rFonts w:ascii="Times New Roman" w:hAnsi="Times New Roman" w:cs="Times New Roman"/>
         </w:rPr>
+        <w:t xml:space="preserve"> </w:t>
+      </w:r>
+      <w:r>
+        <w:rPr>
+          <w:rFonts w:ascii="Times New Roman" w:hAnsi="Times New Roman" w:cs="Times New Roman"/>
+        </w:rPr>
+        <w:t>Thereafter</w:t>
+      </w:r>
+      <w:r>
+        <w:rPr>
+          <w:rFonts w:ascii="Times New Roman" w:hAnsi="Times New Roman" w:cs="Times New Roman"/>
+        </w:rPr>
+        <w:t>, on top of the resulting dataset in Snowflake, the remaining data engineering operations were performed in Python (</w:t>
+      </w:r>
+      <w:proofErr w:type="spellStart"/>
+      <w:r>
+        <w:rPr>
+          <w:rFonts w:ascii="Times New Roman" w:hAnsi="Times New Roman" w:cs="Times New Roman"/>
+        </w:rPr>
+        <w:t>Jupyter</w:t>
+      </w:r>
+      <w:proofErr w:type="spellEnd"/>
+      <w:r>
+        <w:rPr>
+          <w:rFonts w:ascii="Times New Roman" w:hAnsi="Times New Roman" w:cs="Times New Roman"/>
+        </w:rPr>
+        <w:t xml:space="preserve"> Notebook) using the </w:t>
+      </w:r>
+      <w:proofErr w:type="gramStart"/>
+      <w:r>
+        <w:rPr>
+          <w:rFonts w:ascii="Times New Roman" w:hAnsi="Times New Roman" w:cs="Times New Roman"/>
+        </w:rPr>
+        <w:t>pandas</w:t>
+      </w:r>
+      <w:proofErr w:type="gramEnd"/>
+      <w:r>
+        <w:rPr>
+          <w:rFonts w:ascii="Times New Roman" w:hAnsi="Times New Roman" w:cs="Times New Roman"/>
+        </w:rPr>
+        <w:t xml:space="preserve"> library and</w:t>
+      </w:r>
+      <w:r>
+        <w:rPr>
+          <w:rFonts w:ascii="Times New Roman" w:hAnsi="Times New Roman" w:cs="Times New Roman"/>
+        </w:rPr>
+        <w:t xml:space="preserve"> </w:t>
+      </w:r>
+      <w:proofErr w:type="spellStart"/>
+      <w:r>
+        <w:rPr>
+          <w:rFonts w:ascii="Times New Roman" w:hAnsi="Times New Roman" w:cs="Times New Roman"/>
+        </w:rPr>
+        <w:t>dataframes</w:t>
+      </w:r>
+      <w:proofErr w:type="spellEnd"/>
+      <w:r>
+        <w:rPr>
+          <w:rFonts w:ascii="Times New Roman" w:hAnsi="Times New Roman" w:cs="Times New Roman"/>
+        </w:rPr>
+        <w:t>.</w:t>
+      </w:r>
+      <w:r>
+        <w:rPr>
+          <w:rFonts w:ascii="Times New Roman" w:hAnsi="Times New Roman" w:cs="Times New Roman"/>
+        </w:rPr>
+        <w:t xml:space="preserve"> </w:t>
+      </w:r>
+      <w:r>
+        <w:rPr>
+          <w:rFonts w:ascii="Times New Roman" w:hAnsi="Times New Roman" w:cs="Times New Roman"/>
+        </w:rPr>
+        <w:t xml:space="preserve">Thereafter, </w:t>
+      </w:r>
+      <w:r>
+        <w:rPr>
+          <w:rFonts w:ascii="Times New Roman" w:hAnsi="Times New Roman" w:cs="Times New Roman"/>
+        </w:rPr>
+        <w:t xml:space="preserve">Simplified Molecular Input Line Entry System </w:t>
+      </w:r>
+      <w:r>
+        <w:rPr>
+          <w:rFonts w:ascii="Times New Roman" w:hAnsi="Times New Roman" w:cs="Times New Roman"/>
+        </w:rPr>
         <w:t>(</w:t>
       </w:r>
       <w:r>
         <w:rPr>
           <w:rFonts w:ascii="Times New Roman" w:hAnsi="Times New Roman" w:cs="Times New Roman"/>
         </w:rPr>
-        <w:t>nm</w:t>
-      </w:r>
-      <w:r>
-        <w:rPr>
-          <w:rFonts w:ascii="Times New Roman" w:hAnsi="Times New Roman" w:cs="Times New Roman"/>
-        </w:rPr>
-        <w:t>) forecast</w:t>
-      </w:r>
-      <w:r>
-        <w:rPr>
-          <w:rFonts w:ascii="Times New Roman" w:hAnsi="Times New Roman" w:cs="Times New Roman"/>
-        </w:rPr>
-        <w:t>, which are material’s intrinsic properties and the remaining one targeting EQE, which is device-based metrics</w:t>
+        <w:t>SMILES</w:t>
+      </w:r>
+      <w:r>
+        <w:rPr>
+          <w:rFonts w:ascii="Times New Roman" w:hAnsi="Times New Roman" w:cs="Times New Roman"/>
+        </w:rPr>
+        <w:t>)</w:t>
+      </w:r>
+      <w:r>
+        <w:rPr>
+          <w:rFonts w:ascii="Times New Roman" w:hAnsi="Times New Roman" w:cs="Times New Roman"/>
+        </w:rPr>
+        <w:t xml:space="preserve"> </w:t>
+      </w:r>
+      <w:r>
+        <w:rPr>
+          <w:rFonts w:ascii="Times New Roman" w:hAnsi="Times New Roman" w:cs="Times New Roman"/>
+        </w:rPr>
+        <w:t>strings</w:t>
+      </w:r>
+      <w:r>
+        <w:rPr>
+          <w:rFonts w:ascii="Times New Roman" w:hAnsi="Times New Roman" w:cs="Times New Roman"/>
+        </w:rPr>
+        <w:t xml:space="preserve"> were generated </w:t>
+      </w:r>
+      <w:r>
+        <w:rPr>
+          <w:rFonts w:ascii="Times New Roman" w:hAnsi="Times New Roman" w:cs="Times New Roman"/>
+        </w:rPr>
+        <w:t>programmatically</w:t>
+      </w:r>
+      <w:r>
+        <w:rPr>
+          <w:rFonts w:ascii="Times New Roman" w:hAnsi="Times New Roman" w:cs="Times New Roman"/>
+        </w:rPr>
+        <w:t xml:space="preserve"> for each organic ligand </w:t>
+      </w:r>
+      <w:r>
+        <w:rPr>
+          <w:rFonts w:ascii="Times New Roman" w:hAnsi="Times New Roman" w:cs="Times New Roman"/>
+        </w:rPr>
+        <w:t>from its IUPAC name using the</w:t>
+      </w:r>
+      <w:r>
+        <w:rPr>
+          <w:rFonts w:ascii="Times New Roman" w:hAnsi="Times New Roman" w:cs="Times New Roman"/>
+        </w:rPr>
+        <w:t xml:space="preserve"> </w:t>
+      </w:r>
+      <w:r>
+        <w:rPr>
+          <w:rFonts w:ascii="Times New Roman" w:hAnsi="Times New Roman" w:cs="Times New Roman"/>
+        </w:rPr>
+        <w:t>Chemical Identifier Resolver API hosted by the National Cancer Institute Computer-Aided Drug Design Group (nih.gov)</w:t>
       </w:r>
       <w:r>
         <w:rPr>
@@ -2664,31 +2984,152 @@
         <w:rPr>
           <w:rFonts w:ascii="Times New Roman" w:hAnsi="Times New Roman" w:cs="Times New Roman"/>
         </w:rPr>
+        <w:t>Then</w:t>
+      </w:r>
+      <w:r>
+        <w:rPr>
+          <w:rFonts w:ascii="Times New Roman" w:hAnsi="Times New Roman" w:cs="Times New Roman"/>
+        </w:rPr>
+        <w:t xml:space="preserve">, </w:t>
+      </w:r>
+      <w:r>
+        <w:rPr>
+          <w:rFonts w:ascii="Times New Roman" w:hAnsi="Times New Roman" w:cs="Times New Roman"/>
+        </w:rPr>
+        <w:t xml:space="preserve">two-dimensional </w:t>
+      </w:r>
+      <w:r>
+        <w:rPr>
+          <w:rFonts w:ascii="Times New Roman" w:hAnsi="Times New Roman" w:cs="Times New Roman"/>
+        </w:rPr>
+        <w:t xml:space="preserve">molecular </w:t>
+      </w:r>
+      <w:r>
+        <w:rPr>
+          <w:rFonts w:ascii="Times New Roman" w:hAnsi="Times New Roman" w:cs="Times New Roman"/>
+        </w:rPr>
+        <w:t>descriptors per spacer</w:t>
+      </w:r>
+      <w:r>
+        <w:rPr>
+          <w:rFonts w:ascii="Times New Roman" w:hAnsi="Times New Roman" w:cs="Times New Roman"/>
+        </w:rPr>
+        <w:t xml:space="preserve"> (Primary and secondary)</w:t>
+      </w:r>
+      <w:r>
+        <w:rPr>
+          <w:rFonts w:ascii="Times New Roman" w:hAnsi="Times New Roman" w:cs="Times New Roman"/>
+        </w:rPr>
+        <w:t xml:space="preserve"> </w:t>
+      </w:r>
+      <w:r>
+        <w:rPr>
+          <w:rFonts w:ascii="Times New Roman" w:hAnsi="Times New Roman" w:cs="Times New Roman"/>
+        </w:rPr>
+        <w:t xml:space="preserve">were generated using </w:t>
+      </w:r>
+      <w:proofErr w:type="spellStart"/>
+      <w:r>
+        <w:rPr>
+          <w:rFonts w:ascii="Times New Roman" w:hAnsi="Times New Roman" w:cs="Times New Roman"/>
+        </w:rPr>
+        <w:t>RDKit</w:t>
+      </w:r>
+      <w:proofErr w:type="spellEnd"/>
+      <w:r>
+        <w:rPr>
+          <w:rFonts w:ascii="Times New Roman" w:hAnsi="Times New Roman" w:cs="Times New Roman"/>
+        </w:rPr>
+        <w:t xml:space="preserve"> </w:t>
+      </w:r>
+      <w:r>
+        <w:rPr>
+          <w:rFonts w:ascii="Times New Roman" w:hAnsi="Times New Roman" w:cs="Times New Roman"/>
+        </w:rPr>
+        <w:t>library</w:t>
+      </w:r>
+      <w:r>
+        <w:rPr>
+          <w:rFonts w:ascii="Times New Roman" w:hAnsi="Times New Roman" w:cs="Times New Roman"/>
+        </w:rPr>
+        <w:t xml:space="preserve"> </w:t>
+      </w:r>
+      <w:r>
+        <w:rPr>
+          <w:rFonts w:ascii="Times New Roman" w:hAnsi="Times New Roman" w:cs="Times New Roman"/>
+        </w:rPr>
+        <w:t>structures (</w:t>
+      </w:r>
+      <w:proofErr w:type="spellStart"/>
+      <w:r>
+        <w:rPr>
+          <w:rStyle w:val="VerbatimChar"/>
+          <w:rFonts w:ascii="Times New Roman" w:hAnsi="Times New Roman" w:cs="Times New Roman"/>
+          <w:sz w:val="24"/>
+        </w:rPr>
+        <w:t>Chem.AddHs</w:t>
+      </w:r>
+      <w:proofErr w:type="spellEnd"/>
+      <w:r>
+        <w:rPr>
+          <w:rFonts w:ascii="Times New Roman" w:hAnsi="Times New Roman" w:cs="Times New Roman"/>
+        </w:rPr>
+        <w:t>)</w:t>
+      </w:r>
+      <w:r>
+        <w:rPr>
+          <w:rFonts w:ascii="Times New Roman" w:hAnsi="Times New Roman" w:cs="Times New Roman"/>
+        </w:rPr>
+        <w:t xml:space="preserve"> using the SMILES</w:t>
+      </w:r>
+      <w:r>
+        <w:rPr>
+          <w:rFonts w:ascii="Times New Roman" w:hAnsi="Times New Roman" w:cs="Times New Roman"/>
+        </w:rPr>
+        <w:t xml:space="preserve">. </w:t>
+      </w:r>
+      <w:r>
+        <w:rPr>
+          <w:rFonts w:ascii="Times New Roman" w:hAnsi="Times New Roman" w:cs="Times New Roman"/>
+        </w:rPr>
         <w:t xml:space="preserve">After </w:t>
       </w:r>
       <w:r>
         <w:rPr>
           <w:rFonts w:ascii="Times New Roman" w:hAnsi="Times New Roman" w:cs="Times New Roman"/>
         </w:rPr>
-        <w:t>preparing the dataset, we performed</w:t>
-      </w:r>
-      <w:r>
-        <w:rPr>
-          <w:rFonts w:ascii="Times New Roman" w:hAnsi="Times New Roman" w:cs="Times New Roman"/>
-        </w:rPr>
-        <w:t xml:space="preserve"> initial cleanup and formatting in the </w:t>
-      </w:r>
-      <w:r>
-        <w:rPr>
-          <w:rFonts w:ascii="Times New Roman" w:hAnsi="Times New Roman" w:cs="Times New Roman"/>
-        </w:rPr>
-        <w:t>Snowflake data warehouse (Enterprise data warehouse) using Structured Query Language (SQL). Datasets are available on the GitHub account for reference</w:t>
-      </w:r>
-      <w:r>
-        <w:rPr>
-          <w:rFonts w:ascii="Times New Roman" w:hAnsi="Times New Roman" w:cs="Times New Roman"/>
-        </w:rPr>
-        <w:t>.</w:t>
+        <w:t xml:space="preserve">generating molecular descriptors, high-dimensional feature extraction produced a dataset in which the number of features exceeded the </w:t>
+      </w:r>
+      <w:r>
+        <w:rPr>
+          <w:rFonts w:ascii="Times New Roman" w:hAnsi="Times New Roman" w:cs="Times New Roman"/>
+        </w:rPr>
+        <w:lastRenderedPageBreak/>
+        <w:t>number of observations, leading</w:t>
+      </w:r>
+      <w:r>
+        <w:rPr>
+          <w:rFonts w:ascii="Times New Roman" w:hAnsi="Times New Roman" w:cs="Times New Roman"/>
+        </w:rPr>
+        <w:t xml:space="preserve"> to </w:t>
+      </w:r>
+      <w:r>
+        <w:rPr>
+          <w:rFonts w:ascii="Times New Roman" w:hAnsi="Times New Roman" w:cs="Times New Roman"/>
+        </w:rPr>
+        <w:t xml:space="preserve">the </w:t>
+      </w:r>
+      <w:r>
+        <w:rPr>
+          <w:rFonts w:ascii="Times New Roman" w:hAnsi="Times New Roman" w:cs="Times New Roman"/>
+        </w:rPr>
+        <w:t xml:space="preserve">curse of dimensionality. </w:t>
+      </w:r>
+      <w:r>
+        <w:rPr>
+          <w:rFonts w:ascii="Times New Roman" w:hAnsi="Times New Roman" w:cs="Times New Roman"/>
+        </w:rPr>
+        <w:t>So,</w:t>
       </w:r>
       <w:r>
         <w:rPr>
@@ -2700,47 +3141,75 @@
         <w:rPr>
           <w:rFonts w:ascii="Times New Roman" w:hAnsi="Times New Roman" w:cs="Times New Roman"/>
         </w:rPr>
+        <w:t>to</w:t>
+      </w:r>
+      <w:r>
+        <w:rPr>
+          <w:rFonts w:ascii="Times New Roman" w:hAnsi="Times New Roman" w:cs="Times New Roman"/>
+        </w:rPr>
+        <w:t xml:space="preserve"> handle the curse of dimensionality</w:t>
+      </w:r>
+      <w:r>
+        <w:rPr>
+          <w:rFonts w:ascii="Times New Roman" w:hAnsi="Times New Roman" w:cs="Times New Roman"/>
+        </w:rPr>
+        <w:t>, we applied a couple of feature elimination techniques in a sequential order:</w:t>
+      </w:r>
+      <w:r>
+        <w:rPr>
+          <w:rFonts w:ascii="Times New Roman" w:hAnsi="Times New Roman" w:cs="Times New Roman"/>
+        </w:rPr>
         <w:t xml:space="preserve"> </w:t>
       </w:r>
       <w:r>
         <w:rPr>
           <w:rFonts w:ascii="Times New Roman" w:hAnsi="Times New Roman" w:cs="Times New Roman"/>
         </w:rPr>
-        <w:t>Thereafter</w:t>
-      </w:r>
-      <w:r>
-        <w:rPr>
-          <w:rFonts w:ascii="Times New Roman" w:hAnsi="Times New Roman" w:cs="Times New Roman"/>
-        </w:rPr>
-        <w:t>, on top of the resulting dataset in Snowflake, the remaining data engineering operations were performed in Python (</w:t>
+        <w:t xml:space="preserve">1) </w:t>
+      </w:r>
+      <w:r>
+        <w:rPr>
+          <w:rFonts w:ascii="Times New Roman" w:hAnsi="Times New Roman" w:cs="Times New Roman"/>
+        </w:rPr>
+        <w:t>Pairwise Pearson correlation</w:t>
+      </w:r>
+      <w:r>
+        <w:rPr>
+          <w:rFonts w:ascii="Times New Roman" w:hAnsi="Times New Roman" w:cs="Times New Roman"/>
+        </w:rPr>
+        <w:t xml:space="preserve"> and 2</w:t>
+      </w:r>
+      <w:r>
+        <w:rPr>
+          <w:rFonts w:ascii="Times New Roman" w:hAnsi="Times New Roman" w:cs="Times New Roman"/>
+        </w:rPr>
+        <w:t>a</w:t>
+      </w:r>
+      <w:r>
+        <w:rPr>
+          <w:rFonts w:ascii="Times New Roman" w:hAnsi="Times New Roman" w:cs="Times New Roman"/>
+        </w:rPr>
+        <w:t>)</w:t>
+      </w:r>
+      <w:r>
+        <w:rPr>
+          <w:rFonts w:ascii="Times New Roman" w:hAnsi="Times New Roman" w:cs="Times New Roman"/>
+        </w:rPr>
+        <w:t xml:space="preserve"> </w:t>
       </w:r>
       <w:proofErr w:type="spellStart"/>
       <w:r>
         <w:rPr>
           <w:rFonts w:ascii="Times New Roman" w:hAnsi="Times New Roman" w:cs="Times New Roman"/>
         </w:rPr>
-        <w:t>Jupyter</w:t>
+        <w:t>SelectFromModel</w:t>
       </w:r>
       <w:proofErr w:type="spellEnd"/>
       <w:r>
         <w:rPr>
           <w:rFonts w:ascii="Times New Roman" w:hAnsi="Times New Roman" w:cs="Times New Roman"/>
         </w:rPr>
-        <w:t xml:space="preserve"> Notebook) using the </w:t>
-      </w:r>
-      <w:proofErr w:type="gramStart"/>
-      <w:r>
-        <w:rPr>
-          <w:rFonts w:ascii="Times New Roman" w:hAnsi="Times New Roman" w:cs="Times New Roman"/>
-        </w:rPr>
-        <w:t>pandas</w:t>
-      </w:r>
-      <w:proofErr w:type="gramEnd"/>
-      <w:r>
-        <w:rPr>
-          <w:rFonts w:ascii="Times New Roman" w:hAnsi="Times New Roman" w:cs="Times New Roman"/>
-        </w:rPr>
-        <w:t xml:space="preserve"> library and</w:t>
+        <w:t xml:space="preserve"> for one set of models</w:t>
       </w:r>
       <w:r>
         <w:rPr>
@@ -2748,19 +3217,11 @@
         </w:rPr>
         <w:t xml:space="preserve"> </w:t>
       </w:r>
-      <w:proofErr w:type="spellStart"/>
-      <w:r>
-        <w:rPr>
-          <w:rFonts w:ascii="Times New Roman" w:hAnsi="Times New Roman" w:cs="Times New Roman"/>
-        </w:rPr>
-        <w:t>dataframes</w:t>
-      </w:r>
-      <w:proofErr w:type="spellEnd"/>
-      <w:r>
-        <w:rPr>
-          <w:rFonts w:ascii="Times New Roman" w:hAnsi="Times New Roman" w:cs="Times New Roman"/>
-        </w:rPr>
-        <w:t>.</w:t>
+      <w:r>
+        <w:rPr>
+          <w:rFonts w:ascii="Times New Roman" w:hAnsi="Times New Roman" w:cs="Times New Roman"/>
+        </w:rPr>
+        <w:t>and</w:t>
       </w:r>
       <w:r>
         <w:rPr>
@@ -2772,376 +3233,13 @@
         <w:rPr>
           <w:rFonts w:ascii="Times New Roman" w:hAnsi="Times New Roman" w:cs="Times New Roman"/>
         </w:rPr>
-        <w:t xml:space="preserve">Thereafter, </w:t>
-      </w:r>
-      <w:r>
-        <w:rPr>
-          <w:rFonts w:ascii="Times New Roman" w:hAnsi="Times New Roman" w:cs="Times New Roman"/>
-        </w:rPr>
-        <w:t>Simplified Molecular Input Line Entry System</w:t>
-      </w:r>
-      <w:r>
-        <w:rPr>
-          <w:rFonts w:ascii="Times New Roman" w:hAnsi="Times New Roman" w:cs="Times New Roman"/>
-        </w:rPr>
-        <w:t xml:space="preserve"> </w:t>
-      </w:r>
-      <w:r>
-        <w:rPr>
-          <w:rFonts w:ascii="Times New Roman" w:hAnsi="Times New Roman" w:cs="Times New Roman"/>
-        </w:rPr>
-        <w:t>(</w:t>
-      </w:r>
-      <w:r>
-        <w:rPr>
-          <w:rFonts w:ascii="Times New Roman" w:hAnsi="Times New Roman" w:cs="Times New Roman"/>
-        </w:rPr>
-        <w:t>SMILES</w:t>
-      </w:r>
-      <w:r>
-        <w:rPr>
-          <w:rFonts w:ascii="Times New Roman" w:hAnsi="Times New Roman" w:cs="Times New Roman"/>
-        </w:rPr>
-        <w:t>)</w:t>
-      </w:r>
-      <w:r>
-        <w:rPr>
-          <w:rFonts w:ascii="Times New Roman" w:hAnsi="Times New Roman" w:cs="Times New Roman"/>
-        </w:rPr>
-        <w:t xml:space="preserve"> </w:t>
-      </w:r>
-      <w:r>
-        <w:rPr>
-          <w:rFonts w:ascii="Times New Roman" w:hAnsi="Times New Roman" w:cs="Times New Roman"/>
-        </w:rPr>
-        <w:t>strings</w:t>
-      </w:r>
-      <w:r>
-        <w:rPr>
-          <w:rFonts w:ascii="Times New Roman" w:hAnsi="Times New Roman" w:cs="Times New Roman"/>
-        </w:rPr>
-        <w:t xml:space="preserve"> were generated </w:t>
-      </w:r>
-      <w:r>
-        <w:rPr>
-          <w:rFonts w:ascii="Times New Roman" w:hAnsi="Times New Roman" w:cs="Times New Roman"/>
-        </w:rPr>
-        <w:t>programmatically</w:t>
-      </w:r>
-      <w:r>
-        <w:rPr>
-          <w:rFonts w:ascii="Times New Roman" w:hAnsi="Times New Roman" w:cs="Times New Roman"/>
-        </w:rPr>
-        <w:t xml:space="preserve"> for each organic ligand </w:t>
-      </w:r>
-      <w:r>
-        <w:rPr>
-          <w:rFonts w:ascii="Times New Roman" w:hAnsi="Times New Roman" w:cs="Times New Roman"/>
-        </w:rPr>
-        <w:t>from its IUPAC name using the</w:t>
-      </w:r>
-      <w:r>
-        <w:rPr>
-          <w:rFonts w:ascii="Times New Roman" w:hAnsi="Times New Roman" w:cs="Times New Roman"/>
-        </w:rPr>
-        <w:t xml:space="preserve"> </w:t>
-      </w:r>
-      <w:r>
-        <w:rPr>
-          <w:rFonts w:ascii="Times New Roman" w:hAnsi="Times New Roman" w:cs="Times New Roman"/>
-        </w:rPr>
-        <w:t>Chemical Identifier Resolver API hosted by the National Cancer Institute Computer-Aided Drug Design Group (nih.gov)</w:t>
-      </w:r>
-      <w:r>
-        <w:rPr>
-          <w:rFonts w:ascii="Times New Roman" w:hAnsi="Times New Roman" w:cs="Times New Roman"/>
-        </w:rPr>
-        <w:t>.</w:t>
-      </w:r>
-      <w:r>
-        <w:rPr>
-          <w:rFonts w:ascii="Times New Roman" w:hAnsi="Times New Roman" w:cs="Times New Roman"/>
-        </w:rPr>
-        <w:t xml:space="preserve"> </w:t>
-      </w:r>
-      <w:r>
-        <w:rPr>
-          <w:rFonts w:ascii="Times New Roman" w:hAnsi="Times New Roman" w:cs="Times New Roman"/>
-        </w:rPr>
-        <w:t>Then</w:t>
-      </w:r>
-      <w:r>
-        <w:rPr>
-          <w:rFonts w:ascii="Times New Roman" w:hAnsi="Times New Roman" w:cs="Times New Roman"/>
-        </w:rPr>
-        <w:t xml:space="preserve">, </w:t>
-      </w:r>
-      <w:r>
-        <w:rPr>
-          <w:rFonts w:ascii="Times New Roman" w:hAnsi="Times New Roman" w:cs="Times New Roman"/>
-        </w:rPr>
-        <w:t xml:space="preserve">two-dimensional </w:t>
-      </w:r>
-      <w:r>
-        <w:rPr>
-          <w:rFonts w:ascii="Times New Roman" w:hAnsi="Times New Roman" w:cs="Times New Roman"/>
-        </w:rPr>
-        <w:t xml:space="preserve">molecular </w:t>
-      </w:r>
-      <w:r>
-        <w:rPr>
-          <w:rFonts w:ascii="Times New Roman" w:hAnsi="Times New Roman" w:cs="Times New Roman"/>
-        </w:rPr>
-        <w:t>descriptors per spacer</w:t>
-      </w:r>
-      <w:r>
-        <w:rPr>
-          <w:rFonts w:ascii="Times New Roman" w:hAnsi="Times New Roman" w:cs="Times New Roman"/>
-        </w:rPr>
-        <w:t xml:space="preserve"> (Primary and secondary)</w:t>
-      </w:r>
-      <w:r>
-        <w:rPr>
-          <w:rFonts w:ascii="Times New Roman" w:hAnsi="Times New Roman" w:cs="Times New Roman"/>
-        </w:rPr>
-        <w:t xml:space="preserve"> </w:t>
-      </w:r>
-      <w:r>
-        <w:rPr>
-          <w:rFonts w:ascii="Times New Roman" w:hAnsi="Times New Roman" w:cs="Times New Roman"/>
-        </w:rPr>
-        <w:t xml:space="preserve">were generated using </w:t>
-      </w:r>
-      <w:proofErr w:type="spellStart"/>
-      <w:r>
-        <w:rPr>
-          <w:rFonts w:ascii="Times New Roman" w:hAnsi="Times New Roman" w:cs="Times New Roman"/>
-        </w:rPr>
-        <w:t>RDKit</w:t>
-      </w:r>
-      <w:proofErr w:type="spellEnd"/>
-      <w:r>
-        <w:rPr>
-          <w:rFonts w:ascii="Times New Roman" w:hAnsi="Times New Roman" w:cs="Times New Roman"/>
-        </w:rPr>
-        <w:t xml:space="preserve"> </w:t>
-      </w:r>
-      <w:r>
-        <w:rPr>
-          <w:rFonts w:ascii="Times New Roman" w:hAnsi="Times New Roman" w:cs="Times New Roman"/>
-        </w:rPr>
-        <w:t>library</w:t>
-      </w:r>
-      <w:r>
-        <w:rPr>
-          <w:rFonts w:ascii="Times New Roman" w:hAnsi="Times New Roman" w:cs="Times New Roman"/>
-        </w:rPr>
-        <w:t xml:space="preserve"> </w:t>
-      </w:r>
-      <w:r>
-        <w:rPr>
-          <w:rFonts w:ascii="Times New Roman" w:hAnsi="Times New Roman" w:cs="Times New Roman"/>
-        </w:rPr>
-        <w:t>structures (</w:t>
-      </w:r>
-      <w:proofErr w:type="spellStart"/>
-      <w:r>
-        <w:rPr>
-          <w:rStyle w:val="VerbatimChar"/>
-          <w:rFonts w:ascii="Times New Roman" w:hAnsi="Times New Roman" w:cs="Times New Roman"/>
-          <w:sz w:val="24"/>
-        </w:rPr>
-        <w:t>Chem.AddHs</w:t>
-      </w:r>
-      <w:proofErr w:type="spellEnd"/>
-      <w:r>
-        <w:rPr>
-          <w:rFonts w:ascii="Times New Roman" w:hAnsi="Times New Roman" w:cs="Times New Roman"/>
-        </w:rPr>
-        <w:t>)</w:t>
-      </w:r>
-      <w:r>
-        <w:rPr>
-          <w:rFonts w:ascii="Times New Roman" w:hAnsi="Times New Roman" w:cs="Times New Roman"/>
-        </w:rPr>
-        <w:t xml:space="preserve"> using the </w:t>
-      </w:r>
-      <w:r>
-        <w:rPr>
-          <w:rFonts w:ascii="Times New Roman" w:hAnsi="Times New Roman" w:cs="Times New Roman"/>
-        </w:rPr>
-        <w:t>SMILES</w:t>
-      </w:r>
-      <w:r>
-        <w:rPr>
-          <w:rFonts w:ascii="Times New Roman" w:hAnsi="Times New Roman" w:cs="Times New Roman"/>
-        </w:rPr>
-        <w:t xml:space="preserve">. </w:t>
-      </w:r>
-      <w:r>
-        <w:rPr>
-          <w:rFonts w:ascii="Times New Roman" w:hAnsi="Times New Roman" w:cs="Times New Roman"/>
-        </w:rPr>
-        <w:t>After the generation of molecular descriptors,</w:t>
-      </w:r>
-      <w:r>
-        <w:rPr>
-          <w:rFonts w:ascii="Times New Roman" w:hAnsi="Times New Roman" w:cs="Times New Roman"/>
-        </w:rPr>
-        <w:t xml:space="preserve"> h</w:t>
-      </w:r>
-      <w:r>
-        <w:rPr>
-          <w:rFonts w:ascii="Times New Roman" w:hAnsi="Times New Roman" w:cs="Times New Roman"/>
-        </w:rPr>
-        <w:t>igh-dimensional feature extraction resulted in a dataset where the total number of features exceeded the number of observations,</w:t>
-      </w:r>
-      <w:r>
-        <w:rPr>
-          <w:rFonts w:ascii="Times New Roman" w:hAnsi="Times New Roman" w:cs="Times New Roman"/>
-        </w:rPr>
-        <w:t xml:space="preserve"> which led to </w:t>
-      </w:r>
-      <w:r>
-        <w:rPr>
-          <w:rFonts w:ascii="Times New Roman" w:hAnsi="Times New Roman" w:cs="Times New Roman"/>
-        </w:rPr>
-        <w:t xml:space="preserve">the </w:t>
-      </w:r>
-      <w:r>
-        <w:rPr>
-          <w:rFonts w:ascii="Times New Roman" w:hAnsi="Times New Roman" w:cs="Times New Roman"/>
-        </w:rPr>
-        <w:t xml:space="preserve">curse of dimensionality. </w:t>
-      </w:r>
-      <w:r>
-        <w:rPr>
-          <w:rFonts w:ascii="Times New Roman" w:hAnsi="Times New Roman" w:cs="Times New Roman"/>
-        </w:rPr>
-        <w:t>So,</w:t>
-      </w:r>
-      <w:r>
-        <w:rPr>
-          <w:rFonts w:ascii="Times New Roman" w:hAnsi="Times New Roman" w:cs="Times New Roman"/>
-        </w:rPr>
-        <w:t xml:space="preserve"> </w:t>
-      </w:r>
-      <w:r>
-        <w:rPr>
-          <w:rFonts w:ascii="Times New Roman" w:hAnsi="Times New Roman" w:cs="Times New Roman"/>
-        </w:rPr>
-        <w:t>to</w:t>
-      </w:r>
-      <w:r>
-        <w:rPr>
-          <w:rFonts w:ascii="Times New Roman" w:hAnsi="Times New Roman" w:cs="Times New Roman"/>
-        </w:rPr>
-        <w:t xml:space="preserve"> handle the </w:t>
-      </w:r>
-      <w:r>
-        <w:rPr>
-          <w:rFonts w:ascii="Times New Roman" w:hAnsi="Times New Roman" w:cs="Times New Roman"/>
-        </w:rPr>
-        <w:lastRenderedPageBreak/>
-        <w:t>curse of dimensionality</w:t>
-      </w:r>
-      <w:r>
-        <w:rPr>
-          <w:rFonts w:ascii="Times New Roman" w:hAnsi="Times New Roman" w:cs="Times New Roman"/>
-        </w:rPr>
-        <w:t>, we applied a couple of feature elimination techniques in a sequential order:</w:t>
-      </w:r>
-      <w:r>
-        <w:rPr>
-          <w:rFonts w:ascii="Times New Roman" w:hAnsi="Times New Roman" w:cs="Times New Roman"/>
-        </w:rPr>
-        <w:t xml:space="preserve"> </w:t>
-      </w:r>
-      <w:r>
-        <w:rPr>
-          <w:rFonts w:ascii="Times New Roman" w:hAnsi="Times New Roman" w:cs="Times New Roman"/>
-        </w:rPr>
-        <w:t xml:space="preserve">1) </w:t>
-      </w:r>
-      <w:r>
-        <w:rPr>
-          <w:rFonts w:ascii="Times New Roman" w:hAnsi="Times New Roman" w:cs="Times New Roman"/>
-        </w:rPr>
-        <w:t>Pairwise Pearson correlation</w:t>
-      </w:r>
-      <w:r>
-        <w:rPr>
-          <w:rFonts w:ascii="Times New Roman" w:hAnsi="Times New Roman" w:cs="Times New Roman"/>
-        </w:rPr>
-        <w:t xml:space="preserve"> and 2</w:t>
-      </w:r>
-      <w:r>
-        <w:rPr>
-          <w:rFonts w:ascii="Times New Roman" w:hAnsi="Times New Roman" w:cs="Times New Roman"/>
-        </w:rPr>
-        <w:t>a</w:t>
-      </w:r>
-      <w:r>
-        <w:rPr>
-          <w:rFonts w:ascii="Times New Roman" w:hAnsi="Times New Roman" w:cs="Times New Roman"/>
-        </w:rPr>
-        <w:t>)</w:t>
-      </w:r>
-      <w:r>
-        <w:rPr>
-          <w:rFonts w:ascii="Times New Roman" w:hAnsi="Times New Roman" w:cs="Times New Roman"/>
-        </w:rPr>
-        <w:t xml:space="preserve"> </w:t>
-      </w:r>
-      <w:proofErr w:type="spellStart"/>
-      <w:r>
-        <w:rPr>
-          <w:rFonts w:ascii="Times New Roman" w:hAnsi="Times New Roman" w:cs="Times New Roman"/>
-        </w:rPr>
-        <w:t>SelectFromModel</w:t>
-      </w:r>
-      <w:proofErr w:type="spellEnd"/>
-      <w:r>
-        <w:rPr>
-          <w:rFonts w:ascii="Times New Roman" w:hAnsi="Times New Roman" w:cs="Times New Roman"/>
-        </w:rPr>
-        <w:t xml:space="preserve"> for one set of models</w:t>
-      </w:r>
-      <w:r>
-        <w:rPr>
-          <w:rFonts w:ascii="Times New Roman" w:hAnsi="Times New Roman" w:cs="Times New Roman"/>
-        </w:rPr>
-        <w:t xml:space="preserve"> </w:t>
-      </w:r>
-      <w:r>
-        <w:rPr>
-          <w:rFonts w:ascii="Times New Roman" w:hAnsi="Times New Roman" w:cs="Times New Roman"/>
-        </w:rPr>
-        <w:t>and</w:t>
-      </w:r>
-      <w:r>
-        <w:rPr>
-          <w:rFonts w:ascii="Times New Roman" w:hAnsi="Times New Roman" w:cs="Times New Roman"/>
-        </w:rPr>
-        <w:t xml:space="preserve"> </w:t>
-      </w:r>
-      <w:r>
-        <w:rPr>
-          <w:rFonts w:ascii="Times New Roman" w:hAnsi="Times New Roman" w:cs="Times New Roman"/>
-        </w:rPr>
         <w:t xml:space="preserve">2b) </w:t>
       </w:r>
       <w:r>
         <w:rPr>
           <w:rFonts w:ascii="Times New Roman" w:hAnsi="Times New Roman" w:cs="Times New Roman"/>
         </w:rPr>
-        <w:t>Recursive</w:t>
-      </w:r>
-      <w:r>
-        <w:rPr>
-          <w:rFonts w:ascii="Times New Roman" w:hAnsi="Times New Roman" w:cs="Times New Roman"/>
-        </w:rPr>
-        <w:t xml:space="preserve"> Feature Elimination using Cross Validation</w:t>
+        <w:t>Recursive Feature Elimination using Cross Validation</w:t>
       </w:r>
       <w:r>
         <w:rPr>
@@ -3278,23 +3376,7 @@
           <w:sz w:val="24"/>
           <w:szCs w:val="24"/>
         </w:rPr>
-        <w:t xml:space="preserve">ML models for </w:t>
-      </w:r>
-      <w:r>
-        <w:rPr>
-          <w:rFonts w:ascii="Times New Roman" w:hAnsi="Times New Roman" w:cs="Times New Roman"/>
-          <w:sz w:val="24"/>
-          <w:szCs w:val="24"/>
-        </w:rPr>
-        <w:t>forecasting</w:t>
-      </w:r>
-      <w:r>
-        <w:rPr>
-          <w:rFonts w:ascii="Times New Roman" w:hAnsi="Times New Roman" w:cs="Times New Roman"/>
-          <w:sz w:val="24"/>
-          <w:szCs w:val="24"/>
-        </w:rPr>
-        <w:t xml:space="preserve"> emission energies</w:t>
+        <w:t>ML models for forecasting emission energies</w:t>
       </w:r>
     </w:p>
     <w:p>
@@ -3316,7 +3398,19 @@
         <w:rPr>
           <w:rFonts w:ascii="Times New Roman" w:hAnsi="Times New Roman" w:cs="Times New Roman"/>
         </w:rPr>
-        <w:t xml:space="preserve"> column definitions and histograms </w:t>
+        <w:t xml:space="preserve"> </w:t>
+      </w:r>
+      <w:r>
+        <w:rPr>
+          <w:rFonts w:ascii="Times New Roman" w:hAnsi="Times New Roman" w:cs="Times New Roman"/>
+        </w:rPr>
+        <w:t>Dataset Statistics</w:t>
+      </w:r>
+      <w:r>
+        <w:rPr>
+          <w:rFonts w:ascii="Times New Roman" w:hAnsi="Times New Roman" w:cs="Times New Roman"/>
+        </w:rPr>
+        <w:t xml:space="preserve"> </w:t>
       </w:r>
       <w:r>
         <w:rPr>
@@ -3382,7 +3476,19 @@
         <w:rPr>
           <w:rFonts w:ascii="Times New Roman" w:hAnsi="Times New Roman" w:cs="Times New Roman"/>
         </w:rPr>
-        <w:t xml:space="preserve">photon energy </w:t>
+        <w:t>photon energ</w:t>
+      </w:r>
+      <w:r>
+        <w:rPr>
+          <w:rFonts w:ascii="Times New Roman" w:hAnsi="Times New Roman" w:cs="Times New Roman"/>
+        </w:rPr>
+        <w:t>ies</w:t>
+      </w:r>
+      <w:r>
+        <w:rPr>
+          <w:rFonts w:ascii="Times New Roman" w:hAnsi="Times New Roman" w:cs="Times New Roman"/>
+        </w:rPr>
+        <w:t xml:space="preserve"> </w:t>
       </w:r>
       <w:r>
         <w:rPr>
@@ -3433,7 +3539,13 @@
         <w:rPr>
           <w:rFonts w:ascii="Times New Roman" w:hAnsi="Times New Roman" w:cs="Times New Roman"/>
         </w:rPr>
-        <w:t xml:space="preserve">The </w:t>
+        <w:t>As expected, t</w:t>
+      </w:r>
+      <w:r>
+        <w:rPr>
+          <w:rFonts w:ascii="Times New Roman" w:hAnsi="Times New Roman" w:cs="Times New Roman"/>
+        </w:rPr>
+        <w:t xml:space="preserve">he </w:t>
       </w:r>
       <w:r>
         <w:rPr>
@@ -3785,7 +3897,31 @@
         <w:rPr>
           <w:rFonts w:ascii="Times New Roman" w:hAnsi="Times New Roman" w:cs="Times New Roman"/>
         </w:rPr>
-        <w:t xml:space="preserve"> descriptors,</w:t>
+        <w:t xml:space="preserve"> descriptors</w:t>
+      </w:r>
+      <w:r>
+        <w:rPr>
+          <w:rFonts w:ascii="Times New Roman" w:hAnsi="Times New Roman" w:cs="Times New Roman"/>
+        </w:rPr>
+        <w:t xml:space="preserve"> organic spacers</w:t>
+      </w:r>
+      <w:r>
+        <w:rPr>
+          <w:rFonts w:ascii="Times New Roman" w:hAnsi="Times New Roman" w:cs="Times New Roman"/>
+        </w:rPr>
+        <w:t xml:space="preserve"> (217 descriptors</w:t>
+      </w:r>
+      <w:r>
+        <w:rPr>
+          <w:rFonts w:ascii="Times New Roman" w:hAnsi="Times New Roman" w:cs="Times New Roman"/>
+        </w:rPr>
+        <w:t xml:space="preserve"> for each</w:t>
+      </w:r>
+      <w:r>
+        <w:rPr>
+          <w:rFonts w:ascii="Times New Roman" w:hAnsi="Times New Roman" w:cs="Times New Roman"/>
+        </w:rPr>
+        <w:t>).</w:t>
       </w:r>
       <w:r>
         <w:rPr>
@@ -3797,17 +3933,43 @@
         <w:rPr>
           <w:rFonts w:ascii="Times New Roman" w:hAnsi="Times New Roman" w:cs="Times New Roman"/>
         </w:rPr>
-        <w:t xml:space="preserve">each </w:t>
-      </w:r>
-      <w:r>
-        <w:rPr>
-          <w:rFonts w:ascii="Times New Roman" w:hAnsi="Times New Roman" w:cs="Times New Roman"/>
-        </w:rPr>
-        <w:t>SMILES (217 descriptors).</w:t>
-      </w:r>
-      <w:r>
-        <w:rPr>
-          <w:rFonts w:ascii="Times New Roman" w:hAnsi="Times New Roman" w:cs="Times New Roman"/>
+        <w:t xml:space="preserve">To maintain </w:t>
+      </w:r>
+      <w:r>
+        <w:rPr>
+          <w:rFonts w:ascii="Times New Roman" w:hAnsi="Times New Roman" w:cs="Times New Roman"/>
+        </w:rPr>
+        <w:t xml:space="preserve">proper data distribution across reports with mixed organic spacers and single organic spacers, where 46 entries (~16%) are mixed primary and secondary spacers, we have used an 80/20 split stratified on </w:t>
+      </w:r>
+      <w:r>
+        <w:rPr>
+          <w:rFonts w:ascii="Times New Roman" w:hAnsi="Times New Roman" w:cs="Times New Roman"/>
+        </w:rPr>
+        <w:t xml:space="preserve">the </w:t>
+      </w:r>
+      <w:r>
+        <w:rPr>
+          <w:rFonts w:ascii="Times New Roman" w:hAnsi="Times New Roman" w:cs="Times New Roman"/>
+        </w:rPr>
+        <w:t>IS_MIXED_SPACERS_SPACER</w:t>
+      </w:r>
+      <w:r>
+        <w:rPr>
+          <w:rFonts w:ascii="Times New Roman" w:hAnsi="Times New Roman" w:cs="Times New Roman"/>
+        </w:rPr>
+        <w:t xml:space="preserve"> column</w:t>
+      </w:r>
+      <w:r>
+        <w:rPr>
+          <w:rFonts w:ascii="Times New Roman" w:hAnsi="Times New Roman" w:cs="Times New Roman"/>
+        </w:rPr>
+        <w:t>, yielding</w:t>
+      </w:r>
+      <w:r>
+        <w:rPr>
+          <w:rStyle w:val="VerbatimChar"/>
+          <w:rFonts w:ascii="Times New Roman" w:hAnsi="Times New Roman" w:cs="Times New Roman"/>
+          <w:sz w:val="24"/>
         </w:rPr>
         <w:t xml:space="preserve"> </w:t>
       </w:r>
@@ -3815,19 +3977,47 @@
         <w:rPr>
           <w:rFonts w:ascii="Times New Roman" w:hAnsi="Times New Roman" w:cs="Times New Roman"/>
         </w:rPr>
-        <w:t xml:space="preserve">To maintain </w:t>
-      </w:r>
-      <w:r>
-        <w:rPr>
-          <w:rFonts w:ascii="Times New Roman" w:hAnsi="Times New Roman" w:cs="Times New Roman"/>
-        </w:rPr>
-        <w:t>proper data distribution across reports with mixed organic spacers and single organic spacers, where 46 entries (~16%) are mixed primary and secondary spacers, we have used an 80/20 split stratified on IS_MIXED_SPACERS_SPACER, yielding</w:t>
-      </w:r>
-      <w:r>
-        <w:rPr>
-          <w:rStyle w:val="VerbatimChar"/>
-          <w:rFonts w:ascii="Times New Roman" w:hAnsi="Times New Roman" w:cs="Times New Roman"/>
-          <w:sz w:val="24"/>
+        <w:t>226 training</w:t>
+      </w:r>
+      <w:r>
+        <w:rPr>
+          <w:rFonts w:ascii="Times New Roman" w:hAnsi="Times New Roman" w:cs="Times New Roman"/>
+        </w:rPr>
+        <w:t xml:space="preserve"> and</w:t>
+      </w:r>
+      <w:r>
+        <w:rPr>
+          <w:rFonts w:ascii="Times New Roman" w:hAnsi="Times New Roman" w:cs="Times New Roman"/>
+        </w:rPr>
+        <w:t xml:space="preserve"> 57 test</w:t>
+      </w:r>
+      <w:r>
+        <w:rPr>
+          <w:rFonts w:ascii="Times New Roman" w:hAnsi="Times New Roman" w:cs="Times New Roman"/>
+        </w:rPr>
+        <w:t xml:space="preserve"> records</w:t>
+      </w:r>
+      <w:r>
+        <w:rPr>
+          <w:rFonts w:ascii="Times New Roman" w:hAnsi="Times New Roman" w:cs="Times New Roman"/>
+        </w:rPr>
+        <w:t xml:space="preserve">. </w:t>
+      </w:r>
+      <w:r>
+        <w:rPr>
+          <w:rFonts w:ascii="Times New Roman" w:hAnsi="Times New Roman" w:cs="Times New Roman"/>
+        </w:rPr>
+        <w:t>It is worth mentioning that m</w:t>
+      </w:r>
+      <w:r>
+        <w:rPr>
+          <w:rFonts w:ascii="Times New Roman" w:hAnsi="Times New Roman" w:cs="Times New Roman"/>
+        </w:rPr>
+        <w:t>ixed</w:t>
+      </w:r>
+      <w:r>
+        <w:rPr>
+          <w:rFonts w:ascii="Times New Roman" w:hAnsi="Times New Roman" w:cs="Times New Roman"/>
         </w:rPr>
         <w:t xml:space="preserve"> </w:t>
       </w:r>
@@ -3835,25 +4025,49 @@
         <w:rPr>
           <w:rFonts w:ascii="Times New Roman" w:hAnsi="Times New Roman" w:cs="Times New Roman"/>
         </w:rPr>
-        <w:t>226 training</w:t>
-      </w:r>
-      <w:r>
-        <w:rPr>
-          <w:rFonts w:ascii="Times New Roman" w:hAnsi="Times New Roman" w:cs="Times New Roman"/>
-        </w:rPr>
-        <w:t xml:space="preserve"> and</w:t>
-      </w:r>
-      <w:r>
-        <w:rPr>
-          <w:rFonts w:ascii="Times New Roman" w:hAnsi="Times New Roman" w:cs="Times New Roman"/>
-        </w:rPr>
-        <w:t xml:space="preserve"> 57 test</w:t>
-      </w:r>
-      <w:r>
-        <w:rPr>
-          <w:rFonts w:ascii="Times New Roman" w:hAnsi="Times New Roman" w:cs="Times New Roman"/>
-        </w:rPr>
-        <w:t xml:space="preserve"> records</w:t>
+        <w:t xml:space="preserve">spacer formulations are chemically </w:t>
+      </w:r>
+      <w:r>
+        <w:rPr>
+          <w:rFonts w:ascii="Times New Roman" w:hAnsi="Times New Roman" w:cs="Times New Roman"/>
+        </w:rPr>
+        <w:t>significant</w:t>
+      </w:r>
+      <w:r>
+        <w:rPr>
+          <w:rFonts w:ascii="Times New Roman" w:hAnsi="Times New Roman" w:cs="Times New Roman"/>
+        </w:rPr>
+        <w:t xml:space="preserve"> as</w:t>
+      </w:r>
+      <w:r>
+        <w:rPr>
+          <w:rFonts w:ascii="Times New Roman" w:hAnsi="Times New Roman" w:cs="Times New Roman"/>
+        </w:rPr>
+        <w:t xml:space="preserve"> the secondary ligand </w:t>
+      </w:r>
+      <w:r>
+        <w:rPr>
+          <w:rFonts w:ascii="Times New Roman" w:hAnsi="Times New Roman" w:cs="Times New Roman"/>
+        </w:rPr>
+        <w:t xml:space="preserve">prominently </w:t>
+      </w:r>
+      <w:r>
+        <w:rPr>
+          <w:rFonts w:ascii="Times New Roman" w:hAnsi="Times New Roman" w:cs="Times New Roman"/>
+        </w:rPr>
+        <w:t>impacts interlayer spacing and can determine which n domains contribute more to</w:t>
+      </w:r>
+      <w:r>
+        <w:rPr>
+          <w:rFonts w:ascii="Times New Roman" w:hAnsi="Times New Roman" w:cs="Times New Roman"/>
+        </w:rPr>
+        <w:t xml:space="preserve"> the </w:t>
+      </w:r>
+      <w:r>
+        <w:rPr>
+          <w:rFonts w:ascii="Times New Roman" w:hAnsi="Times New Roman" w:cs="Times New Roman"/>
+        </w:rPr>
+        <w:t>emission</w:t>
       </w:r>
       <w:r>
         <w:rPr>
@@ -3865,13 +4079,7 @@
         <w:rPr>
           <w:rFonts w:ascii="Times New Roman" w:hAnsi="Times New Roman" w:cs="Times New Roman"/>
         </w:rPr>
-        <w:t>It is worth mentioning that m</w:t>
-      </w:r>
-      <w:r>
-        <w:rPr>
-          <w:rFonts w:ascii="Times New Roman" w:hAnsi="Times New Roman" w:cs="Times New Roman"/>
-        </w:rPr>
-        <w:t>ixed</w:t>
+        <w:t>After</w:t>
       </w:r>
       <w:r>
         <w:rPr>
@@ -3883,43 +4091,156 @@
         <w:rPr>
           <w:rFonts w:ascii="Times New Roman" w:hAnsi="Times New Roman" w:cs="Times New Roman"/>
         </w:rPr>
-        <w:t>spacer formulations are chemically important</w:t>
-      </w:r>
-      <w:r>
-        <w:rPr>
-          <w:rFonts w:ascii="Times New Roman" w:hAnsi="Times New Roman" w:cs="Times New Roman"/>
-        </w:rPr>
-        <w:t xml:space="preserve"> as</w:t>
-      </w:r>
-      <w:r>
-        <w:rPr>
-          <w:rFonts w:ascii="Times New Roman" w:hAnsi="Times New Roman" w:cs="Times New Roman"/>
-        </w:rPr>
-        <w:t xml:space="preserve"> the secondary ligand </w:t>
-      </w:r>
-      <w:r>
-        <w:rPr>
-          <w:rFonts w:ascii="Times New Roman" w:hAnsi="Times New Roman" w:cs="Times New Roman"/>
-        </w:rPr>
-        <w:t xml:space="preserve">prominently </w:t>
-      </w:r>
-      <w:r>
-        <w:rPr>
-          <w:rFonts w:ascii="Times New Roman" w:hAnsi="Times New Roman" w:cs="Times New Roman"/>
-        </w:rPr>
-        <w:t>impacts interlayer spacing and can determine which n domains contribute more to</w:t>
-      </w:r>
-      <w:r>
-        <w:rPr>
-          <w:rFonts w:ascii="Times New Roman" w:hAnsi="Times New Roman" w:cs="Times New Roman"/>
-        </w:rPr>
-        <w:t xml:space="preserve"> the </w:t>
-      </w:r>
-      <w:r>
-        <w:rPr>
-          <w:rFonts w:ascii="Times New Roman" w:hAnsi="Times New Roman" w:cs="Times New Roman"/>
-        </w:rPr>
-        <w:t>emission</w:t>
+        <w:t>splitting the dataset into a training and a test set, we began feature elimination to prevent the curse of dimensionality using only the training dataset, to</w:t>
+      </w:r>
+      <w:r>
+        <w:rPr>
+          <w:rFonts w:ascii="Times New Roman" w:hAnsi="Times New Roman" w:cs="Times New Roman"/>
+        </w:rPr>
+        <w:t xml:space="preserve"> avoid test data leakage. </w:t>
+      </w:r>
+      <w:r>
+        <w:rPr>
+          <w:rFonts w:ascii="Times New Roman" w:hAnsi="Times New Roman" w:cs="Times New Roman"/>
+        </w:rPr>
+        <w:t xml:space="preserve">Initially, </w:t>
+      </w:r>
+      <w:r>
+        <w:rPr>
+          <w:rFonts w:ascii="Times New Roman" w:hAnsi="Times New Roman" w:cs="Times New Roman"/>
+        </w:rPr>
+        <w:t>a Pairwise Pearson correlation was applied to the training fold</w:t>
+      </w:r>
+      <w:r>
+        <w:rPr>
+          <w:rFonts w:ascii="Times New Roman" w:hAnsi="Times New Roman" w:cs="Times New Roman"/>
+        </w:rPr>
+        <w:t xml:space="preserve"> with </w:t>
+      </w:r>
+      <w:r>
+        <w:rPr>
+          <w:rFonts w:ascii="Times New Roman" w:hAnsi="Times New Roman" w:cs="Times New Roman"/>
+        </w:rPr>
+        <w:t>a Pearson correlation coefficient threshold of 0.9 (|r| &gt; 0.90)</w:t>
+      </w:r>
+      <w:r>
+        <w:rPr>
+          <w:rFonts w:ascii="Times New Roman" w:hAnsi="Times New Roman" w:cs="Times New Roman"/>
+        </w:rPr>
+        <w:t>, and 173 redundant columns were omitted</w:t>
+      </w:r>
+      <w:r>
+        <w:rPr>
+          <w:rFonts w:ascii="Times New Roman" w:hAnsi="Times New Roman" w:cs="Times New Roman"/>
+        </w:rPr>
+        <w:t>, leaving 289 candidates for selection.</w:t>
+      </w:r>
+      <w:r>
+        <w:rPr>
+          <w:rFonts w:ascii="Times New Roman" w:hAnsi="Times New Roman" w:cs="Times New Roman"/>
+        </w:rPr>
+        <w:t xml:space="preserve"> </w:t>
+      </w:r>
+      <w:r>
+        <w:rPr>
+          <w:rFonts w:ascii="Times New Roman" w:hAnsi="Times New Roman" w:cs="Times New Roman"/>
+        </w:rPr>
+        <w:t xml:space="preserve">Starting from 289 </w:t>
+      </w:r>
+      <w:r>
+        <w:rPr>
+          <w:rFonts w:ascii="Times New Roman" w:hAnsi="Times New Roman" w:cs="Times New Roman"/>
+        </w:rPr>
+        <w:lastRenderedPageBreak/>
+        <w:t>post-correlation-based</w:t>
+      </w:r>
+      <w:r>
+        <w:rPr>
+          <w:rFonts w:ascii="Times New Roman" w:hAnsi="Times New Roman" w:cs="Times New Roman"/>
+        </w:rPr>
+        <w:t xml:space="preserve"> columns</w:t>
+      </w:r>
+      <w:r>
+        <w:rPr>
+          <w:rFonts w:ascii="Times New Roman" w:hAnsi="Times New Roman" w:cs="Times New Roman"/>
+        </w:rPr>
+        <w:t xml:space="preserve"> elimination</w:t>
+      </w:r>
+      <w:r>
+        <w:rPr>
+          <w:rFonts w:ascii="Times New Roman" w:hAnsi="Times New Roman" w:cs="Times New Roman"/>
+        </w:rPr>
+        <w:t xml:space="preserve">, we applied </w:t>
+      </w:r>
+      <w:r>
+        <w:rPr>
+          <w:rFonts w:ascii="Times New Roman" w:hAnsi="Times New Roman" w:cs="Times New Roman"/>
+          <w:lang w:val="en-IN"/>
+        </w:rPr>
+        <w:t>RFECV</w:t>
+      </w:r>
+      <w:r>
+        <w:rPr>
+          <w:rFonts w:ascii="Times New Roman" w:hAnsi="Times New Roman" w:cs="Times New Roman"/>
+        </w:rPr>
+        <w:t xml:space="preserve"> </w:t>
+      </w:r>
+      <w:r>
+        <w:rPr>
+          <w:rFonts w:ascii="Times New Roman" w:hAnsi="Times New Roman" w:cs="Times New Roman"/>
+        </w:rPr>
+        <w:t xml:space="preserve">and </w:t>
+      </w:r>
+      <w:r>
+        <w:rPr>
+          <w:rFonts w:ascii="Times New Roman" w:hAnsi="Times New Roman" w:cs="Times New Roman"/>
+          <w:lang w:val="en-IN"/>
+        </w:rPr>
+        <w:t>scikit-</w:t>
+      </w:r>
+      <w:proofErr w:type="spellStart"/>
+      <w:r>
+        <w:rPr>
+          <w:rFonts w:ascii="Times New Roman" w:hAnsi="Times New Roman" w:cs="Times New Roman"/>
+          <w:lang w:val="en-IN"/>
+        </w:rPr>
+        <w:t>learn’s</w:t>
+      </w:r>
+      <w:proofErr w:type="spellEnd"/>
+      <w:r>
+        <w:rPr>
+          <w:rFonts w:ascii="Times New Roman" w:hAnsi="Times New Roman" w:cs="Times New Roman"/>
+          <w:lang w:val="en-IN"/>
+        </w:rPr>
+        <w:t xml:space="preserve"> </w:t>
+      </w:r>
+      <w:proofErr w:type="spellStart"/>
+      <w:r>
+        <w:rPr>
+          <w:rFonts w:ascii="Times New Roman" w:hAnsi="Times New Roman" w:cs="Times New Roman"/>
+          <w:lang w:val="en-IN"/>
+        </w:rPr>
+        <w:t>SelectFromModel</w:t>
+      </w:r>
+      <w:proofErr w:type="spellEnd"/>
+      <w:r>
+        <w:rPr>
+          <w:rFonts w:ascii="Times New Roman" w:hAnsi="Times New Roman" w:cs="Times New Roman"/>
+          <w:lang w:val="en-IN"/>
+        </w:rPr>
+        <w:t xml:space="preserve"> </w:t>
+      </w:r>
+      <w:r>
+        <w:rPr>
+          <w:rFonts w:ascii="Times New Roman" w:hAnsi="Times New Roman" w:cs="Times New Roman"/>
+        </w:rPr>
+        <w:t xml:space="preserve">in parallel, each fit on the 226 training </w:t>
+      </w:r>
+      <w:r>
+        <w:rPr>
+          <w:rFonts w:ascii="Times New Roman" w:hAnsi="Times New Roman" w:cs="Times New Roman"/>
+        </w:rPr>
+        <w:t>records</w:t>
       </w:r>
       <w:r>
         <w:rPr>
@@ -3930,8 +4251,9 @@
       <w:r>
         <w:rPr>
           <w:rFonts w:ascii="Times New Roman" w:hAnsi="Times New Roman" w:cs="Times New Roman"/>
-        </w:rPr>
-        <w:t>After</w:t>
+          <w:lang w:val="en-IN"/>
+        </w:rPr>
+        <w:t>RFECV</w:t>
       </w:r>
       <w:r>
         <w:rPr>
@@ -3942,71 +4264,30 @@
       <w:r>
         <w:rPr>
           <w:rFonts w:ascii="Times New Roman" w:hAnsi="Times New Roman" w:cs="Times New Roman"/>
-        </w:rPr>
-        <w:t xml:space="preserve">the dataset was split into the training set and the testing set, we started the feature elimination process to prevent the curse of dimensionality using the training dataset alone, as we should avoid test data leakage. </w:t>
-      </w:r>
-      <w:r>
-        <w:rPr>
-          <w:rFonts w:ascii="Times New Roman" w:hAnsi="Times New Roman" w:cs="Times New Roman"/>
-        </w:rPr>
-        <w:t xml:space="preserve">Initially, </w:t>
-      </w:r>
-      <w:r>
-        <w:rPr>
-          <w:rFonts w:ascii="Times New Roman" w:hAnsi="Times New Roman" w:cs="Times New Roman"/>
-        </w:rPr>
-        <w:t>a Pairwise Pearson correlation was applied to the training fold, and 173 redundant columns (|r| &gt; 0.90) were omitted</w:t>
-      </w:r>
-      <w:r>
-        <w:rPr>
-          <w:rFonts w:ascii="Times New Roman" w:hAnsi="Times New Roman" w:cs="Times New Roman"/>
-        </w:rPr>
-        <w:t>, leaving 289 candidates for selection.</w:t>
-      </w:r>
-      <w:r>
-        <w:rPr>
-          <w:rFonts w:ascii="Times New Roman" w:hAnsi="Times New Roman" w:cs="Times New Roman"/>
+          <w:lang w:val="en-IN"/>
+        </w:rPr>
+        <w:t>ran</w:t>
+      </w:r>
+      <w:r>
+        <w:rPr>
+          <w:rFonts w:ascii="Times New Roman" w:hAnsi="Times New Roman" w:cs="Times New Roman"/>
+          <w:lang w:val="en-IN"/>
         </w:rPr>
         <w:t xml:space="preserve"> </w:t>
       </w:r>
       <w:r>
         <w:rPr>
           <w:rFonts w:ascii="Times New Roman" w:hAnsi="Times New Roman" w:cs="Times New Roman"/>
-        </w:rPr>
-        <w:t xml:space="preserve">Starting from 289 post-correlation </w:t>
-      </w:r>
-      <w:r>
-        <w:rPr>
-          <w:rFonts w:ascii="Times New Roman" w:hAnsi="Times New Roman" w:cs="Times New Roman"/>
-        </w:rPr>
-        <w:lastRenderedPageBreak/>
-        <w:t xml:space="preserve">columns, we applied </w:t>
-      </w:r>
-      <w:r>
-        <w:rPr>
-          <w:rFonts w:ascii="Times New Roman" w:hAnsi="Times New Roman" w:cs="Times New Roman"/>
           <w:lang w:val="en-IN"/>
         </w:rPr>
-        <w:t>RFECV</w:t>
-      </w:r>
-      <w:r>
-        <w:rPr>
-          <w:rFonts w:ascii="Times New Roman" w:hAnsi="Times New Roman" w:cs="Times New Roman"/>
-        </w:rPr>
-        <w:t xml:space="preserve"> </w:t>
-      </w:r>
-      <w:r>
-        <w:rPr>
-          <w:rFonts w:ascii="Times New Roman" w:hAnsi="Times New Roman" w:cs="Times New Roman"/>
-        </w:rPr>
-        <w:t xml:space="preserve">and </w:t>
+        <w:t xml:space="preserve">a </w:t>
       </w:r>
       <w:r>
         <w:rPr>
           <w:rFonts w:ascii="Times New Roman" w:hAnsi="Times New Roman" w:cs="Times New Roman"/>
           <w:lang w:val="en-IN"/>
         </w:rPr>
-        <w:t>scikit-</w:t>
+        <w:t>random forest regressor (</w:t>
       </w:r>
       <w:proofErr w:type="spellStart"/>
       <w:r>
@@ -4014,7 +4295,7 @@
           <w:rFonts w:ascii="Times New Roman" w:hAnsi="Times New Roman" w:cs="Times New Roman"/>
           <w:lang w:val="en-IN"/>
         </w:rPr>
-        <w:t>learn’s</w:t>
+        <w:t>max_depth</w:t>
       </w:r>
       <w:proofErr w:type="spellEnd"/>
       <w:r>
@@ -4022,7 +4303,7 @@
           <w:rFonts w:ascii="Times New Roman" w:hAnsi="Times New Roman" w:cs="Times New Roman"/>
           <w:lang w:val="en-IN"/>
         </w:rPr>
-        <w:t xml:space="preserve"> </w:t>
+        <w:t xml:space="preserve"> = 5, </w:t>
       </w:r>
       <w:proofErr w:type="spellStart"/>
       <w:r>
@@ -4030,7 +4311,7 @@
           <w:rFonts w:ascii="Times New Roman" w:hAnsi="Times New Roman" w:cs="Times New Roman"/>
           <w:lang w:val="en-IN"/>
         </w:rPr>
-        <w:t>SelectFromModel</w:t>
+        <w:t>min_samples_leaf</w:t>
       </w:r>
       <w:proofErr w:type="spellEnd"/>
       <w:r>
@@ -4038,118 +4319,28 @@
           <w:rFonts w:ascii="Times New Roman" w:hAnsi="Times New Roman" w:cs="Times New Roman"/>
           <w:lang w:val="en-IN"/>
         </w:rPr>
-        <w:t xml:space="preserve"> </w:t>
-      </w:r>
-      <w:r>
-        <w:rPr>
-          <w:rFonts w:ascii="Times New Roman" w:hAnsi="Times New Roman" w:cs="Times New Roman"/>
-        </w:rPr>
-        <w:t xml:space="preserve">in parallel, each fit on the 226 training </w:t>
-      </w:r>
-      <w:r>
-        <w:rPr>
-          <w:rFonts w:ascii="Times New Roman" w:hAnsi="Times New Roman" w:cs="Times New Roman"/>
-        </w:rPr>
-        <w:t>records</w:t>
-      </w:r>
-      <w:r>
-        <w:rPr>
-          <w:rFonts w:ascii="Times New Roman" w:hAnsi="Times New Roman" w:cs="Times New Roman"/>
-        </w:rPr>
-        <w:t>.</w:t>
-      </w:r>
-      <w:r>
-        <w:rPr>
-          <w:rFonts w:ascii="Times New Roman" w:hAnsi="Times New Roman" w:cs="Times New Roman"/>
-        </w:rPr>
-        <w:t xml:space="preserve"> </w:t>
+        <w:t xml:space="preserve"> = 6) with 5-fold</w:t>
       </w:r>
       <w:r>
         <w:rPr>
           <w:rFonts w:ascii="Times New Roman" w:hAnsi="Times New Roman" w:cs="Times New Roman"/>
           <w:lang w:val="en-IN"/>
         </w:rPr>
-        <w:t>RFECV</w:t>
-      </w:r>
-      <w:r>
-        <w:rPr>
-          <w:rFonts w:ascii="Times New Roman" w:hAnsi="Times New Roman" w:cs="Times New Roman"/>
-        </w:rPr>
-        <w:t xml:space="preserve"> </w:t>
+        <w:t xml:space="preserve"> stratified cross-validation. </w:t>
       </w:r>
       <w:r>
         <w:rPr>
           <w:rFonts w:ascii="Times New Roman" w:hAnsi="Times New Roman" w:cs="Times New Roman"/>
           <w:lang w:val="en-IN"/>
         </w:rPr>
-        <w:t>ran</w:t>
+        <w:t>In this approach</w:t>
       </w:r>
       <w:r>
         <w:rPr>
           <w:rFonts w:ascii="Times New Roman" w:hAnsi="Times New Roman" w:cs="Times New Roman"/>
           <w:lang w:val="en-IN"/>
         </w:rPr>
-        <w:t xml:space="preserve"> </w:t>
-      </w:r>
-      <w:r>
-        <w:rPr>
-          <w:rFonts w:ascii="Times New Roman" w:hAnsi="Times New Roman" w:cs="Times New Roman"/>
-          <w:lang w:val="en-IN"/>
-        </w:rPr>
-        <w:t xml:space="preserve">a </w:t>
-      </w:r>
-      <w:r>
-        <w:rPr>
-          <w:rFonts w:ascii="Times New Roman" w:hAnsi="Times New Roman" w:cs="Times New Roman"/>
-          <w:lang w:val="en-IN"/>
-        </w:rPr>
-        <w:t>random forest regressor (</w:t>
-      </w:r>
-      <w:proofErr w:type="spellStart"/>
-      <w:r>
-        <w:rPr>
-          <w:rFonts w:ascii="Times New Roman" w:hAnsi="Times New Roman" w:cs="Times New Roman"/>
-          <w:lang w:val="en-IN"/>
-        </w:rPr>
-        <w:t>max_depth</w:t>
-      </w:r>
-      <w:proofErr w:type="spellEnd"/>
-      <w:r>
-        <w:rPr>
-          <w:rFonts w:ascii="Times New Roman" w:hAnsi="Times New Roman" w:cs="Times New Roman"/>
-          <w:lang w:val="en-IN"/>
-        </w:rPr>
-        <w:t xml:space="preserve"> = 5, </w:t>
-      </w:r>
-      <w:proofErr w:type="spellStart"/>
-      <w:r>
-        <w:rPr>
-          <w:rFonts w:ascii="Times New Roman" w:hAnsi="Times New Roman" w:cs="Times New Roman"/>
-          <w:lang w:val="en-IN"/>
-        </w:rPr>
-        <w:t>min_samples_leaf</w:t>
-      </w:r>
-      <w:proofErr w:type="spellEnd"/>
-      <w:r>
-        <w:rPr>
-          <w:rFonts w:ascii="Times New Roman" w:hAnsi="Times New Roman" w:cs="Times New Roman"/>
-          <w:lang w:val="en-IN"/>
-        </w:rPr>
-        <w:t xml:space="preserve"> = 6) with 5-fold</w:t>
-      </w:r>
-      <w:r>
-        <w:rPr>
-          <w:rFonts w:ascii="Times New Roman" w:hAnsi="Times New Roman" w:cs="Times New Roman"/>
-          <w:lang w:val="en-IN"/>
-        </w:rPr>
-        <w:t xml:space="preserve"> stratified cross-validation. </w:t>
-      </w:r>
-      <w:r>
-        <w:rPr>
-          <w:rFonts w:ascii="Times New Roman" w:hAnsi="Times New Roman" w:cs="Times New Roman"/>
-          <w:lang w:val="en-IN"/>
-        </w:rPr>
-        <w:t>Here, f</w:t>
+        <w:t>, f</w:t>
       </w:r>
       <w:r>
         <w:rPr>
@@ -4215,21 +4406,13 @@
           <w:rFonts w:ascii="Times New Roman" w:hAnsi="Times New Roman" w:cs="Times New Roman"/>
           <w:lang w:val="en-IN"/>
         </w:rPr>
-        <w:t xml:space="preserve">According to RFECV, </w:t>
-      </w:r>
-      <w:r>
-        <w:rPr>
-          <w:rFonts w:ascii="Times New Roman" w:hAnsi="Times New Roman" w:cs="Times New Roman"/>
-          <w:lang w:val="en-IN"/>
-        </w:rPr>
-        <w:t xml:space="preserve">the curve in </w:t>
+        <w:t xml:space="preserve">According to RFECV, the curve in </w:t>
       </w:r>
       <w:r>
         <w:rPr>
           <w:rFonts w:ascii="Times New Roman" w:hAnsi="Times New Roman" w:cs="Times New Roman"/>
           <w:b/>
           <w:bCs/>
-          <w:highlight w:val="yellow"/>
           <w:lang w:val="en-IN"/>
         </w:rPr>
         <w:t xml:space="preserve">Figure </w:t>
@@ -4239,16 +4422,70 @@
           <w:rFonts w:ascii="Times New Roman" w:hAnsi="Times New Roman" w:cs="Times New Roman"/>
           <w:b/>
           <w:bCs/>
-          <w:highlight w:val="yellow"/>
           <w:lang w:val="en-IN"/>
         </w:rPr>
-        <w:t>s2</w:t>
+        <w:t>S1</w:t>
       </w:r>
       <w:r>
         <w:rPr>
           <w:rFonts w:ascii="Times New Roman" w:hAnsi="Times New Roman" w:cs="Times New Roman"/>
           <w:lang w:val="en-IN"/>
         </w:rPr>
+        <w:t xml:space="preserve"> shows </w:t>
+      </w:r>
+      <w:r>
+        <w:rPr>
+          <w:rFonts w:ascii="Times New Roman" w:hAnsi="Times New Roman" w:cs="Times New Roman"/>
+          <w:lang w:val="en-IN"/>
+        </w:rPr>
+        <w:t xml:space="preserve">that </w:t>
+      </w:r>
+      <w:r>
+        <w:rPr>
+          <w:rFonts w:ascii="Times New Roman" w:hAnsi="Times New Roman" w:cs="Times New Roman"/>
+          <w:lang w:val="en-IN"/>
+        </w:rPr>
+        <w:t xml:space="preserve">31 </w:t>
+      </w:r>
+      <w:r>
+        <w:rPr>
+          <w:rFonts w:ascii="Times New Roman" w:hAnsi="Times New Roman" w:cs="Times New Roman"/>
+          <w:lang w:val="en-IN"/>
+        </w:rPr>
+        <w:t>of 289 features are optimal, as additional features</w:t>
+      </w:r>
+      <w:r>
+        <w:rPr>
+          <w:rFonts w:ascii="Times New Roman" w:hAnsi="Times New Roman" w:cs="Times New Roman"/>
+          <w:lang w:val="en-IN"/>
+        </w:rPr>
+        <w:t xml:space="preserve"> stop</w:t>
+      </w:r>
+      <w:r>
+        <w:rPr>
+          <w:rFonts w:ascii="Times New Roman" w:hAnsi="Times New Roman" w:cs="Times New Roman"/>
+          <w:lang w:val="en-IN"/>
+        </w:rPr>
+        <w:t>ped</w:t>
+      </w:r>
+      <w:r>
+        <w:rPr>
+          <w:rFonts w:ascii="Times New Roman" w:hAnsi="Times New Roman" w:cs="Times New Roman"/>
+          <w:lang w:val="en-IN"/>
+        </w:rPr>
+        <w:t xml:space="preserve"> improving</w:t>
+      </w:r>
+      <w:r>
+        <w:rPr>
+          <w:rFonts w:ascii="Times New Roman" w:hAnsi="Times New Roman" w:cs="Times New Roman"/>
+          <w:lang w:val="en-IN"/>
+        </w:rPr>
+        <w:t xml:space="preserve"> cross-validation.</w:t>
+      </w:r>
+      <w:r>
+        <w:rPr>
+          <w:rFonts w:ascii="Times New Roman" w:hAnsi="Times New Roman" w:cs="Times New Roman"/>
+        </w:rPr>
         <w:t xml:space="preserve"> </w:t>
       </w:r>
       <w:r>
@@ -4256,39 +4493,102 @@
           <w:rFonts w:ascii="Times New Roman" w:hAnsi="Times New Roman" w:cs="Times New Roman"/>
           <w:lang w:val="en-IN"/>
         </w:rPr>
-        <w:t xml:space="preserve">shows </w:t>
+        <w:t>The correlation h</w:t>
       </w:r>
       <w:r>
         <w:rPr>
           <w:rFonts w:ascii="Times New Roman" w:hAnsi="Times New Roman" w:cs="Times New Roman"/>
           <w:lang w:val="en-IN"/>
         </w:rPr>
-        <w:t xml:space="preserve">that </w:t>
+        <w:t>eatmap</w:t>
       </w:r>
       <w:r>
         <w:rPr>
           <w:rFonts w:ascii="Times New Roman" w:hAnsi="Times New Roman" w:cs="Times New Roman"/>
           <w:lang w:val="en-IN"/>
         </w:rPr>
-        <w:t xml:space="preserve">31 features </w:t>
+        <w:t xml:space="preserve"> and the feature </w:t>
       </w:r>
       <w:r>
         <w:rPr>
           <w:rFonts w:ascii="Times New Roman" w:hAnsi="Times New Roman" w:cs="Times New Roman"/>
           <w:lang w:val="en-IN"/>
         </w:rPr>
-        <w:t>out of 289 are optimal, as additional descriptors stop improving</w:t>
+        <w:t>importance scores</w:t>
       </w:r>
       <w:r>
         <w:rPr>
           <w:rFonts w:ascii="Times New Roman" w:hAnsi="Times New Roman" w:cs="Times New Roman"/>
           <w:lang w:val="en-IN"/>
         </w:rPr>
-        <w:t xml:space="preserve"> cross-validation.</w:t>
-      </w:r>
-      <w:r>
-        <w:rPr>
-          <w:rFonts w:ascii="Times New Roman" w:hAnsi="Times New Roman" w:cs="Times New Roman"/>
+        <w:t xml:space="preserve"> for the 31 features are shown in Figure 2.  </w:t>
+      </w:r>
+      <w:r>
+        <w:rPr>
+          <w:rFonts w:ascii="Times New Roman" w:hAnsi="Times New Roman" w:cs="Times New Roman"/>
+        </w:rPr>
+        <w:t xml:space="preserve">On the other hand, the </w:t>
+      </w:r>
+      <w:proofErr w:type="spellStart"/>
+      <w:r>
+        <w:rPr>
+          <w:rFonts w:ascii="Times New Roman" w:hAnsi="Times New Roman" w:cs="Times New Roman"/>
+        </w:rPr>
+        <w:t>SelectFromModel</w:t>
+      </w:r>
+      <w:proofErr w:type="spellEnd"/>
+      <w:r>
+        <w:rPr>
+          <w:rFonts w:ascii="Times New Roman" w:hAnsi="Times New Roman" w:cs="Times New Roman"/>
+        </w:rPr>
+        <w:t xml:space="preserve"> approach works</w:t>
+      </w:r>
+      <w:r>
+        <w:rPr>
+          <w:rFonts w:ascii="Times New Roman" w:hAnsi="Times New Roman" w:cs="Times New Roman"/>
+          <w:lang w:val="en-IN"/>
+        </w:rPr>
+        <w:t xml:space="preserve"> differently</w:t>
+      </w:r>
+      <w:r>
+        <w:rPr>
+          <w:rFonts w:ascii="Times New Roman" w:hAnsi="Times New Roman" w:cs="Times New Roman"/>
+          <w:lang w:val="en-IN"/>
+        </w:rPr>
+        <w:t xml:space="preserve">. </w:t>
+      </w:r>
+      <w:r>
+        <w:rPr>
+          <w:rFonts w:ascii="Times New Roman" w:hAnsi="Times New Roman" w:cs="Times New Roman"/>
+          <w:lang w:val="en-IN"/>
+        </w:rPr>
+        <w:t>In this, a single random forest with threshold='mean' was fit on all 289 features, which means it keeps only descriptors whose impurity-based</w:t>
+      </w:r>
+      <w:r>
+        <w:rPr>
+          <w:rFonts w:ascii="Times New Roman" w:hAnsi="Times New Roman" w:cs="Times New Roman"/>
+          <w:lang w:val="en-IN"/>
+        </w:rPr>
+        <w:t xml:space="preserve"> importance exceeds the forest average</w:t>
+      </w:r>
+      <w:r>
+        <w:rPr>
+          <w:rFonts w:ascii="Times New Roman" w:hAnsi="Times New Roman" w:cs="Times New Roman"/>
+          <w:lang w:val="en-IN"/>
+        </w:rPr>
+        <w:t xml:space="preserve">. </w:t>
+      </w:r>
+      <w:r>
+        <w:rPr>
+          <w:rFonts w:ascii="Times New Roman" w:hAnsi="Times New Roman" w:cs="Times New Roman"/>
+          <w:lang w:val="en-IN"/>
+        </w:rPr>
+        <w:t>Given the aggressive approach, we were left with only</w:t>
+      </w:r>
+      <w:r>
+        <w:rPr>
+          <w:rFonts w:ascii="Times New Roman" w:hAnsi="Times New Roman" w:cs="Times New Roman"/>
+          <w:lang w:val="en-IN"/>
         </w:rPr>
         <w:t xml:space="preserve"> </w:t>
       </w:r>
@@ -4297,6 +4597,34 @@
           <w:rFonts w:ascii="Times New Roman" w:hAnsi="Times New Roman" w:cs="Times New Roman"/>
           <w:lang w:val="en-IN"/>
         </w:rPr>
+        <w:t>13</w:t>
+      </w:r>
+      <w:r>
+        <w:rPr>
+          <w:rFonts w:ascii="Times New Roman" w:hAnsi="Times New Roman" w:cs="Times New Roman"/>
+          <w:lang w:val="en-IN"/>
+        </w:rPr>
+        <w:t xml:space="preserve"> features</w:t>
+      </w:r>
+      <w:r>
+        <w:rPr>
+          <w:rFonts w:ascii="Times New Roman" w:hAnsi="Times New Roman" w:cs="Times New Roman"/>
+          <w:lang w:val="en-IN"/>
+        </w:rPr>
+        <w:t>.</w:t>
+      </w:r>
+      <w:r>
+        <w:rPr>
+          <w:rFonts w:ascii="Times New Roman" w:hAnsi="Times New Roman" w:cs="Times New Roman"/>
+          <w:lang w:val="en-IN"/>
+        </w:rPr>
+        <w:t xml:space="preserve"> </w:t>
+      </w:r>
+      <w:r>
+        <w:rPr>
+          <w:rFonts w:ascii="Times New Roman" w:hAnsi="Times New Roman" w:cs="Times New Roman"/>
+          <w:lang w:val="en-IN"/>
+        </w:rPr>
         <w:t>The correlation h</w:t>
       </w:r>
       <w:r>
@@ -4325,160 +4653,7 @@
           <w:rFonts w:ascii="Times New Roman" w:hAnsi="Times New Roman" w:cs="Times New Roman"/>
           <w:lang w:val="en-IN"/>
         </w:rPr>
-        <w:t xml:space="preserve"> for the 31 features are shown in Figure 2.  </w:t>
-      </w:r>
-      <w:r>
-        <w:rPr>
-          <w:rFonts w:ascii="Times New Roman" w:hAnsi="Times New Roman" w:cs="Times New Roman"/>
-        </w:rPr>
-        <w:t xml:space="preserve">On the other hand, the </w:t>
-      </w:r>
-      <w:proofErr w:type="spellStart"/>
-      <w:r>
-        <w:rPr>
-          <w:rFonts w:ascii="Times New Roman" w:hAnsi="Times New Roman" w:cs="Times New Roman"/>
-        </w:rPr>
-        <w:t>SelectFromModel</w:t>
-      </w:r>
-      <w:proofErr w:type="spellEnd"/>
-      <w:r>
-        <w:rPr>
-          <w:rFonts w:ascii="Times New Roman" w:hAnsi="Times New Roman" w:cs="Times New Roman"/>
-        </w:rPr>
-        <w:t xml:space="preserve"> approach works</w:t>
-      </w:r>
-      <w:r>
-        <w:rPr>
-          <w:rFonts w:ascii="Times New Roman" w:hAnsi="Times New Roman" w:cs="Times New Roman"/>
-          <w:lang w:val="en-IN"/>
-        </w:rPr>
-        <w:t xml:space="preserve"> differently</w:t>
-      </w:r>
-      <w:r>
-        <w:rPr>
-          <w:rFonts w:ascii="Times New Roman" w:hAnsi="Times New Roman" w:cs="Times New Roman"/>
-          <w:lang w:val="en-IN"/>
-        </w:rPr>
-        <w:t xml:space="preserve">. </w:t>
-      </w:r>
-      <w:r>
-        <w:rPr>
-          <w:rFonts w:ascii="Times New Roman" w:hAnsi="Times New Roman" w:cs="Times New Roman"/>
-          <w:lang w:val="en-IN"/>
-        </w:rPr>
-        <w:t>In this, a single random forest with threshold='mean' was fit on all 289 features, which means it keeps only descriptors whose impurity-based</w:t>
-      </w:r>
-      <w:r>
-        <w:rPr>
-          <w:rFonts w:ascii="Times New Roman" w:hAnsi="Times New Roman" w:cs="Times New Roman"/>
-          <w:lang w:val="en-IN"/>
-        </w:rPr>
-        <w:t xml:space="preserve"> importance exceeds the forest average</w:t>
-      </w:r>
-      <w:r>
-        <w:rPr>
-          <w:rFonts w:ascii="Times New Roman" w:hAnsi="Times New Roman" w:cs="Times New Roman"/>
-          <w:lang w:val="en-IN"/>
-        </w:rPr>
-        <w:t xml:space="preserve">. </w:t>
-      </w:r>
-      <w:r>
-        <w:rPr>
-          <w:rFonts w:ascii="Times New Roman" w:hAnsi="Times New Roman" w:cs="Times New Roman"/>
-          <w:lang w:val="en-IN"/>
-        </w:rPr>
-        <w:t xml:space="preserve">As it is an aggressive approach, we were left with just </w:t>
-      </w:r>
-      <w:r>
-        <w:rPr>
-          <w:rFonts w:ascii="Times New Roman" w:hAnsi="Times New Roman" w:cs="Times New Roman"/>
-          <w:lang w:val="en-IN"/>
-        </w:rPr>
-        <w:t>13</w:t>
-      </w:r>
-      <w:r>
-        <w:rPr>
-          <w:rFonts w:ascii="Times New Roman" w:hAnsi="Times New Roman" w:cs="Times New Roman"/>
-          <w:lang w:val="en-IN"/>
-        </w:rPr>
-        <w:t xml:space="preserve"> features</w:t>
-      </w:r>
-      <w:r>
-        <w:rPr>
-          <w:rFonts w:ascii="Times New Roman" w:hAnsi="Times New Roman" w:cs="Times New Roman"/>
-          <w:lang w:val="en-IN"/>
-        </w:rPr>
-        <w:t>.</w:t>
-      </w:r>
-      <w:r>
-        <w:rPr>
-          <w:rFonts w:ascii="Times New Roman" w:hAnsi="Times New Roman" w:cs="Times New Roman"/>
-          <w:lang w:val="en-IN"/>
-        </w:rPr>
-        <w:t xml:space="preserve"> </w:t>
-      </w:r>
-      <w:r>
-        <w:rPr>
-          <w:rFonts w:ascii="Times New Roman" w:hAnsi="Times New Roman" w:cs="Times New Roman"/>
-          <w:lang w:val="en-IN"/>
-        </w:rPr>
-        <w:t>The correlation h</w:t>
-      </w:r>
-      <w:r>
-        <w:rPr>
-          <w:rFonts w:ascii="Times New Roman" w:hAnsi="Times New Roman" w:cs="Times New Roman"/>
-          <w:lang w:val="en-IN"/>
-        </w:rPr>
-        <w:t>eatmap</w:t>
-      </w:r>
-      <w:r>
-        <w:rPr>
-          <w:rFonts w:ascii="Times New Roman" w:hAnsi="Times New Roman" w:cs="Times New Roman"/>
-          <w:lang w:val="en-IN"/>
-        </w:rPr>
-        <w:t xml:space="preserve"> and the feature </w:t>
-      </w:r>
-      <w:r>
-        <w:rPr>
-          <w:rFonts w:ascii="Times New Roman" w:hAnsi="Times New Roman" w:cs="Times New Roman"/>
-          <w:lang w:val="en-IN"/>
-        </w:rPr>
-        <w:t>importance scores</w:t>
-      </w:r>
-      <w:r>
-        <w:rPr>
-          <w:rFonts w:ascii="Times New Roman" w:hAnsi="Times New Roman" w:cs="Times New Roman"/>
-          <w:lang w:val="en-IN"/>
-        </w:rPr>
-        <w:t xml:space="preserve"> for the </w:t>
-      </w:r>
-      <w:r>
-        <w:rPr>
-          <w:rFonts w:ascii="Times New Roman" w:hAnsi="Times New Roman" w:cs="Times New Roman"/>
-          <w:lang w:val="en-IN"/>
-        </w:rPr>
-        <w:t>13</w:t>
-      </w:r>
-      <w:r>
-        <w:rPr>
-          <w:rFonts w:ascii="Times New Roman" w:hAnsi="Times New Roman" w:cs="Times New Roman"/>
-          <w:lang w:val="en-IN"/>
-        </w:rPr>
-        <w:t xml:space="preserve"> features are shown in Figure </w:t>
-      </w:r>
-      <w:r>
-        <w:rPr>
-          <w:rFonts w:ascii="Times New Roman" w:hAnsi="Times New Roman" w:cs="Times New Roman"/>
-          <w:lang w:val="en-IN"/>
-        </w:rPr>
-        <w:t>3</w:t>
-      </w:r>
-      <w:r>
-        <w:rPr>
-          <w:rFonts w:ascii="Times New Roman" w:hAnsi="Times New Roman" w:cs="Times New Roman"/>
-          <w:lang w:val="en-IN"/>
-        </w:rPr>
-        <w:t>.</w:t>
+        <w:t xml:space="preserve"> for the 13 features are shown in Figure 3.</w:t>
       </w:r>
     </w:p>
     <w:p>
@@ -4645,13 +4820,7 @@
         <w:rPr>
           <w:rFonts w:ascii="Times New Roman" w:hAnsi="Times New Roman" w:cs="Times New Roman"/>
         </w:rPr>
-        <w:t xml:space="preserve"> by </w:t>
-      </w:r>
-      <w:r>
-        <w:rPr>
-          <w:rFonts w:ascii="Times New Roman" w:hAnsi="Times New Roman" w:cs="Times New Roman"/>
-        </w:rPr>
-        <w:t xml:space="preserve">the </w:t>
+        <w:t xml:space="preserve"> by the </w:t>
       </w:r>
       <w:proofErr w:type="spellStart"/>
       <w:r>
@@ -4702,7 +4871,19 @@
         <w:rPr>
           <w:rFonts w:ascii="Times New Roman" w:hAnsi="Times New Roman" w:cs="Times New Roman"/>
         </w:rPr>
-        <w:t xml:space="preserve">Regressors—random forest, </w:t>
+        <w:t>Regressors</w:t>
+      </w:r>
+      <w:r>
+        <w:rPr>
+          <w:rFonts w:ascii="Times New Roman" w:hAnsi="Times New Roman" w:cs="Times New Roman"/>
+        </w:rPr>
+        <w:t xml:space="preserve">: </w:t>
+      </w:r>
+      <w:r>
+        <w:rPr>
+          <w:rFonts w:ascii="Times New Roman" w:hAnsi="Times New Roman" w:cs="Times New Roman"/>
+        </w:rPr>
+        <w:t xml:space="preserve">random forest, </w:t>
       </w:r>
       <w:proofErr w:type="spellStart"/>
       <w:r>
@@ -4730,7 +4911,25 @@
         <w:rPr>
           <w:rFonts w:ascii="Times New Roman" w:hAnsi="Times New Roman" w:cs="Times New Roman"/>
         </w:rPr>
-        <w:t>, SVR, and Gaussian process</w:t>
+        <w:t xml:space="preserve">, </w:t>
+      </w:r>
+      <w:r>
+        <w:rPr>
+          <w:rFonts w:ascii="Times New Roman" w:hAnsi="Times New Roman" w:cs="Times New Roman"/>
+        </w:rPr>
+        <w:t>Support Vector Regression</w:t>
+      </w:r>
+      <w:r>
+        <w:rPr>
+          <w:rFonts w:ascii="Times New Roman" w:hAnsi="Times New Roman" w:cs="Times New Roman"/>
+        </w:rPr>
+        <w:t xml:space="preserve"> (</w:t>
+      </w:r>
+      <w:r>
+        <w:rPr>
+          <w:rFonts w:ascii="Times New Roman" w:hAnsi="Times New Roman" w:cs="Times New Roman"/>
+        </w:rPr>
+        <w:t>SVR</w:t>
       </w:r>
       <w:r>
         <w:rPr>
@@ -4742,6 +4941,18 @@
         <w:rPr>
           <w:rFonts w:ascii="Times New Roman" w:hAnsi="Times New Roman" w:cs="Times New Roman"/>
         </w:rPr>
+        <w:t>, and Gaussian process</w:t>
+      </w:r>
+      <w:r>
+        <w:rPr>
+          <w:rFonts w:ascii="Times New Roman" w:hAnsi="Times New Roman" w:cs="Times New Roman"/>
+        </w:rPr>
+        <w:t>)</w:t>
+      </w:r>
+      <w:r>
+        <w:rPr>
+          <w:rFonts w:ascii="Times New Roman" w:hAnsi="Times New Roman" w:cs="Times New Roman"/>
+        </w:rPr>
         <w:t xml:space="preserve"> were built using the </w:t>
       </w:r>
       <w:r>
@@ -4754,25 +4965,25 @@
         <w:rPr>
           <w:rFonts w:ascii="Times New Roman" w:hAnsi="Times New Roman" w:cs="Times New Roman"/>
         </w:rPr>
-        <w:t>dataset</w:t>
-      </w:r>
-      <w:r>
-        <w:rPr>
-          <w:rFonts w:ascii="Times New Roman" w:hAnsi="Times New Roman" w:cs="Times New Roman"/>
-        </w:rPr>
-        <w:t>s</w:t>
-      </w:r>
-      <w:r>
-        <w:rPr>
-          <w:rFonts w:ascii="Times New Roman" w:hAnsi="Times New Roman" w:cs="Times New Roman"/>
-        </w:rPr>
-        <w:t xml:space="preserve">. Among various models, the SVR (Support Vector Regression) model outperformed the rest of the models in forecasting emission energy with the dataset </w:t>
-      </w:r>
-      <w:r>
-        <w:rPr>
-          <w:rFonts w:ascii="Times New Roman" w:hAnsi="Times New Roman" w:cs="Times New Roman"/>
-        </w:rPr>
-        <w:t xml:space="preserve">from </w:t>
+        <w:t xml:space="preserve">datasets. Among </w:t>
+      </w:r>
+      <w:r>
+        <w:rPr>
+          <w:rFonts w:ascii="Times New Roman" w:hAnsi="Times New Roman" w:cs="Times New Roman"/>
+        </w:rPr>
+        <w:t>the models, the SVR model outperformed the others in forecasting emission energies using</w:t>
+      </w:r>
+      <w:r>
+        <w:rPr>
+          <w:rFonts w:ascii="Times New Roman" w:hAnsi="Times New Roman" w:cs="Times New Roman"/>
+        </w:rPr>
+        <w:t xml:space="preserve"> the dataset from </w:t>
+      </w:r>
+      <w:r>
+        <w:rPr>
+          <w:rFonts w:ascii="Times New Roman" w:hAnsi="Times New Roman" w:cs="Times New Roman"/>
+        </w:rPr>
+        <w:t xml:space="preserve">the </w:t>
       </w:r>
       <w:proofErr w:type="spellStart"/>
       <w:r>
@@ -4799,20 +5010,16 @@
         <w:rPr>
           <w:rFonts w:ascii="Times New Roman" w:hAnsi="Times New Roman" w:cs="Times New Roman"/>
         </w:rPr>
-        <w:t xml:space="preserve"> technique also performed well.</w:t>
-      </w:r>
-      <w:r>
-        <w:rPr>
-          <w:rFonts w:ascii="Times New Roman" w:hAnsi="Times New Roman" w:cs="Times New Roman"/>
-        </w:rPr>
-        <w:t xml:space="preserve"> We have </w:t>
-      </w:r>
-      <w:r>
-        <w:rPr>
-          <w:rFonts w:ascii="Times New Roman" w:hAnsi="Times New Roman" w:cs="Times New Roman"/>
-        </w:rPr>
-        <w:t>summarized</w:t>
-      </w:r>
+        <w:t xml:space="preserve"> technique also performed well. We have </w:t>
+      </w:r>
+      <w:proofErr w:type="spellStart"/>
+      <w:r>
+        <w:rPr>
+          <w:rFonts w:ascii="Times New Roman" w:hAnsi="Times New Roman" w:cs="Times New Roman"/>
+        </w:rPr>
+        <w:t>summarised</w:t>
+      </w:r>
+      <w:proofErr w:type="spellEnd"/>
       <w:r>
         <w:rPr>
           <w:rFonts w:ascii="Times New Roman" w:hAnsi="Times New Roman" w:cs="Times New Roman"/>
@@ -4835,38 +5042,27 @@
         <w:rPr>
           <w:rFonts w:ascii="Times New Roman" w:hAnsi="Times New Roman" w:cs="Times New Roman"/>
         </w:rPr>
-        <w:t xml:space="preserve">. </w:t>
-      </w:r>
-      <w:r>
-        <w:rPr>
-          <w:rFonts w:ascii="Times New Roman" w:hAnsi="Times New Roman" w:cs="Times New Roman"/>
-          <w:highlight w:val="green"/>
-        </w:rPr>
-        <w:t>Every r</w:t>
-      </w:r>
-      <w:r>
-        <w:rPr>
-          <w:rFonts w:ascii="Times New Roman" w:hAnsi="Times New Roman" w:cs="Times New Roman"/>
-        </w:rPr>
-        <w:t xml:space="preserve">egressor in Table 1 was tuned by </w:t>
-      </w:r>
-      <w:r>
-        <w:rPr>
-          <w:rFonts w:ascii="Times New Roman" w:hAnsi="Times New Roman" w:cs="Times New Roman"/>
-        </w:rPr>
-        <w:t>randomized</w:t>
-      </w:r>
-      <w:r>
-        <w:rPr>
-          <w:rFonts w:ascii="Times New Roman" w:hAnsi="Times New Roman" w:cs="Times New Roman"/>
-        </w:rPr>
-        <w:t xml:space="preserve"> search (15 trials, five-fold </w:t>
-      </w:r>
-      <w:r>
-        <w:rPr>
-          <w:rFonts w:ascii="Times New Roman" w:hAnsi="Times New Roman" w:cs="Times New Roman"/>
-        </w:rPr>
-        <w:t>cross validation</w:t>
+        <w:t>. Every regressor</w:t>
+      </w:r>
+      <w:r>
+        <w:rPr>
+          <w:rFonts w:ascii="Times New Roman" w:hAnsi="Times New Roman" w:cs="Times New Roman"/>
+        </w:rPr>
+        <w:t xml:space="preserve"> in Table 1 was tuned by </w:t>
+      </w:r>
+      <w:proofErr w:type="spellStart"/>
+      <w:r>
+        <w:rPr>
+          <w:rFonts w:ascii="Times New Roman" w:hAnsi="Times New Roman" w:cs="Times New Roman"/>
+        </w:rPr>
+        <w:t>randomised</w:t>
+      </w:r>
+      <w:proofErr w:type="spellEnd"/>
+      <w:r>
+        <w:rPr>
+          <w:rFonts w:ascii="Times New Roman" w:hAnsi="Times New Roman" w:cs="Times New Roman"/>
+        </w:rPr>
+        <w:t xml:space="preserve"> search (15 trials, five-fold cross-validation</w:t>
       </w:r>
       <w:r>
         <w:rPr>
@@ -6365,8 +6561,8 @@
           <w:lang w:val="en-IN"/>
         </w:rPr>
       </w:pPr>
-      <w:bookmarkStart w:id="4" w:name="X577ad8b70f157f06b52bd060450126e19a14a18"/>
-      <w:bookmarkStart w:id="5" w:name="X03c0cfcb3e1e8831e2b69bfb9dc75e9189496fb"/>
+      <w:bookmarkStart w:id="4" w:name="X03c0cfcb3e1e8831e2b69bfb9dc75e9189496fb"/>
+      <w:bookmarkStart w:id="5" w:name="X577ad8b70f157f06b52bd060450126e19a14a18"/>
       <w:bookmarkEnd w:id="3"/>
       <w:r>
         <w:rPr>
@@ -6755,79 +6951,73 @@
         <w:rPr>
           <w:rFonts w:ascii="Times New Roman" w:hAnsi="Times New Roman" w:cs="Times New Roman"/>
         </w:rPr>
+        <w:t xml:space="preserve"> perovskite</w:t>
+      </w:r>
+      <w:r>
+        <w:rPr>
+          <w:rFonts w:ascii="Times New Roman" w:hAnsi="Times New Roman" w:cs="Times New Roman"/>
+        </w:rPr>
         <w:t xml:space="preserve"> </w:t>
       </w:r>
       <w:r>
         <w:rPr>
           <w:rFonts w:ascii="Times New Roman" w:hAnsi="Times New Roman" w:cs="Times New Roman"/>
         </w:rPr>
-        <w:t>perovskite</w:t>
-      </w:r>
-      <w:r>
-        <w:rPr>
-          <w:rFonts w:ascii="Times New Roman" w:hAnsi="Times New Roman" w:cs="Times New Roman"/>
-        </w:rPr>
+        <w:t>precursor</w:t>
+      </w:r>
+      <w:r>
+        <w:rPr>
+          <w:rFonts w:ascii="Times New Roman" w:hAnsi="Times New Roman" w:cs="Times New Roman"/>
+        </w:rPr>
+        <w:t>.</w:t>
+      </w:r>
+      <w:r>
         <w:t xml:space="preserve"> </w:t>
       </w:r>
       <w:r>
         <w:rPr>
           <w:rFonts w:ascii="Times New Roman" w:hAnsi="Times New Roman" w:cs="Times New Roman"/>
         </w:rPr>
-        <w:t>precursor</w:t>
-      </w:r>
-      <w:r>
-        <w:rPr>
-          <w:rFonts w:ascii="Times New Roman" w:hAnsi="Times New Roman" w:cs="Times New Roman"/>
-        </w:rPr>
-        <w:t>.</w:t>
-      </w:r>
-      <w:r>
+        <w:t>They do not, by themselves, specify a single n phase</w:t>
+      </w:r>
+      <w:r>
+        <w:rPr>
+          <w:rFonts w:ascii="Times New Roman" w:hAnsi="Times New Roman" w:cs="Times New Roman"/>
+        </w:rPr>
+        <w:t xml:space="preserve">, </w:t>
+      </w:r>
+      <w:r>
+        <w:rPr>
+          <w:rFonts w:ascii="Times New Roman" w:hAnsi="Times New Roman" w:cs="Times New Roman"/>
+        </w:rPr>
+        <w:t xml:space="preserve">but they bias the average inorganic bandgap and the competition between bromide and iodide-rich wells. Bromide-rich precursors generally </w:t>
+      </w:r>
+      <w:proofErr w:type="spellStart"/>
+      <w:r>
+        <w:rPr>
+          <w:rFonts w:ascii="Times New Roman" w:hAnsi="Times New Roman" w:cs="Times New Roman"/>
+        </w:rPr>
+        <w:t>favour</w:t>
+      </w:r>
+      <w:proofErr w:type="spellEnd"/>
+      <w:r>
+        <w:rPr>
+          <w:rFonts w:ascii="Times New Roman" w:hAnsi="Times New Roman" w:cs="Times New Roman"/>
+        </w:rPr>
         <w:t xml:space="preserve"> </w:t>
       </w:r>
-      <w:r>
-        <w:rPr>
-          <w:rFonts w:ascii="Times New Roman" w:hAnsi="Times New Roman" w:cs="Times New Roman"/>
-        </w:rPr>
-        <w:t>They do not, by themselves, specify a single n phase</w:t>
-      </w:r>
-      <w:r>
-        <w:rPr>
-          <w:rFonts w:ascii="Times New Roman" w:hAnsi="Times New Roman" w:cs="Times New Roman"/>
-        </w:rPr>
-        <w:t xml:space="preserve">, </w:t>
-      </w:r>
-      <w:r>
-        <w:rPr>
-          <w:rFonts w:ascii="Times New Roman" w:hAnsi="Times New Roman" w:cs="Times New Roman"/>
-        </w:rPr>
-        <w:t xml:space="preserve">but they bias the average inorganic bandgap and the competition between bromide and iodide-rich wells. Bromide-rich precursors generally </w:t>
-      </w:r>
       <w:proofErr w:type="spellStart"/>
       <w:r>
         <w:rPr>
           <w:rFonts w:ascii="Times New Roman" w:hAnsi="Times New Roman" w:cs="Times New Roman"/>
         </w:rPr>
-        <w:t>favour</w:t>
+        <w:t>hypsochromic</w:t>
       </w:r>
       <w:proofErr w:type="spellEnd"/>
       <w:r>
         <w:rPr>
           <w:rFonts w:ascii="Times New Roman" w:hAnsi="Times New Roman" w:cs="Times New Roman"/>
         </w:rPr>
-        <w:t xml:space="preserve"> </w:t>
-      </w:r>
-      <w:proofErr w:type="spellStart"/>
-      <w:r>
-        <w:rPr>
-          <w:rFonts w:ascii="Times New Roman" w:hAnsi="Times New Roman" w:cs="Times New Roman"/>
-        </w:rPr>
-        <w:t>hypsochromic</w:t>
-      </w:r>
-      <w:proofErr w:type="spellEnd"/>
-      <w:r>
-        <w:rPr>
-          <w:rFonts w:ascii="Times New Roman" w:hAnsi="Times New Roman" w:cs="Times New Roman"/>
-        </w:rPr>
         <w:t xml:space="preserve"> shift</w:t>
       </w:r>
       <w:r>
@@ -6840,13 +7030,7 @@
         <w:rPr>
           <w:rFonts w:ascii="Times New Roman" w:hAnsi="Times New Roman" w:cs="Times New Roman"/>
         </w:rPr>
-        <w:t xml:space="preserve"> the spectrum, whereas </w:t>
-      </w:r>
-      <w:r>
-        <w:rPr>
-          <w:rFonts w:ascii="Times New Roman" w:hAnsi="Times New Roman" w:cs="Times New Roman"/>
-        </w:rPr>
-        <w:t>chloride can raise energy further,</w:t>
+        <w:t xml:space="preserve"> the spectrum, whereas chloride can raise energy further,</w:t>
       </w:r>
       <w:r>
         <w:rPr>
@@ -6929,7 +7113,7 @@
         </w:rPr>
         <w:fldChar w:fldCharType="begin">
           <w:fldData xml:space="preserve">PEVuZE5vdGU+PENpdGU+PEF1dGhvcj5LYXJsc3NvbjwvQXV0aG9yPjxZZWFyPjIwMjE8L1llYXI+
-PFJlY051bT42PC9SZWNOdW0+PERpc3BsYXlUZXh0Pls1LCAxNF08L0Rpc3BsYXlUZXh0PjxyZWNv
+PFJlY051bT42PC9SZWNOdW0+PERpc3BsYXlUZXh0Pls1LCAxMl08L0Rpc3BsYXlUZXh0PjxyZWNv
 cmQ+PHJlYy1udW1iZXI+NjwvcmVjLW51bWJlcj48Zm9yZWlnbi1rZXlzPjxrZXkgYXBwPSJFTiIg
 ZGItaWQ9Inc5d3BldzlyYTJzMnNxZXBzdmF2ZHNmMnp4NTV6c3pmZndhZSIgdGltZXN0YW1wPSIx
 Nzc5NjE2NTc0Ij42PC9rZXk+PC9mb3JlaWduLWtleXM+PHJlZi10eXBlIG5hbWU9IkpvdXJuYWwg
@@ -6983,7 +7167,7 @@
         </w:rPr>
         <w:fldChar w:fldCharType="begin">
           <w:fldData xml:space="preserve">PEVuZE5vdGU+PENpdGU+PEF1dGhvcj5LYXJsc3NvbjwvQXV0aG9yPjxZZWFyPjIwMjE8L1llYXI+
-PFJlY051bT42PC9SZWNOdW0+PERpc3BsYXlUZXh0Pls1LCAxNF08L0Rpc3BsYXlUZXh0PjxyZWNv
+PFJlY051bT42PC9SZWNOdW0+PERpc3BsYXlUZXh0Pls1LCAxMl08L0Rpc3BsYXlUZXh0PjxyZWNv
 cmQ+PHJlYy1udW1iZXI+NjwvcmVjLW51bWJlcj48Zm9yZWlnbi1rZXlzPjxrZXkgYXBwPSJFTiIg
 ZGItaWQ9Inc5d3BldzlyYTJzMnNxZXBzdmF2ZHNmMnp4NTV6c3pmZndhZSIgdGltZXN0YW1wPSIx
 Nzc5NjE2NTc0Ij42PC9rZXk+PC9mb3JlaWduLWtleXM+PHJlZi10eXBlIG5hbWU9IkpvdXJuYWwg
@@ -7053,7 +7237,7 @@
           <w:rFonts w:ascii="Times New Roman" w:hAnsi="Times New Roman" w:cs="Times New Roman"/>
           <w:noProof/>
         </w:rPr>
-        <w:t>[5, 14]</w:t>
+        <w:t>[5, 12]</w:t>
       </w:r>
       <w:r>
         <w:rPr>
@@ -7906,107 +8090,16 @@
         </w:rPr>
         <w:t>, the SVR prediction is decomposed as</w:t>
       </w:r>
-    </w:p>
-    <w:p>
-      <w:pPr>
-        <w:pStyle w:val="BodyText"/>
-        <w:spacing w:line="480" w:lineRule="auto"/>
-        <w:jc w:val="both"/>
-        <w:rPr>
-          <w:rFonts w:ascii="Times New Roman" w:hAnsi="Times New Roman" w:cs="Times New Roman"/>
-        </w:rPr>
-      </w:pPr>
-      <w:r>
-        <w:rPr>
-          <w:rFonts w:ascii="Times New Roman" w:hAnsi="Times New Roman" w:cs="Times New Roman"/>
-        </w:rPr>
-        <w:t>$$f(\</w:t>
-      </w:r>
-      <w:proofErr w:type="spellStart"/>
-      <w:r>
-        <w:rPr>
-          <w:rFonts w:ascii="Times New Roman" w:hAnsi="Times New Roman" w:cs="Times New Roman"/>
-        </w:rPr>
-        <w:t>mathbf</w:t>
-      </w:r>
-      <w:proofErr w:type="spellEnd"/>
-      <w:r>
-        <w:rPr>
-          <w:rFonts w:ascii="Times New Roman" w:hAnsi="Times New Roman" w:cs="Times New Roman"/>
-        </w:rPr>
-        <w:t>{x}) = \phi_0 + \sum_{j=</w:t>
-      </w:r>
-      <w:proofErr w:type="gramStart"/>
-      <w:r>
-        <w:rPr>
-          <w:rFonts w:ascii="Times New Roman" w:hAnsi="Times New Roman" w:cs="Times New Roman"/>
-        </w:rPr>
-        <w:t>1}^</w:t>
-      </w:r>
-      <w:proofErr w:type="gramEnd"/>
-      <w:r>
-        <w:rPr>
-          <w:rFonts w:ascii="Times New Roman" w:hAnsi="Times New Roman" w:cs="Times New Roman"/>
-        </w:rPr>
-        <w:t>{p} \</w:t>
-      </w:r>
-      <w:proofErr w:type="spellStart"/>
-      <w:r>
-        <w:rPr>
-          <w:rFonts w:ascii="Times New Roman" w:hAnsi="Times New Roman" w:cs="Times New Roman"/>
-        </w:rPr>
-        <w:t>phi_j</w:t>
-      </w:r>
-      <w:proofErr w:type="spellEnd"/>
-      <w:r>
-        <w:rPr>
-          <w:rFonts w:ascii="Times New Roman" w:hAnsi="Times New Roman" w:cs="Times New Roman"/>
-        </w:rPr>
-        <w:t>(\</w:t>
-      </w:r>
-      <w:proofErr w:type="spellStart"/>
-      <w:r>
-        <w:rPr>
-          <w:rFonts w:ascii="Times New Roman" w:hAnsi="Times New Roman" w:cs="Times New Roman"/>
-        </w:rPr>
-        <w:t>mathbf</w:t>
-      </w:r>
-      <w:proofErr w:type="spellEnd"/>
-      <w:r>
-        <w:rPr>
-          <w:rFonts w:ascii="Times New Roman" w:hAnsi="Times New Roman" w:cs="Times New Roman"/>
-        </w:rPr>
-        <w:t>{x}</w:t>
-      </w:r>
-      <w:proofErr w:type="gramStart"/>
-      <w:r>
-        <w:rPr>
-          <w:rFonts w:ascii="Times New Roman" w:hAnsi="Times New Roman" w:cs="Times New Roman"/>
-        </w:rPr>
-        <w:t>),$</w:t>
-      </w:r>
-      <w:proofErr w:type="gramEnd"/>
-      <w:r>
-        <w:rPr>
-          <w:rFonts w:ascii="Times New Roman" w:hAnsi="Times New Roman" w:cs="Times New Roman"/>
-        </w:rPr>
-        <w:t>$</w:t>
-      </w:r>
-    </w:p>
-    <w:p>
-      <w:pPr>
-        <w:pStyle w:val="BodyText"/>
-        <w:spacing w:line="480" w:lineRule="auto"/>
-        <w:jc w:val="both"/>
-        <w:rPr>
-          <w:rFonts w:ascii="Times New Roman" w:hAnsi="Times New Roman" w:cs="Times New Roman"/>
-        </w:rPr>
-      </w:pPr>
-      <w:r>
-        <w:rPr>
-          <w:rFonts w:ascii="Times New Roman" w:hAnsi="Times New Roman" w:cs="Times New Roman"/>
-        </w:rPr>
-        <w:lastRenderedPageBreak/>
+      <w:r>
+        <w:rPr>
+          <w:rFonts w:ascii="Times New Roman" w:hAnsi="Times New Roman" w:cs="Times New Roman"/>
+        </w:rPr>
+        <w:t xml:space="preserve"> </w:t>
+      </w:r>
+      <w:r>
+        <w:rPr>
+          <w:rFonts w:ascii="Times New Roman" w:hAnsi="Times New Roman" w:cs="Times New Roman"/>
+        </w:rPr>
         <w:t xml:space="preserve">where </w:t>
       </w:r>
       <w:r>
@@ -8065,7 +8158,14 @@
         <w:rPr>
           <w:rFonts w:ascii="Times New Roman" w:hAnsi="Times New Roman" w:cs="Times New Roman"/>
         </w:rPr>
-        <w:t xml:space="preserve"> is the Shapley contribution of descriptor </w:t>
+        <w:t xml:space="preserve"> is the Shapley contribution of </w:t>
+      </w:r>
+      <w:r>
+        <w:rPr>
+          <w:rFonts w:ascii="Times New Roman" w:hAnsi="Times New Roman" w:cs="Times New Roman"/>
+        </w:rPr>
+        <w:lastRenderedPageBreak/>
+        <w:t xml:space="preserve">descriptor </w:t>
       </w:r>
       <w:r>
         <w:rPr>
@@ -8954,14 +9054,7 @@
               <w:rPr>
                 <w:rFonts w:ascii="Times New Roman" w:hAnsi="Times New Roman" w:cs="Times New Roman"/>
               </w:rPr>
-              <w:t>Bromide on the primary ammonium spacer increases halide incorporation on the organic site and blue-shifts the emitting manifold relative to iodide-</w:t>
-            </w:r>
-            <w:r>
-              <w:rPr>
-                <w:rFonts w:ascii="Times New Roman" w:hAnsi="Times New Roman" w:cs="Times New Roman"/>
-              </w:rPr>
-              <w:lastRenderedPageBreak/>
-              <w:t>only inks.</w:t>
+              <w:t>Bromide on the primary ammonium spacer increases halide incorporation on the organic site and blue-shifts the emitting manifold relative to iodide-only inks.</w:t>
             </w:r>
           </w:p>
         </w:tc>
@@ -8982,7 +9075,6 @@
               <w:rPr>
                 <w:rFonts w:ascii="Times New Roman" w:hAnsi="Times New Roman" w:cs="Times New Roman"/>
               </w:rPr>
-              <w:lastRenderedPageBreak/>
               <w:t>3</w:t>
             </w:r>
           </w:p>
@@ -9077,7 +9169,14 @@
               <w:rPr>
                 <w:rFonts w:ascii="Times New Roman" w:hAnsi="Times New Roman" w:cs="Times New Roman"/>
               </w:rPr>
-              <w:t xml:space="preserve"> ≈ −0.98)</w:t>
+              <w:t xml:space="preserve"> ≈ </w:t>
+            </w:r>
+            <w:r>
+              <w:rPr>
+                <w:rFonts w:ascii="Times New Roman" w:hAnsi="Times New Roman" w:cs="Times New Roman"/>
+              </w:rPr>
+              <w:lastRenderedPageBreak/>
+              <w:t>−0.98)</w:t>
             </w:r>
           </w:p>
         </w:tc>
@@ -9097,6 +9196,7 @@
               <w:rPr>
                 <w:rFonts w:ascii="Times New Roman" w:hAnsi="Times New Roman" w:cs="Times New Roman"/>
               </w:rPr>
+              <w:lastRenderedPageBreak/>
               <w:t>Formamidinium</w:t>
             </w:r>
             <w:proofErr w:type="spellEnd"/>
@@ -9104,7 +9204,14 @@
               <w:rPr>
                 <w:rFonts w:ascii="Times New Roman" w:hAnsi="Times New Roman" w:cs="Times New Roman"/>
               </w:rPr>
-              <w:t xml:space="preserve"> iodide fraction enriches iodide character and lowers the effective gap—consistent with red-shifted quasi-2D PL/EL when iodide dominates.</w:t>
+              <w:t xml:space="preserve"> iodide fraction </w:t>
+            </w:r>
+            <w:r>
+              <w:rPr>
+                <w:rFonts w:ascii="Times New Roman" w:hAnsi="Times New Roman" w:cs="Times New Roman"/>
+              </w:rPr>
+              <w:lastRenderedPageBreak/>
+              <w:t>enriches iodide character and lowers the effective gap—consistent with red-shifted quasi-2D PL/EL when iodide dominates.</w:t>
             </w:r>
           </w:p>
         </w:tc>
@@ -9125,6 +9232,7 @@
               <w:rPr>
                 <w:rFonts w:ascii="Times New Roman" w:hAnsi="Times New Roman" w:cs="Times New Roman"/>
               </w:rPr>
+              <w:lastRenderedPageBreak/>
               <w:t>4</w:t>
             </w:r>
           </w:p>
@@ -9822,14 +9930,14 @@
               <w:rPr>
                 <w:rFonts w:ascii="Times New Roman" w:hAnsi="Times New Roman" w:cs="Times New Roman"/>
               </w:rPr>
-              <w:t xml:space="preserve"> fraction </w:t>
+              <w:t xml:space="preserve"> fraction modulates A-site/halide balance; weaker monotonic trend because Cs </w:t>
             </w:r>
             <w:r>
               <w:rPr>
                 <w:rFonts w:ascii="Times New Roman" w:hAnsi="Times New Roman" w:cs="Times New Roman"/>
               </w:rPr>
               <w:lastRenderedPageBreak/>
-              <w:t>modulates A-site/halide balance; weaker monotonic trend because Cs appears with mixed halides across papers.</w:t>
+              <w:t>appears with mixed halides across papers.</w:t>
             </w:r>
           </w:p>
         </w:tc>
@@ -10545,11 +10653,12 @@
         </w:rPr>
       </w:pPr>
       <w:bookmarkStart w:id="6" w:name="wavelength-models-briefly"/>
-      <w:bookmarkEnd w:id="5"/>
+      <w:bookmarkEnd w:id="4"/>
       <w:r>
         <w:rPr>
           <w:noProof/>
         </w:rPr>
+        <w:lastRenderedPageBreak/>
         <w:drawing>
           <wp:inline distT="0" distB="0" distL="0" distR="0" wp14:anchorId="774A154B" wp14:editId="041CC7BF">
             <wp:extent cx="5943600" cy="4712970"/>
@@ -10633,7 +10742,7 @@
         </w:rPr>
       </w:pPr>
       <w:bookmarkStart w:id="7" w:name="X2329d92194691254c9744a2c0f46d62b51ae009"/>
-      <w:bookmarkEnd w:id="4"/>
+      <w:bookmarkEnd w:id="5"/>
       <w:bookmarkEnd w:id="6"/>
       <w:r>
         <w:rPr>
@@ -10669,13 +10778,7 @@
         <w:rPr>
           <w:rFonts w:ascii="Times New Roman" w:hAnsi="Times New Roman" w:cs="Times New Roman"/>
         </w:rPr>
-        <w:t>emission energy forecasting</w:t>
-      </w:r>
-      <w:r>
-        <w:rPr>
-          <w:rFonts w:ascii="Times New Roman" w:hAnsi="Times New Roman" w:cs="Times New Roman"/>
-        </w:rPr>
-        <w:t xml:space="preserve"> model development discussed above</w:t>
+        <w:t>emission energy forecasting model development discussed above</w:t>
       </w:r>
       <w:r>
         <w:rPr>
@@ -10687,13 +10790,7 @@
         <w:rPr>
           <w:rFonts w:ascii="Times New Roman" w:hAnsi="Times New Roman" w:cs="Times New Roman"/>
         </w:rPr>
-        <w:t xml:space="preserve"> now t</w:t>
-      </w:r>
-      <w:r>
-        <w:rPr>
-          <w:rFonts w:ascii="Times New Roman" w:hAnsi="Times New Roman" w:cs="Times New Roman"/>
-        </w:rPr>
-        <w:t xml:space="preserve">o target </w:t>
+        <w:t xml:space="preserve"> now to target </w:t>
       </w:r>
       <w:r>
         <w:rPr>
@@ -10743,13 +10840,7 @@
         <w:rPr>
           <w:rFonts w:ascii="Times New Roman" w:hAnsi="Times New Roman" w:cs="Times New Roman"/>
         </w:rPr>
-        <w:t xml:space="preserve">extracted from the available literature (dataset available on GitHub: SF_DATA_EMISSION_PEAK.xlsx, sheet </w:t>
-      </w:r>
-      <w:r>
-        <w:rPr>
-          <w:rFonts w:ascii="Times New Roman" w:hAnsi="Times New Roman" w:cs="Times New Roman"/>
-        </w:rPr>
-        <w:t xml:space="preserve">EQE_CLEANED) </w:t>
+        <w:t xml:space="preserve">extracted from the available literature (dataset available on GitHub: SF_DATA_EMISSION_PEAK.xlsx, sheet EQE_CLEANED) </w:t>
       </w:r>
       <w:r>
         <w:rPr>
@@ -10767,19 +10858,13 @@
         <w:rPr>
           <w:rFonts w:ascii="Times New Roman" w:hAnsi="Times New Roman" w:cs="Times New Roman"/>
         </w:rPr>
-        <w:t xml:space="preserve">processing variables </w:t>
+        <w:t xml:space="preserve">processing variables (temperature, annealing time) in addition to the compositional columns used for emission. </w:t>
       </w:r>
       <w:r>
         <w:rPr>
           <w:rFonts w:ascii="Times New Roman" w:hAnsi="Times New Roman" w:cs="Times New Roman"/>
         </w:rPr>
         <w:lastRenderedPageBreak/>
-        <w:t xml:space="preserve">(temperature, annealing time) in addition to the compositional columns used for emission. </w:t>
-      </w:r>
-      <w:r>
-        <w:rPr>
-          <w:rFonts w:ascii="Times New Roman" w:hAnsi="Times New Roman" w:cs="Times New Roman"/>
-        </w:rPr>
         <w:t>Thirty-four distinct HTL</w:t>
       </w:r>
       <w:r>
@@ -11113,13 +11198,7 @@
         <w:rPr>
           <w:rFonts w:ascii="Times New Roman" w:hAnsi="Times New Roman" w:cs="Times New Roman"/>
         </w:rPr>
-        <w:t xml:space="preserve">models' performance in predicting the </w:t>
-      </w:r>
-      <w:r>
-        <w:rPr>
-          <w:rFonts w:ascii="Times New Roman" w:hAnsi="Times New Roman" w:cs="Times New Roman"/>
-        </w:rPr>
-        <w:t>EQE</w:t>
+        <w:t>models' performance in predicting the EQE</w:t>
       </w:r>
       <w:r>
         <w:rPr>
@@ -11630,68 +11709,68 @@
         <w:rPr>
           <w:rFonts w:ascii="Times New Roman" w:hAnsi="Times New Roman" w:cs="Times New Roman"/>
         </w:rPr>
+        <w:t>It is worth mentioning that t</w:t>
+      </w:r>
+      <w:r>
+        <w:rPr>
+          <w:rFonts w:ascii="Times New Roman" w:hAnsi="Times New Roman" w:cs="Times New Roman"/>
+        </w:rPr>
+        <w:t xml:space="preserve">he gap between </w:t>
+      </w:r>
+      <w:r>
+        <w:rPr>
+          <w:rFonts w:ascii="Times New Roman" w:hAnsi="Times New Roman" w:cs="Times New Roman"/>
+        </w:rPr>
+        <w:t xml:space="preserve">the emission forecasting model (R2 ≈ 0.95) and the </w:t>
+      </w:r>
+      <w:r>
+        <w:rPr>
+          <w:rFonts w:ascii="Times New Roman" w:hAnsi="Times New Roman" w:cs="Times New Roman"/>
+        </w:rPr>
+        <w:t>EQE</w:t>
+      </w:r>
+      <w:r>
+        <w:rPr>
+          <w:rFonts w:ascii="Times New Roman" w:hAnsi="Times New Roman" w:cs="Times New Roman"/>
+        </w:rPr>
+        <w:t xml:space="preserve"> forecasting model</w:t>
+      </w:r>
+      <w:r>
+        <w:rPr>
+          <w:rFonts w:ascii="Times New Roman" w:hAnsi="Times New Roman" w:cs="Times New Roman"/>
+        </w:rPr>
+        <w:t xml:space="preserve"> (</w:t>
+      </w:r>
+      <w:r>
+        <w:rPr>
+          <w:rFonts w:ascii="Times New Roman" w:hAnsi="Times New Roman" w:cs="Times New Roman"/>
+        </w:rPr>
+        <w:t>R</w:t>
+      </w:r>
+      <w:r>
+        <w:rPr>
+          <w:rFonts w:ascii="Times New Roman" w:hAnsi="Times New Roman" w:cs="Times New Roman"/>
+          <w:vertAlign w:val="superscript"/>
+        </w:rPr>
+        <w:t>2</w:t>
+      </w:r>
+      <w:r>
+        <w:rPr>
+          <w:rFonts w:ascii="Times New Roman" w:hAnsi="Times New Roman" w:cs="Times New Roman"/>
+        </w:rPr>
+        <w:t xml:space="preserve"> ≈ 0.5–0.6) is not a failure of the algorithms. </w:t>
+      </w:r>
+      <w:r>
+        <w:rPr>
+          <w:rFonts w:ascii="Times New Roman" w:hAnsi="Times New Roman" w:cs="Times New Roman"/>
+        </w:rPr>
+        <w:t xml:space="preserve">Rather, there are </w:t>
+      </w:r>
+      <w:r>
+        <w:rPr>
+          <w:rFonts w:ascii="Times New Roman" w:hAnsi="Times New Roman" w:cs="Times New Roman"/>
+        </w:rPr>
         <w:lastRenderedPageBreak/>
-        <w:t>It is worth mentioning that t</w:t>
-      </w:r>
-      <w:r>
-        <w:rPr>
-          <w:rFonts w:ascii="Times New Roman" w:hAnsi="Times New Roman" w:cs="Times New Roman"/>
-        </w:rPr>
-        <w:t xml:space="preserve">he gap between </w:t>
-      </w:r>
-      <w:r>
-        <w:rPr>
-          <w:rFonts w:ascii="Times New Roman" w:hAnsi="Times New Roman" w:cs="Times New Roman"/>
-        </w:rPr>
-        <w:t xml:space="preserve">the emission forecasting model (R2 ≈ 0.95) and the </w:t>
-      </w:r>
-      <w:r>
-        <w:rPr>
-          <w:rFonts w:ascii="Times New Roman" w:hAnsi="Times New Roman" w:cs="Times New Roman"/>
-        </w:rPr>
-        <w:t>EQE</w:t>
-      </w:r>
-      <w:r>
-        <w:rPr>
-          <w:rFonts w:ascii="Times New Roman" w:hAnsi="Times New Roman" w:cs="Times New Roman"/>
-        </w:rPr>
-        <w:t xml:space="preserve"> forecasting model</w:t>
-      </w:r>
-      <w:r>
-        <w:rPr>
-          <w:rFonts w:ascii="Times New Roman" w:hAnsi="Times New Roman" w:cs="Times New Roman"/>
-        </w:rPr>
-        <w:t xml:space="preserve"> (</w:t>
-      </w:r>
-      <w:r>
-        <w:rPr>
-          <w:rFonts w:ascii="Times New Roman" w:hAnsi="Times New Roman" w:cs="Times New Roman"/>
-        </w:rPr>
-        <w:t>R</w:t>
-      </w:r>
-      <w:r>
-        <w:rPr>
-          <w:rFonts w:ascii="Times New Roman" w:hAnsi="Times New Roman" w:cs="Times New Roman"/>
-          <w:vertAlign w:val="superscript"/>
-        </w:rPr>
-        <w:t>2</w:t>
-      </w:r>
-      <w:r>
-        <w:rPr>
-          <w:rFonts w:ascii="Times New Roman" w:hAnsi="Times New Roman" w:cs="Times New Roman"/>
-        </w:rPr>
-        <w:t xml:space="preserve"> ≈ 0.5–0.6) is not a failure of the algorithms. </w:t>
-      </w:r>
-      <w:r>
-        <w:rPr>
-          <w:rFonts w:ascii="Times New Roman" w:hAnsi="Times New Roman" w:cs="Times New Roman"/>
-        </w:rPr>
-        <w:t xml:space="preserve">Rather, there are </w:t>
-      </w:r>
-      <w:r>
-        <w:rPr>
-          <w:rFonts w:ascii="Times New Roman" w:hAnsi="Times New Roman" w:cs="Times New Roman"/>
-        </w:rPr>
         <w:t>straightforward, concrete reasons that caused</w:t>
       </w:r>
       <w:r>
@@ -11736,7 +11815,25 @@
         <w:rPr>
           <w:rFonts w:ascii="Times New Roman" w:hAnsi="Times New Roman" w:cs="Times New Roman"/>
         </w:rPr>
-        <w:t>refractive-index matching</w:t>
+        <w:t xml:space="preserve">refractive-index matching </w:t>
+      </w:r>
+      <w:r>
+        <w:rPr>
+          <w:rFonts w:ascii="Times New Roman" w:hAnsi="Times New Roman" w:cs="Times New Roman"/>
+        </w:rPr>
+        <w:t xml:space="preserve">and the exact measurement protocol (integrated sphere calibration, pixel area, sweep direction) move EQE by several percentage points without changing the precursor stoichiometry. Different laboratories also anneal and antisolvent-quench under conditions that are described in prose but rarely digitized. </w:t>
+      </w:r>
+      <w:r>
+        <w:rPr>
+          <w:rFonts w:ascii="Times New Roman" w:hAnsi="Times New Roman" w:cs="Times New Roman"/>
+        </w:rPr>
+        <w:t xml:space="preserve">Zhang et al. illustrated </w:t>
+      </w:r>
+      <w:r>
+        <w:rPr>
+          <w:rFonts w:ascii="Times New Roman" w:hAnsi="Times New Roman" w:cs="Times New Roman"/>
+        </w:rPr>
+        <w:t>that the data problem in device-targeted ML development persists even with careful molecular featurization.</w:t>
       </w:r>
       <w:r>
         <w:rPr>
@@ -11744,30 +11841,6 @@
         </w:rPr>
         <w:t xml:space="preserve"> </w:t>
       </w:r>
-      <w:r>
-        <w:rPr>
-          <w:rFonts w:ascii="Times New Roman" w:hAnsi="Times New Roman" w:cs="Times New Roman"/>
-        </w:rPr>
-        <w:t xml:space="preserve">and the exact measurement protocol (integrated sphere calibration, pixel area, sweep direction) move EQE by several percentage points without changing the precursor stoichiometry. Different laboratories also anneal and antisolvent-quench under conditions that are described in prose but rarely digitized. </w:t>
-      </w:r>
-      <w:r>
-        <w:rPr>
-          <w:rFonts w:ascii="Times New Roman" w:hAnsi="Times New Roman" w:cs="Times New Roman"/>
-        </w:rPr>
-        <w:t xml:space="preserve">Zhang et al. illustrated </w:t>
-      </w:r>
-      <w:r>
-        <w:rPr>
-          <w:rFonts w:ascii="Times New Roman" w:hAnsi="Times New Roman" w:cs="Times New Roman"/>
-        </w:rPr>
-        <w:t>that the data problem in device-targeted ML development persists even with careful molecular featurization.</w:t>
-      </w:r>
-      <w:r>
-        <w:rPr>
-          <w:rFonts w:ascii="Times New Roman" w:hAnsi="Times New Roman" w:cs="Times New Roman"/>
-        </w:rPr>
-        <w:t xml:space="preserve"> </w:t>
-      </w:r>
       <w:proofErr w:type="spellStart"/>
       <w:r>
         <w:rPr>
@@ -11840,7 +11913,7 @@
         <w:rPr>
           <w:rFonts w:ascii="Times New Roman" w:hAnsi="Times New Roman" w:cs="Times New Roman"/>
         </w:rPr>
-        <w:instrText xml:space="preserve"> ADDIN EN.CITE &lt;EndNote&gt;&lt;Cite&gt;&lt;Author&gt;Zhang&lt;/Author&gt;&lt;Year&gt;2022&lt;/Year&gt;&lt;RecNum&gt;13&lt;/RecNum&gt;&lt;DisplayText&gt;[19]&lt;/DisplayText&gt;&lt;record&gt;&lt;rec-number&gt;13&lt;/rec-number&gt;&lt;foreign-keys&gt;&lt;key app="EN" db-id="w9wpew9ra2s2sqepsvavdsf2zx55zszffwae" timestamp="1779626869"&gt;13&lt;/key&gt;&lt;/foreign-keys&gt;&lt;ref-type name="Journal Article"&gt;17&lt;/ref-type&gt;&lt;contributors&gt;&lt;authors&gt;&lt;author&gt;Zhang, Liang&lt;/author&gt;&lt;author&gt;Li, Na&lt;/author&gt;&lt;author&gt;Liu, Dawei&lt;/author&gt;&lt;author&gt;Tao, Guanhong&lt;/author&gt;&lt;author&gt;Xu, Weidong&lt;/author&gt;&lt;author&gt;Li, Mengmeng&lt;/author&gt;&lt;author&gt;Chu, Ying&lt;/author&gt;&lt;author&gt;Cao, Chensi&lt;/author&gt;&lt;author&gt;Lu, Feiyue&lt;/author&gt;&lt;author&gt;Hao, Chenjie&lt;/author&gt;&lt;author&gt;Zhang, Ju&lt;/author&gt;&lt;author&gt;Cao, Yu&lt;/author&gt;&lt;author&gt;Gao, Feng&lt;/author&gt;&lt;author&gt;Wang, Nana&lt;/author&gt;&lt;author&gt;Zhu, Lin&lt;/author&gt;&lt;author&gt;Huang, Wei&lt;/author&gt;&lt;author&gt;Wang, Jianpu&lt;/author&gt;&lt;/authors&gt;&lt;/contributors&gt;&lt;titles&gt;&lt;title&gt;Deep Learning for Additive Screening in Perovskite Light-Emitting Diodes&lt;/title&gt;&lt;/titles&gt;&lt;pages&gt;e202209337&lt;/pages&gt;&lt;volume&gt;61&lt;/volume&gt;&lt;number&gt;37&lt;/number&gt;&lt;dates&gt;&lt;year&gt;2022&lt;/year&gt;&lt;/dates&gt;&lt;isbn&gt;1433-7851&lt;/isbn&gt;&lt;urls&gt;&lt;related-urls&gt;&lt;url&gt;https://onlinelibrary.wiley.com/doi/abs/10.1002/anie.202209337&lt;/url&gt;&lt;/related-urls&gt;&lt;/urls&gt;&lt;electronic-resource-num&gt;https://doi.org/10.1002/anie.202209337&lt;/electronic-resource-num&gt;&lt;/record&gt;&lt;/Cite&gt;&lt;/EndNote&gt;</w:instrText>
+        <w:instrText xml:space="preserve"> ADDIN EN.CITE &lt;EndNote&gt;&lt;Cite&gt;&lt;Author&gt;Zhang&lt;/Author&gt;&lt;Year&gt;2022&lt;/Year&gt;&lt;RecNum&gt;13&lt;/RecNum&gt;&lt;DisplayText&gt;[22]&lt;/DisplayText&gt;&lt;record&gt;&lt;rec-number&gt;13&lt;/rec-number&gt;&lt;foreign-keys&gt;&lt;key app="EN" db-id="w9wpew9ra2s2sqepsvavdsf2zx55zszffwae" timestamp="1779626869"&gt;13&lt;/key&gt;&lt;/foreign-keys&gt;&lt;ref-type name="Journal Article"&gt;17&lt;/ref-type&gt;&lt;contributors&gt;&lt;authors&gt;&lt;author&gt;Zhang, Liang&lt;/author&gt;&lt;author&gt;Li, Na&lt;/author&gt;&lt;author&gt;Liu, Dawei&lt;/author&gt;&lt;author&gt;Tao, Guanhong&lt;/author&gt;&lt;author&gt;Xu, Weidong&lt;/author&gt;&lt;author&gt;Li, Mengmeng&lt;/author&gt;&lt;author&gt;Chu, Ying&lt;/author&gt;&lt;author&gt;Cao, Chensi&lt;/author&gt;&lt;author&gt;Lu, Feiyue&lt;/author&gt;&lt;author&gt;Hao, Chenjie&lt;/author&gt;&lt;author&gt;Zhang, Ju&lt;/author&gt;&lt;author&gt;Cao, Yu&lt;/author&gt;&lt;author&gt;Gao, Feng&lt;/author&gt;&lt;author&gt;Wang, Nana&lt;/author&gt;&lt;author&gt;Zhu, Lin&lt;/author&gt;&lt;author&gt;Huang, Wei&lt;/author&gt;&lt;author&gt;Wang, Jianpu&lt;/author&gt;&lt;/authors&gt;&lt;/contributors&gt;&lt;titles&gt;&lt;title&gt;Deep Learning for Additive Screening in Perovskite Light-Emitting Diodes&lt;/title&gt;&lt;/titles&gt;&lt;pages&gt;e202209337&lt;/pages&gt;&lt;volume&gt;61&lt;/volume&gt;&lt;number&gt;37&lt;/number&gt;&lt;dates&gt;&lt;year&gt;2022&lt;/year&gt;&lt;/dates&gt;&lt;isbn&gt;1433-7851&lt;/isbn&gt;&lt;urls&gt;&lt;related-urls&gt;&lt;url&gt;https://onlinelibrary.wiley.com/doi/abs/10.1002/anie.202209337&lt;/url&gt;&lt;/related-urls&gt;&lt;/urls&gt;&lt;electronic-resource-num&gt;https://doi.org/10.1002/anie.202209337&lt;/electronic-resource-num&gt;&lt;/record&gt;&lt;/Cite&gt;&lt;/EndNote&gt;</w:instrText>
       </w:r>
       <w:r>
         <w:rPr>
@@ -11853,7 +11926,7 @@
           <w:rFonts w:ascii="Times New Roman" w:hAnsi="Times New Roman" w:cs="Times New Roman"/>
           <w:noProof/>
         </w:rPr>
-        <w:t>[19]</w:t>
+        <w:t>[22]</w:t>
       </w:r>
       <w:r>
         <w:rPr>
@@ -12600,25 +12673,25 @@
       </w:r>
       <w:r>
         <w:tab/>
-        <w:t xml:space="preserve">Wang, Z., et al., </w:t>
+        <w:t xml:space="preserve">Lu, F., et al., </w:t>
       </w:r>
       <w:r>
         <w:rPr>
           <w:i/>
         </w:rPr>
-        <w:t>Data-Driven Design of Halide Perovskites for Efficient Green Light-Emitting Diodes via Machine Learning and DFT.</w:t>
-      </w:r>
-      <w:r>
-        <w:t xml:space="preserve"> The Journal of Physical Chemistry C, 2025. </w:t>
+        <w:t>Machine learning for perovskite optoelectronics: a review.</w:t>
+      </w:r>
+      <w:r>
+        <w:t xml:space="preserve"> 2024. </w:t>
       </w:r>
       <w:r>
         <w:rPr>
           <w:b/>
         </w:rPr>
-        <w:t>129</w:t>
-      </w:r>
-      <w:r>
-        <w:t>(30): p. 13542-13557.</w:t>
+        <w:t>6 %J Advanced Photonics</w:t>
+      </w:r>
+      <w:r>
+        <w:t>(5): p. 054001.</w:t>
       </w:r>
     </w:p>
     <w:p>
@@ -12632,25 +12705,25 @@
       </w:r>
       <w:r>
         <w:tab/>
-        <w:t xml:space="preserve">Wang, S., et al., </w:t>
+        <w:t xml:space="preserve">de la Asunción-Nadal, V., et al., </w:t>
       </w:r>
       <w:r>
         <w:rPr>
           <w:i/>
         </w:rPr>
-        <w:t>From Formability to Bandgap: Machine Learning Accelerates the Discovery and Application of Perovskite Materials.</w:t>
-      </w:r>
-      <w:r>
-        <w:t xml:space="preserve"> ACS Nano, 2025. </w:t>
+        <w:t>Machine learning for perovskite solar cells: a comprehensive review on opportunities and challenges for materials scientists.</w:t>
+      </w:r>
+      <w:r>
+        <w:t xml:space="preserve"> EES Solar, 2025. </w:t>
       </w:r>
       <w:r>
         <w:rPr>
           <w:b/>
         </w:rPr>
-        <w:t>19</w:t>
-      </w:r>
-      <w:r>
-        <w:t>(32): p. 29049-29072.</w:t>
+        <w:t>1</w:t>
+      </w:r>
+      <w:r>
+        <w:t>(6): p. 927-957.</w:t>
       </w:r>
     </w:p>
     <w:p>
@@ -12665,25 +12738,25 @@
       </w:r>
       <w:r>
         <w:tab/>
-        <w:t xml:space="preserve">Lu, F., et al., </w:t>
+        <w:t xml:space="preserve">Zhang, R., et al., </w:t>
       </w:r>
       <w:r>
         <w:rPr>
           <w:i/>
         </w:rPr>
-        <w:t>Machine learning for perovskite optoelectronics: a review.</w:t>
-      </w:r>
-      <w:r>
-        <w:t xml:space="preserve"> 2024. </w:t>
+        <w:t>Machine Learning Prediction of Organic–Inorganic Halide Perovskite Solar Cell Performance from Optical Properties.</w:t>
+      </w:r>
+      <w:r>
+        <w:t xml:space="preserve"> ACS Energy Letters, 2025. </w:t>
       </w:r>
       <w:r>
         <w:rPr>
           <w:b/>
         </w:rPr>
-        <w:t>6 %J Advanced Photonics</w:t>
-      </w:r>
-      <w:r>
-        <w:t>(5): p. 054001.</w:t>
+        <w:t>10</w:t>
+      </w:r>
+      <w:r>
+        <w:t>(4): p. 1714-1724.</w:t>
       </w:r>
     </w:p>
     <w:p>
@@ -12697,25 +12770,25 @@
       </w:r>
       <w:r>
         <w:tab/>
-        <w:t xml:space="preserve">Wang, Y., et al., </w:t>
+        <w:t xml:space="preserve">Toprak, A., </w:t>
       </w:r>
       <w:r>
         <w:rPr>
           <w:i/>
         </w:rPr>
-        <w:t>Recent advances in lead-free halide perovskites: from synthesis to applications.</w:t>
-      </w:r>
-      <w:r>
-        <w:t xml:space="preserve"> Journal of Materials Chemistry C, 2024. </w:t>
+        <w:t>Predicting photovoltaic output parameters of perovskite solar cells using explainable machine learning with physics-informed and simulation-derived descriptors.</w:t>
+      </w:r>
+      <w:r>
+        <w:t xml:space="preserve"> Materials Today Communications, 2026. </w:t>
       </w:r>
       <w:r>
         <w:rPr>
           <w:b/>
         </w:rPr>
-        <w:t>12</w:t>
-      </w:r>
-      <w:r>
-        <w:t>(28): p. 10267-10329.</w:t>
+        <w:t>52</w:t>
+      </w:r>
+      <w:r>
+        <w:t>: p. 114968.</w:t>
       </w:r>
     </w:p>
     <w:p>
@@ -12729,25 +12802,25 @@
       </w:r>
       <w:r>
         <w:tab/>
-        <w:t xml:space="preserve">Zhang, L., et al., </w:t>
+        <w:t xml:space="preserve">Wang, Z., et al., </w:t>
       </w:r>
       <w:r>
         <w:rPr>
           <w:i/>
         </w:rPr>
-        <w:t>Prediction of Operational Lifetime of Perovskite Light Emitting Diodes by Machine Learning.</w:t>
-      </w:r>
-      <w:r>
-        <w:t xml:space="preserve"> 2024. </w:t>
+        <w:t>Data-Driven Design of Halide Perovskites for Efficient Green Light-Emitting Diodes via Machine Learning and DFT.</w:t>
+      </w:r>
+      <w:r>
+        <w:t xml:space="preserve"> The Journal of Physical Chemistry C, 2025. </w:t>
       </w:r>
       <w:r>
         <w:rPr>
           <w:b/>
         </w:rPr>
-        <w:t>6</w:t>
-      </w:r>
-      <w:r>
-        <w:t>(6): p. 2300772.</w:t>
+        <w:t>129</w:t>
+      </w:r>
+      <w:r>
+        <w:t>(30): p. 13542-13557.</w:t>
       </w:r>
     </w:p>
     <w:p>
@@ -12761,25 +12834,25 @@
       </w:r>
       <w:r>
         <w:tab/>
-        <w:t xml:space="preserve">Ghodeswar, U.S., et al., </w:t>
+        <w:t xml:space="preserve">Wang, S., et al., </w:t>
       </w:r>
       <w:r>
         <w:rPr>
           <w:i/>
         </w:rPr>
-        <w:t>The optimization of design and performance in hybrid organic/inorganic LEDs toward next-generation high-efficiency LEDs: application of multi-model hybrid machine learning approach.</w:t>
-      </w:r>
-      <w:r>
-        <w:t xml:space="preserve"> Journal of Computational Electronics, 2025. </w:t>
+        <w:t>From Formability to Bandgap: Machine Learning Accelerates the Discovery and Application of Perovskite Materials.</w:t>
+      </w:r>
+      <w:r>
+        <w:t xml:space="preserve"> ACS Nano, 2025. </w:t>
       </w:r>
       <w:r>
         <w:rPr>
           <w:b/>
         </w:rPr>
-        <w:t>24</w:t>
-      </w:r>
-      <w:r>
-        <w:t>(3): p. 92.</w:t>
+        <w:t>19</w:t>
+      </w:r>
+      <w:r>
+        <w:t>(32): p. 29049-29072.</w:t>
       </w:r>
     </w:p>
     <w:p>
@@ -12793,6 +12866,102 @@
       </w:r>
       <w:r>
         <w:tab/>
+        <w:t xml:space="preserve">Wang, Y., et al., </w:t>
+      </w:r>
+      <w:r>
+        <w:rPr>
+          <w:i/>
+        </w:rPr>
+        <w:t>Recent advances in lead-free halide perovskites: from synthesis to applications.</w:t>
+      </w:r>
+      <w:r>
+        <w:t xml:space="preserve"> Journal of Materials Chemistry C, 2024. </w:t>
+      </w:r>
+      <w:r>
+        <w:rPr>
+          <w:b/>
+        </w:rPr>
+        <w:t>12</w:t>
+      </w:r>
+      <w:r>
+        <w:t>(28): p. 10267-10329.</w:t>
+      </w:r>
+    </w:p>
+    <w:p>
+      <w:pPr>
+        <w:pStyle w:val="EndNoteBibliography"/>
+        <w:spacing w:after="0"/>
+        <w:ind w:left="720" w:hanging="720"/>
+      </w:pPr>
+      <w:r>
+        <w:t>19.</w:t>
+      </w:r>
+      <w:r>
+        <w:tab/>
+        <w:t xml:space="preserve">Zhang, L., et al., </w:t>
+      </w:r>
+      <w:r>
+        <w:rPr>
+          <w:i/>
+        </w:rPr>
+        <w:t>Prediction of Operational Lifetime of Perovskite Light Emitting Diodes by Machine Learning.</w:t>
+      </w:r>
+      <w:r>
+        <w:t xml:space="preserve"> 2024. </w:t>
+      </w:r>
+      <w:r>
+        <w:rPr>
+          <w:b/>
+        </w:rPr>
+        <w:t>6</w:t>
+      </w:r>
+      <w:r>
+        <w:t>(6): p. 2300772.</w:t>
+      </w:r>
+    </w:p>
+    <w:p>
+      <w:pPr>
+        <w:pStyle w:val="EndNoteBibliography"/>
+        <w:spacing w:after="0"/>
+        <w:ind w:left="720" w:hanging="720"/>
+      </w:pPr>
+      <w:r>
+        <w:t>20.</w:t>
+      </w:r>
+      <w:r>
+        <w:tab/>
+        <w:t xml:space="preserve">Ghodeswar, U.S., et al., </w:t>
+      </w:r>
+      <w:r>
+        <w:rPr>
+          <w:i/>
+        </w:rPr>
+        <w:t>The optimization of design and performance in hybrid organic/inorganic LEDs toward next-generation high-efficiency LEDs: application of multi-model hybrid machine learning approach.</w:t>
+      </w:r>
+      <w:r>
+        <w:t xml:space="preserve"> Journal of Computational Electronics, 2025. </w:t>
+      </w:r>
+      <w:r>
+        <w:rPr>
+          <w:b/>
+        </w:rPr>
+        <w:t>24</w:t>
+      </w:r>
+      <w:r>
+        <w:t>(3): p. 92.</w:t>
+      </w:r>
+    </w:p>
+    <w:p>
+      <w:pPr>
+        <w:pStyle w:val="EndNoteBibliography"/>
+        <w:spacing w:after="0"/>
+        <w:ind w:left="720" w:hanging="720"/>
+      </w:pPr>
+      <w:r>
+        <w:t>21.</w:t>
+      </w:r>
+      <w:r>
+        <w:tab/>
         <w:t xml:space="preserve">Wang, W., et al., </w:t>
       </w:r>
       <w:r>
@@ -12820,7 +12989,7 @@
         <w:ind w:left="720" w:hanging="720"/>
       </w:pPr>
       <w:r>
-        <w:t>19.</w:t>
+        <w:t>22.</w:t>
       </w:r>
       <w:r>
         <w:tab/>

</xml_diff>